<commit_message>
Update Onboarding Guide: replace GitHub CLI with Claude connectors workflow
Co-Authored-By: Claude Sonnet 4.6 <noreply@anthropic.com>
</commit_message>
<xml_diff>
--- a/Collaborator-Onboarding-Guide.docx
+++ b/Collaborator-Onboarding-Guide.docx
@@ -29,7 +29,7 @@
     </w:p>
     <w:p>
       <w:pPr>
-        <w:spacing w:after="600" w:before="0"/>
+        <w:spacing w:after="300" w:before="0"/>
         <w:jc w:val="center"/>
       </w:pPr>
       <w:r>
@@ -41,7 +41,7 @@
           <w:sz w:val="26"/>
           <w:szCs w:val="26"/>
         </w:rPr>
-        <w:t xml:space="preserve">How to set up GitHub CLI and Claude Code to contribute to the</w:t>
+        <w:t xml:space="preserve">How to set up GitHub and Claude to contribute to the</w:t>
       </w:r>
     </w:p>
     <w:p>
@@ -235,7 +235,25 @@
           <w:sz w:val="22"/>
           <w:szCs w:val="22"/>
         </w:rPr>
-        <w:t xml:space="preserve">A GitHub account (see below if you need to create one)</w:t>
+        <w:t xml:space="preserve">A GitHub account (instructions below if you need to create one)</w:t>
+      </w:r>
+    </w:p>
+    <w:p>
+      <w:pPr>
+        <w:pStyle w:val="ListParagraph"/>
+        <w:numPr>
+          <w:ilvl w:val="0"/>
+          <w:numId w:val="2"/>
+        </w:numPr>
+        <w:spacing w:after="60" w:before="60"/>
+      </w:pPr>
+      <w:r>
+        <w:rPr>
+          <w:rFonts w:ascii="Arial" w:cs="Arial" w:eastAsia="Arial" w:hAnsi="Arial"/>
+          <w:sz w:val="22"/>
+          <w:szCs w:val="22"/>
+        </w:rPr>
+        <w:t xml:space="preserve">A Claude account at claude.ai</w:t>
       </w:r>
     </w:p>
     <w:p>
@@ -278,7 +296,7 @@
           <w:sz w:val="26"/>
           <w:szCs w:val="26"/>
         </w:rPr>
-        <w:t xml:space="preserve">1.1 — Create a GitHub Account (if you don’t have one)</w:t>
+        <w:t xml:space="preserve">1.1 — Create a GitHub Account</w:t>
       </w:r>
     </w:p>
     <w:p>
@@ -291,7 +309,7 @@
           <w:sz w:val="22"/>
           <w:szCs w:val="22"/>
         </w:rPr>
-        <w:t xml:space="preserve">If you already have a GitHub account, skip to Section 2.</w:t>
+        <w:t xml:space="preserve">If you already have a GitHub account, skip to Section 1.2.</w:t>
       </w:r>
     </w:p>
     <w:p>
@@ -335,7 +353,7 @@
           <w:sz w:val="22"/>
           <w:szCs w:val="22"/>
         </w:rPr>
-        <w:t xml:space="preserve">Click the green "Sign up" button in the top right</w:t>
+        <w:t xml:space="preserve">Click the green "Sign up" button in the top right corner</w:t>
       </w:r>
     </w:p>
     <w:p>
@@ -407,7 +425,7 @@
           <w:sz w:val="22"/>
           <w:szCs w:val="22"/>
         </w:rPr>
-        <w:t xml:space="preserve">You are now ready to use GitHub</w:t>
+        <w:t xml:space="preserve">You now have a GitHub account</w:t>
       </w:r>
     </w:p>
     <w:p>
@@ -445,7 +463,7 @@
           <w:sz w:val="22"/>
           <w:szCs w:val="22"/>
         </w:rPr>
-        <w:t xml:space="preserve">The admin will send you an email invitation to join the easvrm organization.</w:t>
+        <w:t xml:space="preserve">The admin will send you an email invitation to join the easvrm organization on GitHub.</w:t>
       </w:r>
     </w:p>
     <w:p>
@@ -508,6 +526,45 @@
           <w:szCs w:val="22"/>
         </w:rPr>
         <w:t xml:space="preserve">You now have access to the Training Package for Replication repository</w:t>
+      </w:r>
+    </w:p>
+    <w:p>
+      <w:pPr>
+        <w:spacing w:after="0" w:before="80"/>
+      </w:pPr>
+      <w:r>
+        <w:t xml:space="preserve"/>
+      </w:r>
+    </w:p>
+    <w:p>
+      <w:pPr>
+        <w:shd w:fill="EBF3FB" w:val="clear"/>
+        <w:spacing w:after="100" w:before="100"/>
+        <w:ind w:left="720"/>
+      </w:pPr>
+      <w:r>
+        <w:rPr>
+          <w:rFonts w:ascii="Arial" w:cs="Arial" w:eastAsia="Arial" w:hAnsi="Arial"/>
+          <w:b/>
+          <w:bCs/>
+          <w:i/>
+          <w:iCs/>
+          <w:color w:val="1F4E79"/>
+          <w:sz w:val="22"/>
+          <w:szCs w:val="22"/>
+        </w:rPr>
+        <w:t xml:space="preserve">Note: </w:t>
+      </w:r>
+      <w:r>
+        <w:rPr>
+          <w:rFonts w:ascii="Arial" w:cs="Arial" w:eastAsia="Arial" w:hAnsi="Arial"/>
+          <w:i/>
+          <w:iCs/>
+          <w:color w:val="444444"/>
+          <w:sz w:val="22"/>
+          <w:szCs w:val="22"/>
+        </w:rPr>
+        <w:t xml:space="preserve">If you did not receive an invitation, contact the admin at john.punzalan@eisnetwork.co</w:t>
       </w:r>
     </w:p>
     <w:p>
@@ -529,11 +586,148 @@
           <w:sz w:val="32"/>
           <w:szCs w:val="32"/>
         </w:rPr>
-        <w:t xml:space="preserve">Section 2 — Install Homebrew (macOS Only)</w:t>
-      </w:r>
-    </w:p>
-    <w:p>
-      <w:pPr>
+        <w:t xml:space="preserve">Section 2 — Create a Claude Account</w:t>
+      </w:r>
+    </w:p>
+    <w:p>
+      <w:pPr>
+        <w:spacing w:after="80" w:before="80"/>
+      </w:pPr>
+      <w:r>
+        <w:rPr>
+          <w:rFonts w:ascii="Arial" w:cs="Arial" w:eastAsia="Arial" w:hAnsi="Arial"/>
+          <w:sz w:val="22"/>
+          <w:szCs w:val="22"/>
+        </w:rPr>
+        <w:t xml:space="preserve">Claude is the AI assistant you will use to make changes to the project. You need a Claude account to use it.</w:t>
+      </w:r>
+    </w:p>
+    <w:p>
+      <w:pPr>
+        <w:spacing w:after="0" w:before="100"/>
+      </w:pPr>
+      <w:r>
+        <w:t xml:space="preserve"/>
+      </w:r>
+    </w:p>
+    <w:p>
+      <w:pPr>
+        <w:pStyle w:val="Heading2"/>
+        <w:spacing w:after="140" w:before="280"/>
+      </w:pPr>
+      <w:r>
+        <w:rPr>
+          <w:rFonts w:ascii="Arial" w:cs="Arial" w:eastAsia="Arial" w:hAnsi="Arial"/>
+          <w:b/>
+          <w:bCs/>
+          <w:color w:val="1F4E79"/>
+          <w:sz w:val="26"/>
+          <w:szCs w:val="26"/>
+        </w:rPr>
+        <w:t xml:space="preserve">2.1 — Sign Up for Claude</w:t>
+      </w:r>
+    </w:p>
+    <w:p>
+      <w:pPr>
+        <w:pStyle w:val="ListParagraph"/>
+        <w:numPr>
+          <w:ilvl w:val="0"/>
+          <w:numId w:val="5"/>
+        </w:numPr>
+        <w:spacing w:after="60" w:before="60"/>
+      </w:pPr>
+      <w:r>
+        <w:rPr>
+          <w:rFonts w:ascii="Arial" w:cs="Arial" w:eastAsia="Arial" w:hAnsi="Arial"/>
+          <w:sz w:val="22"/>
+          <w:szCs w:val="22"/>
+        </w:rPr>
+        <w:t xml:space="preserve">Open your browser and go to https://claude.ai</w:t>
+      </w:r>
+    </w:p>
+    <w:p>
+      <w:pPr>
+        <w:pStyle w:val="ListParagraph"/>
+        <w:numPr>
+          <w:ilvl w:val="0"/>
+          <w:numId w:val="5"/>
+        </w:numPr>
+        <w:spacing w:after="60" w:before="60"/>
+      </w:pPr>
+      <w:r>
+        <w:rPr>
+          <w:rFonts w:ascii="Arial" w:cs="Arial" w:eastAsia="Arial" w:hAnsi="Arial"/>
+          <w:sz w:val="22"/>
+          <w:szCs w:val="22"/>
+        </w:rPr>
+        <w:t xml:space="preserve">Click "Sign up"</w:t>
+      </w:r>
+    </w:p>
+    <w:p>
+      <w:pPr>
+        <w:pStyle w:val="ListParagraph"/>
+        <w:numPr>
+          <w:ilvl w:val="0"/>
+          <w:numId w:val="5"/>
+        </w:numPr>
+        <w:spacing w:after="60" w:before="60"/>
+      </w:pPr>
+      <w:r>
+        <w:rPr>
+          <w:rFonts w:ascii="Arial" w:cs="Arial" w:eastAsia="Arial" w:hAnsi="Arial"/>
+          <w:sz w:val="22"/>
+          <w:szCs w:val="22"/>
+        </w:rPr>
+        <w:t xml:space="preserve">Sign up using your Google account, or enter your email address and create a password</w:t>
+      </w:r>
+    </w:p>
+    <w:p>
+      <w:pPr>
+        <w:pStyle w:val="ListParagraph"/>
+        <w:numPr>
+          <w:ilvl w:val="0"/>
+          <w:numId w:val="5"/>
+        </w:numPr>
+        <w:spacing w:after="60" w:before="60"/>
+      </w:pPr>
+      <w:r>
+        <w:rPr>
+          <w:rFonts w:ascii="Arial" w:cs="Arial" w:eastAsia="Arial" w:hAnsi="Arial"/>
+          <w:sz w:val="22"/>
+          <w:szCs w:val="22"/>
+        </w:rPr>
+        <w:t xml:space="preserve">Verify your email if prompted</w:t>
+      </w:r>
+    </w:p>
+    <w:p>
+      <w:pPr>
+        <w:pStyle w:val="ListParagraph"/>
+        <w:numPr>
+          <w:ilvl w:val="0"/>
+          <w:numId w:val="5"/>
+        </w:numPr>
+        <w:spacing w:after="60" w:before="60"/>
+      </w:pPr>
+      <w:r>
+        <w:rPr>
+          <w:rFonts w:ascii="Arial" w:cs="Arial" w:eastAsia="Arial" w:hAnsi="Arial"/>
+          <w:sz w:val="22"/>
+          <w:szCs w:val="22"/>
+        </w:rPr>
+        <w:t xml:space="preserve">You are now logged in to Claude</w:t>
+      </w:r>
+    </w:p>
+    <w:p>
+      <w:pPr>
+        <w:spacing w:after="0" w:before="80"/>
+      </w:pPr>
+      <w:r>
+        <w:t xml:space="preserve"/>
+      </w:r>
+    </w:p>
+    <w:p>
+      <w:pPr>
+        <w:shd w:fill="EBF3FB" w:val="clear"/>
         <w:spacing w:after="100" w:before="100"/>
         <w:ind w:left="720"/>
       </w:pPr>
@@ -559,15 +753,29 @@
           <w:sz w:val="22"/>
           <w:szCs w:val="22"/>
         </w:rPr>
-        <w:t xml:space="preserve">Windows users: skip this section entirely and go directly to Section 3b.</w:t>
-      </w:r>
-    </w:p>
-    <w:p>
-      <w:pPr>
-        <w:spacing w:after="0" w:before="100"/>
-      </w:pPr>
-      <w:r>
-        <w:t xml:space="preserve"/>
+        <w:t xml:space="preserve">A free Claude account is sufficient to get started. You can upgrade to Claude Pro at any time for more usage.</w:t>
+      </w:r>
+    </w:p>
+    <w:p>
+      <w:r>
+        <w:br w:type="page"/>
+      </w:r>
+    </w:p>
+    <w:p>
+      <w:pPr>
+        <w:pStyle w:val="Heading1"/>
+        <w:spacing w:after="200" w:before="400"/>
+      </w:pPr>
+      <w:r>
+        <w:rPr>
+          <w:rFonts w:ascii="Arial" w:cs="Arial" w:eastAsia="Arial" w:hAnsi="Arial"/>
+          <w:b/>
+          <w:bCs/>
+          <w:color w:val="FFFFFF"/>
+          <w:sz w:val="32"/>
+          <w:szCs w:val="32"/>
+        </w:rPr>
+        <w:t xml:space="preserve">Section 3 — Connect the GitHub Connector in Claude</w:t>
       </w:r>
     </w:p>
     <w:p>
@@ -580,7 +788,7 @@
           <w:sz w:val="22"/>
           <w:szCs w:val="22"/>
         </w:rPr>
-        <w:t xml:space="preserve">Homebrew is a package manager for macOS that makes it easy to install developer tools like GitHub CLI and Node.js.</w:t>
+        <w:t xml:space="preserve">Claude has a built-in GitHub connector that allows you to interact with GitHub repositories directly inside Claude — no command-line setup required. This is the easiest way to work with Git.</w:t>
       </w:r>
     </w:p>
     <w:p>
@@ -605,43 +813,336 @@
           <w:sz w:val="26"/>
           <w:szCs w:val="26"/>
         </w:rPr>
-        <w:t xml:space="preserve">2.1 — Installation Steps</w:t>
-      </w:r>
-    </w:p>
-    <w:p>
-      <w:pPr>
-        <w:pStyle w:val="ListParagraph"/>
-        <w:numPr>
-          <w:ilvl w:val="0"/>
-          <w:numId w:val="5"/>
-        </w:numPr>
-        <w:spacing w:after="60" w:before="60"/>
-      </w:pPr>
-      <w:r>
-        <w:rPr>
-          <w:rFonts w:ascii="Arial" w:cs="Arial" w:eastAsia="Arial" w:hAnsi="Arial"/>
-          <w:sz w:val="22"/>
-          <w:szCs w:val="22"/>
-        </w:rPr>
-        <w:t xml:space="preserve">Open Terminal: press Cmd + Space, type "Terminal", then press Enter</w:t>
-      </w:r>
-    </w:p>
-    <w:p>
-      <w:pPr>
-        <w:pStyle w:val="ListParagraph"/>
-        <w:numPr>
-          <w:ilvl w:val="0"/>
-          <w:numId w:val="5"/>
-        </w:numPr>
-        <w:spacing w:after="60" w:before="60"/>
-      </w:pPr>
-      <w:r>
-        <w:rPr>
-          <w:rFonts w:ascii="Arial" w:cs="Arial" w:eastAsia="Arial" w:hAnsi="Arial"/>
-          <w:sz w:val="22"/>
-          <w:szCs w:val="22"/>
-        </w:rPr>
-        <w:t xml:space="preserve">Paste the following command and press Enter:</w:t>
+        <w:t xml:space="preserve">3.1 — Open Claude and Access Connectors</w:t>
+      </w:r>
+    </w:p>
+    <w:p>
+      <w:pPr>
+        <w:pStyle w:val="ListParagraph"/>
+        <w:numPr>
+          <w:ilvl w:val="0"/>
+          <w:numId w:val="6"/>
+        </w:numPr>
+        <w:spacing w:after="60" w:before="60"/>
+      </w:pPr>
+      <w:r>
+        <w:rPr>
+          <w:rFonts w:ascii="Arial" w:cs="Arial" w:eastAsia="Arial" w:hAnsi="Arial"/>
+          <w:sz w:val="22"/>
+          <w:szCs w:val="22"/>
+        </w:rPr>
+        <w:t xml:space="preserve">Go to https://claude.ai and log in</w:t>
+      </w:r>
+    </w:p>
+    <w:p>
+      <w:pPr>
+        <w:pStyle w:val="ListParagraph"/>
+        <w:numPr>
+          <w:ilvl w:val="0"/>
+          <w:numId w:val="6"/>
+        </w:numPr>
+        <w:spacing w:after="60" w:before="60"/>
+      </w:pPr>
+      <w:r>
+        <w:rPr>
+          <w:rFonts w:ascii="Arial" w:cs="Arial" w:eastAsia="Arial" w:hAnsi="Arial"/>
+          <w:sz w:val="22"/>
+          <w:szCs w:val="22"/>
+        </w:rPr>
+        <w:t xml:space="preserve">Start a new conversation by clicking "New chat" in the left sidebar</w:t>
+      </w:r>
+    </w:p>
+    <w:p>
+      <w:pPr>
+        <w:pStyle w:val="ListParagraph"/>
+        <w:numPr>
+          <w:ilvl w:val="0"/>
+          <w:numId w:val="6"/>
+        </w:numPr>
+        <w:spacing w:after="60" w:before="60"/>
+      </w:pPr>
+      <w:r>
+        <w:rPr>
+          <w:rFonts w:ascii="Arial" w:cs="Arial" w:eastAsia="Arial" w:hAnsi="Arial"/>
+          <w:sz w:val="22"/>
+          <w:szCs w:val="22"/>
+        </w:rPr>
+        <w:t xml:space="preserve">In the chat input area, look for the connector or tools icon (a plug icon or "Add tools")</w:t>
+      </w:r>
+    </w:p>
+    <w:p>
+      <w:pPr>
+        <w:pStyle w:val="ListParagraph"/>
+        <w:numPr>
+          <w:ilvl w:val="0"/>
+          <w:numId w:val="6"/>
+        </w:numPr>
+        <w:spacing w:after="60" w:before="60"/>
+      </w:pPr>
+      <w:r>
+        <w:rPr>
+          <w:rFonts w:ascii="Arial" w:cs="Arial" w:eastAsia="Arial" w:hAnsi="Arial"/>
+          <w:sz w:val="22"/>
+          <w:szCs w:val="22"/>
+        </w:rPr>
+        <w:t xml:space="preserve">Click on it to open the connectors panel</w:t>
+      </w:r>
+    </w:p>
+    <w:p>
+      <w:pPr>
+        <w:spacing w:after="0" w:before="80"/>
+      </w:pPr>
+      <w:r>
+        <w:t xml:space="preserve"/>
+      </w:r>
+    </w:p>
+    <w:p>
+      <w:pPr>
+        <w:shd w:fill="EAF7EA" w:val="clear"/>
+        <w:spacing w:after="100" w:before="100"/>
+        <w:ind w:left="720"/>
+      </w:pPr>
+      <w:r>
+        <w:rPr>
+          <w:rFonts w:ascii="Arial" w:cs="Arial" w:eastAsia="Arial" w:hAnsi="Arial"/>
+          <w:b/>
+          <w:bCs/>
+          <w:i/>
+          <w:iCs/>
+          <w:color w:val="276221"/>
+          <w:sz w:val="22"/>
+          <w:szCs w:val="22"/>
+        </w:rPr>
+        <w:t xml:space="preserve">Tip: </w:t>
+      </w:r>
+      <w:r>
+        <w:rPr>
+          <w:rFonts w:ascii="Arial" w:cs="Arial" w:eastAsia="Arial" w:hAnsi="Arial"/>
+          <w:i/>
+          <w:iCs/>
+          <w:color w:val="444444"/>
+          <w:sz w:val="22"/>
+          <w:szCs w:val="22"/>
+        </w:rPr>
+        <w:t xml:space="preserve">The connector icon looks like a small plug or grid icon near the message input box.</w:t>
+      </w:r>
+    </w:p>
+    <w:p>
+      <w:pPr>
+        <w:spacing w:after="0" w:before="120"/>
+      </w:pPr>
+      <w:r>
+        <w:t xml:space="preserve"/>
+      </w:r>
+    </w:p>
+    <w:p>
+      <w:pPr>
+        <w:pStyle w:val="Heading2"/>
+        <w:spacing w:after="140" w:before="280"/>
+      </w:pPr>
+      <w:r>
+        <w:rPr>
+          <w:rFonts w:ascii="Arial" w:cs="Arial" w:eastAsia="Arial" w:hAnsi="Arial"/>
+          <w:b/>
+          <w:bCs/>
+          <w:color w:val="1F4E79"/>
+          <w:sz w:val="26"/>
+          <w:szCs w:val="26"/>
+        </w:rPr>
+        <w:t xml:space="preserve">3.2 — Add the GitHub Connector</w:t>
+      </w:r>
+    </w:p>
+    <w:p>
+      <w:pPr>
+        <w:pStyle w:val="ListParagraph"/>
+        <w:numPr>
+          <w:ilvl w:val="0"/>
+          <w:numId w:val="7"/>
+        </w:numPr>
+        <w:spacing w:after="60" w:before="60"/>
+      </w:pPr>
+      <w:r>
+        <w:rPr>
+          <w:rFonts w:ascii="Arial" w:cs="Arial" w:eastAsia="Arial" w:hAnsi="Arial"/>
+          <w:sz w:val="22"/>
+          <w:szCs w:val="22"/>
+        </w:rPr>
+        <w:t xml:space="preserve">In the connectors panel, search for "GitHub"</w:t>
+      </w:r>
+    </w:p>
+    <w:p>
+      <w:pPr>
+        <w:pStyle w:val="ListParagraph"/>
+        <w:numPr>
+          <w:ilvl w:val="0"/>
+          <w:numId w:val="7"/>
+        </w:numPr>
+        <w:spacing w:after="60" w:before="60"/>
+      </w:pPr>
+      <w:r>
+        <w:rPr>
+          <w:rFonts w:ascii="Arial" w:cs="Arial" w:eastAsia="Arial" w:hAnsi="Arial"/>
+          <w:sz w:val="22"/>
+          <w:szCs w:val="22"/>
+        </w:rPr>
+        <w:t xml:space="preserve">Click on the GitHub connector</w:t>
+      </w:r>
+    </w:p>
+    <w:p>
+      <w:pPr>
+        <w:pStyle w:val="ListParagraph"/>
+        <w:numPr>
+          <w:ilvl w:val="0"/>
+          <w:numId w:val="7"/>
+        </w:numPr>
+        <w:spacing w:after="60" w:before="60"/>
+      </w:pPr>
+      <w:r>
+        <w:rPr>
+          <w:rFonts w:ascii="Arial" w:cs="Arial" w:eastAsia="Arial" w:hAnsi="Arial"/>
+          <w:sz w:val="22"/>
+          <w:szCs w:val="22"/>
+        </w:rPr>
+        <w:t xml:space="preserve">Click "Connect" or "Authorize"</w:t>
+      </w:r>
+    </w:p>
+    <w:p>
+      <w:pPr>
+        <w:pStyle w:val="ListParagraph"/>
+        <w:numPr>
+          <w:ilvl w:val="0"/>
+          <w:numId w:val="7"/>
+        </w:numPr>
+        <w:spacing w:after="60" w:before="60"/>
+      </w:pPr>
+      <w:r>
+        <w:rPr>
+          <w:rFonts w:ascii="Arial" w:cs="Arial" w:eastAsia="Arial" w:hAnsi="Arial"/>
+          <w:sz w:val="22"/>
+          <w:szCs w:val="22"/>
+        </w:rPr>
+        <w:t xml:space="preserve">A GitHub authorization page will open in your browser</w:t>
+      </w:r>
+    </w:p>
+    <w:p>
+      <w:pPr>
+        <w:pStyle w:val="ListParagraph"/>
+        <w:numPr>
+          <w:ilvl w:val="0"/>
+          <w:numId w:val="7"/>
+        </w:numPr>
+        <w:spacing w:after="60" w:before="60"/>
+      </w:pPr>
+      <w:r>
+        <w:rPr>
+          <w:rFonts w:ascii="Arial" w:cs="Arial" w:eastAsia="Arial" w:hAnsi="Arial"/>
+          <w:sz w:val="22"/>
+          <w:szCs w:val="22"/>
+        </w:rPr>
+        <w:t xml:space="preserve">Click "Authorize" to grant Claude access to your GitHub account</w:t>
+      </w:r>
+    </w:p>
+    <w:p>
+      <w:pPr>
+        <w:pStyle w:val="ListParagraph"/>
+        <w:numPr>
+          <w:ilvl w:val="0"/>
+          <w:numId w:val="7"/>
+        </w:numPr>
+        <w:spacing w:after="60" w:before="60"/>
+      </w:pPr>
+      <w:r>
+        <w:rPr>
+          <w:rFonts w:ascii="Arial" w:cs="Arial" w:eastAsia="Arial" w:hAnsi="Arial"/>
+          <w:sz w:val="22"/>
+          <w:szCs w:val="22"/>
+        </w:rPr>
+        <w:t xml:space="preserve">You will be redirected back to Claude — the GitHub connector is now active</w:t>
+      </w:r>
+    </w:p>
+    <w:p>
+      <w:pPr>
+        <w:spacing w:after="0" w:before="80"/>
+      </w:pPr>
+      <w:r>
+        <w:t xml:space="preserve"/>
+      </w:r>
+    </w:p>
+    <w:p>
+      <w:pPr>
+        <w:shd w:fill="EBF3FB" w:val="clear"/>
+        <w:spacing w:after="100" w:before="100"/>
+        <w:ind w:left="720"/>
+      </w:pPr>
+      <w:r>
+        <w:rPr>
+          <w:rFonts w:ascii="Arial" w:cs="Arial" w:eastAsia="Arial" w:hAnsi="Arial"/>
+          <w:b/>
+          <w:bCs/>
+          <w:i/>
+          <w:iCs/>
+          <w:color w:val="1F4E79"/>
+          <w:sz w:val="22"/>
+          <w:szCs w:val="22"/>
+        </w:rPr>
+        <w:t xml:space="preserve">Note: </w:t>
+      </w:r>
+      <w:r>
+        <w:rPr>
+          <w:rFonts w:ascii="Arial" w:cs="Arial" w:eastAsia="Arial" w:hAnsi="Arial"/>
+          <w:i/>
+          <w:iCs/>
+          <w:color w:val="444444"/>
+          <w:sz w:val="22"/>
+          <w:szCs w:val="22"/>
+        </w:rPr>
+        <w:t xml:space="preserve">Claude only gets access to the repositories you authorize. Your GitHub credentials are never stored by Claude directly.</w:t>
+      </w:r>
+    </w:p>
+    <w:p>
+      <w:pPr>
+        <w:spacing w:after="0" w:before="120"/>
+      </w:pPr>
+      <w:r>
+        <w:t xml:space="preserve"/>
+      </w:r>
+    </w:p>
+    <w:p>
+      <w:pPr>
+        <w:pStyle w:val="Heading2"/>
+        <w:spacing w:after="140" w:before="280"/>
+      </w:pPr>
+      <w:r>
+        <w:rPr>
+          <w:rFonts w:ascii="Arial" w:cs="Arial" w:eastAsia="Arial" w:hAnsi="Arial"/>
+          <w:b/>
+          <w:bCs/>
+          <w:color w:val="1F4E79"/>
+          <w:sz w:val="26"/>
+          <w:szCs w:val="26"/>
+        </w:rPr>
+        <w:t xml:space="preserve">3.3 — Verify the Connection</w:t>
+      </w:r>
+    </w:p>
+    <w:p>
+      <w:pPr>
+        <w:spacing w:after="80" w:before="80"/>
+      </w:pPr>
+      <w:r>
+        <w:rPr>
+          <w:rFonts w:ascii="Arial" w:cs="Arial" w:eastAsia="Arial" w:hAnsi="Arial"/>
+          <w:sz w:val="22"/>
+          <w:szCs w:val="22"/>
+        </w:rPr>
+        <w:t xml:space="preserve">To confirm the connector is working, type the following message in Claude:</w:t>
+      </w:r>
+    </w:p>
+    <w:p>
+      <w:pPr>
+        <w:spacing w:after="0" w:before="60"/>
+      </w:pPr>
+      <w:r>
+        <w:t xml:space="preserve"/>
       </w:r>
     </w:p>
     <w:p>
@@ -657,61 +1158,101 @@
           <w:sz w:val="20"/>
           <w:szCs w:val="20"/>
         </w:rPr>
-        <w:t xml:space="preserve">/bin/bash -c "$(curl -fsSL https://raw.githubusercontent.com/Homebrew/install/HEAD/install.sh)"</w:t>
-      </w:r>
-    </w:p>
-    <w:p>
-      <w:pPr>
-        <w:pStyle w:val="ListParagraph"/>
-        <w:numPr>
-          <w:ilvl w:val="0"/>
-          <w:numId w:val="5"/>
-        </w:numPr>
-        <w:spacing w:after="60" w:before="60"/>
-      </w:pPr>
-      <w:r>
-        <w:rPr>
-          <w:rFonts w:ascii="Arial" w:cs="Arial" w:eastAsia="Arial" w:hAnsi="Arial"/>
-          <w:sz w:val="22"/>
-          <w:szCs w:val="22"/>
-        </w:rPr>
-        <w:t xml:space="preserve">Follow the on-screen instructions. You may be asked to enter your Mac login password — this is normal</w:t>
-      </w:r>
-    </w:p>
-    <w:p>
-      <w:pPr>
-        <w:pStyle w:val="ListParagraph"/>
-        <w:numPr>
-          <w:ilvl w:val="0"/>
-          <w:numId w:val="5"/>
-        </w:numPr>
-        <w:spacing w:after="60" w:before="60"/>
-      </w:pPr>
-      <w:r>
-        <w:rPr>
-          <w:rFonts w:ascii="Arial" w:cs="Arial" w:eastAsia="Arial" w:hAnsi="Arial"/>
-          <w:sz w:val="22"/>
-          <w:szCs w:val="22"/>
-        </w:rPr>
-        <w:t xml:space="preserve">Wait for the installation to complete (this may take a few minutes)</w:t>
-      </w:r>
-    </w:p>
-    <w:p>
-      <w:pPr>
-        <w:pStyle w:val="ListParagraph"/>
-        <w:numPr>
-          <w:ilvl w:val="0"/>
-          <w:numId w:val="5"/>
-        </w:numPr>
-        <w:spacing w:after="60" w:before="60"/>
-      </w:pPr>
-      <w:r>
-        <w:rPr>
-          <w:rFonts w:ascii="Arial" w:cs="Arial" w:eastAsia="Arial" w:hAnsi="Arial"/>
-          <w:sz w:val="22"/>
-          <w:szCs w:val="22"/>
-        </w:rPr>
-        <w:t xml:space="preserve">Verify the installation by running:</w:t>
+        <w:t xml:space="preserve">List the repositories in the easvrm organization</w:t>
+      </w:r>
+    </w:p>
+    <w:p>
+      <w:pPr>
+        <w:spacing w:after="0" w:before="60"/>
+      </w:pPr>
+      <w:r>
+        <w:t xml:space="preserve"/>
+      </w:r>
+    </w:p>
+    <w:p>
+      <w:pPr>
+        <w:spacing w:after="80" w:before="80"/>
+      </w:pPr>
+      <w:r>
+        <w:rPr>
+          <w:rFonts w:ascii="Arial" w:cs="Arial" w:eastAsia="Arial" w:hAnsi="Arial"/>
+          <w:sz w:val="22"/>
+          <w:szCs w:val="22"/>
+        </w:rPr>
+        <w:t xml:space="preserve">Claude should respond with a list that includes Training-Package-for-Replication. If it does, you are fully connected and ready to collaborate.</w:t>
+      </w:r>
+    </w:p>
+    <w:p>
+      <w:r>
+        <w:br w:type="page"/>
+      </w:r>
+    </w:p>
+    <w:p>
+      <w:pPr>
+        <w:pStyle w:val="Heading1"/>
+        <w:spacing w:after="200" w:before="400"/>
+      </w:pPr>
+      <w:r>
+        <w:rPr>
+          <w:rFonts w:ascii="Arial" w:cs="Arial" w:eastAsia="Arial" w:hAnsi="Arial"/>
+          <w:b/>
+          <w:bCs/>
+          <w:color w:val="FFFFFF"/>
+          <w:sz w:val="32"/>
+          <w:szCs w:val="32"/>
+        </w:rPr>
+        <w:t xml:space="preserve">Section 4 — Install Claude Code (Desktop)</w:t>
+      </w:r>
+    </w:p>
+    <w:p>
+      <w:pPr>
+        <w:spacing w:after="80" w:before="80"/>
+      </w:pPr>
+      <w:r>
+        <w:rPr>
+          <w:rFonts w:ascii="Arial" w:cs="Arial" w:eastAsia="Arial" w:hAnsi="Arial"/>
+          <w:sz w:val="22"/>
+          <w:szCs w:val="22"/>
+        </w:rPr>
+        <w:t xml:space="preserve">Claude Code is the desktop version of Claude that runs on your computer. It gives you more power when working with files and projects locally.</w:t>
+      </w:r>
+    </w:p>
+    <w:p>
+      <w:pPr>
+        <w:spacing w:after="0" w:before="100"/>
+      </w:pPr>
+      <w:r>
+        <w:t xml:space="preserve"/>
+      </w:r>
+    </w:p>
+    <w:p>
+      <w:pPr>
+        <w:pStyle w:val="Heading2"/>
+        <w:spacing w:after="140" w:before="280"/>
+      </w:pPr>
+      <w:r>
+        <w:rPr>
+          <w:rFonts w:ascii="Arial" w:cs="Arial" w:eastAsia="Arial" w:hAnsi="Arial"/>
+          <w:b/>
+          <w:bCs/>
+          <w:color w:val="1F4E79"/>
+          <w:sz w:val="26"/>
+          <w:szCs w:val="26"/>
+        </w:rPr>
+        <w:t xml:space="preserve">4.1 — Install Node.js</w:t>
+      </w:r>
+    </w:p>
+    <w:p>
+      <w:pPr>
+        <w:spacing w:after="80" w:before="80"/>
+      </w:pPr>
+      <w:r>
+        <w:rPr>
+          <w:rFonts w:ascii="Arial" w:cs="Arial" w:eastAsia="Arial" w:hAnsi="Arial"/>
+          <w:sz w:val="22"/>
+          <w:szCs w:val="22"/>
+        </w:rPr>
+        <w:t xml:space="preserve">Claude Code requires Node.js. First check if you already have it:</w:t>
       </w:r>
     </w:p>
     <w:p>
@@ -727,7 +1268,20 @@
           <w:sz w:val="20"/>
           <w:szCs w:val="20"/>
         </w:rPr>
-        <w:t xml:space="preserve">brew --version</w:t>
+        <w:t xml:space="preserve">node --version</w:t>
+      </w:r>
+    </w:p>
+    <w:p>
+      <w:pPr>
+        <w:spacing w:after="80" w:before="80"/>
+      </w:pPr>
+      <w:r>
+        <w:rPr>
+          <w:rFonts w:ascii="Arial" w:cs="Arial" w:eastAsia="Arial" w:hAnsi="Arial"/>
+          <w:sz w:val="22"/>
+          <w:szCs w:val="22"/>
+        </w:rPr>
+        <w:t xml:space="preserve">If you see a version number (e.g. v18.x.x or higher), skip to Section 4.2.</w:t>
       </w:r>
     </w:p>
     <w:p>
@@ -748,85 +1302,43 @@
           <w:sz w:val="22"/>
           <w:szCs w:val="22"/>
         </w:rPr>
-        <w:t xml:space="preserve">You should see output like: Homebrew 4.x.x</w:t>
-      </w:r>
-    </w:p>
-    <w:p>
-      <w:r>
-        <w:br w:type="page"/>
-      </w:r>
-    </w:p>
-    <w:p>
-      <w:pPr>
-        <w:pStyle w:val="Heading1"/>
-        <w:spacing w:after="200" w:before="400"/>
-      </w:pPr>
-      <w:r>
-        <w:rPr>
-          <w:rFonts w:ascii="Arial" w:cs="Arial" w:eastAsia="Arial" w:hAnsi="Arial"/>
-          <w:b/>
-          <w:bCs/>
-          <w:color w:val="FFFFFF"/>
-          <w:sz w:val="32"/>
-          <w:szCs w:val="32"/>
-        </w:rPr>
-        <w:t xml:space="preserve">Section 3 — Install GitHub CLI</w:t>
-      </w:r>
-    </w:p>
-    <w:p>
-      <w:pPr>
-        <w:spacing w:after="80" w:before="80"/>
-      </w:pPr>
-      <w:r>
-        <w:rPr>
-          <w:rFonts w:ascii="Arial" w:cs="Arial" w:eastAsia="Arial" w:hAnsi="Arial"/>
-          <w:sz w:val="22"/>
-          <w:szCs w:val="22"/>
-        </w:rPr>
-        <w:t xml:space="preserve">GitHub CLI (gh) allows you to interact with GitHub directly from your terminal or command prompt — no browser needed for most tasks.</w:t>
-      </w:r>
-    </w:p>
-    <w:p>
-      <w:pPr>
-        <w:spacing w:after="0" w:before="100"/>
-      </w:pPr>
-      <w:r>
-        <w:t xml:space="preserve"/>
-      </w:r>
-    </w:p>
-    <w:p>
-      <w:pPr>
-        <w:pStyle w:val="Heading2"/>
-        <w:spacing w:after="140" w:before="280"/>
-      </w:pPr>
-      <w:r>
-        <w:rPr>
-          <w:rFonts w:ascii="Arial" w:cs="Arial" w:eastAsia="Arial" w:hAnsi="Arial"/>
-          <w:b/>
-          <w:bCs/>
-          <w:color w:val="1F4E79"/>
-          <w:sz w:val="26"/>
-          <w:szCs w:val="26"/>
-        </w:rPr>
-        <w:t xml:space="preserve">3a — macOS Installation</w:t>
-      </w:r>
-    </w:p>
-    <w:p>
-      <w:pPr>
-        <w:pStyle w:val="ListParagraph"/>
-        <w:numPr>
-          <w:ilvl w:val="0"/>
-          <w:numId w:val="6"/>
-        </w:numPr>
-        <w:spacing w:after="60" w:before="60"/>
-      </w:pPr>
-      <w:r>
-        <w:rPr>
-          <w:rFonts w:ascii="Arial" w:cs="Arial" w:eastAsia="Arial" w:hAnsi="Arial"/>
-          <w:sz w:val="22"/>
-          <w:szCs w:val="22"/>
-        </w:rPr>
-        <w:t xml:space="preserve">In Terminal, run:</w:t>
+        <w:t xml:space="preserve">If Node.js is not installed:</w:t>
+      </w:r>
+    </w:p>
+    <w:p>
+      <w:pPr>
+        <w:spacing w:after="0" w:before="60"/>
+      </w:pPr>
+      <w:r>
+        <w:t xml:space="preserve"/>
+      </w:r>
+    </w:p>
+    <w:p>
+      <w:pPr>
+        <w:pStyle w:val="ListParagraph"/>
+        <w:numPr>
+          <w:ilvl w:val="0"/>
+          <w:numId w:val="2"/>
+        </w:numPr>
+        <w:spacing w:after="60" w:before="60"/>
+      </w:pPr>
+      <w:r>
+        <w:rPr>
+          <w:rFonts w:ascii="Arial" w:cs="Arial" w:eastAsia="Arial" w:hAnsi="Arial"/>
+          <w:b/>
+          <w:bCs/>
+          <w:sz w:val="22"/>
+          <w:szCs w:val="22"/>
+        </w:rPr>
+        <w:t xml:space="preserve">macOS: </w:t>
+      </w:r>
+      <w:r>
+        <w:rPr>
+          <w:rFonts w:ascii="Arial" w:cs="Arial" w:eastAsia="Arial" w:hAnsi="Arial"/>
+          <w:sz w:val="22"/>
+          <w:szCs w:val="22"/>
+        </w:rPr>
+        <w:t xml:space="preserve">open Terminal (Cmd + Space, type Terminal) and run:</w:t>
       </w:r>
     </w:p>
     <w:p>
@@ -842,43 +1354,104 @@
           <w:sz w:val="20"/>
           <w:szCs w:val="20"/>
         </w:rPr>
-        <w:t xml:space="preserve">brew install gh</w:t>
-      </w:r>
-    </w:p>
-    <w:p>
-      <w:pPr>
-        <w:pStyle w:val="ListParagraph"/>
-        <w:numPr>
-          <w:ilvl w:val="0"/>
-          <w:numId w:val="6"/>
-        </w:numPr>
-        <w:spacing w:after="60" w:before="60"/>
-      </w:pPr>
-      <w:r>
-        <w:rPr>
-          <w:rFonts w:ascii="Arial" w:cs="Arial" w:eastAsia="Arial" w:hAnsi="Arial"/>
-          <w:sz w:val="22"/>
-          <w:szCs w:val="22"/>
-        </w:rPr>
-        <w:t xml:space="preserve">Wait for the installation to complete</w:t>
-      </w:r>
-    </w:p>
-    <w:p>
-      <w:pPr>
-        <w:pStyle w:val="ListParagraph"/>
-        <w:numPr>
-          <w:ilvl w:val="0"/>
-          <w:numId w:val="6"/>
-        </w:numPr>
-        <w:spacing w:after="60" w:before="60"/>
-      </w:pPr>
-      <w:r>
-        <w:rPr>
-          <w:rFonts w:ascii="Arial" w:cs="Arial" w:eastAsia="Arial" w:hAnsi="Arial"/>
-          <w:sz w:val="22"/>
-          <w:szCs w:val="22"/>
-        </w:rPr>
-        <w:t xml:space="preserve">Verify the installation:</w:t>
+        <w:t xml:space="preserve">brew install node</w:t>
+      </w:r>
+    </w:p>
+    <w:p>
+      <w:pPr>
+        <w:spacing w:after="0" w:before="40"/>
+      </w:pPr>
+      <w:r>
+        <w:t xml:space="preserve"/>
+      </w:r>
+    </w:p>
+    <w:p>
+      <w:pPr>
+        <w:pStyle w:val="ListParagraph"/>
+        <w:numPr>
+          <w:ilvl w:val="0"/>
+          <w:numId w:val="2"/>
+        </w:numPr>
+        <w:spacing w:after="60" w:before="60"/>
+      </w:pPr>
+      <w:r>
+        <w:rPr>
+          <w:rFonts w:ascii="Arial" w:cs="Arial" w:eastAsia="Arial" w:hAnsi="Arial"/>
+          <w:b/>
+          <w:bCs/>
+          <w:sz w:val="22"/>
+          <w:szCs w:val="22"/>
+        </w:rPr>
+        <w:t xml:space="preserve">Windows: </w:t>
+      </w:r>
+      <w:r>
+        <w:rPr>
+          <w:rFonts w:ascii="Arial" w:cs="Arial" w:eastAsia="Arial" w:hAnsi="Arial"/>
+          <w:sz w:val="22"/>
+          <w:szCs w:val="22"/>
+        </w:rPr>
+        <w:t xml:space="preserve">go to https://nodejs.org, download the LTS version, and run the installer</w:t>
+      </w:r>
+    </w:p>
+    <w:p>
+      <w:pPr>
+        <w:spacing w:after="0" w:before="120"/>
+      </w:pPr>
+      <w:r>
+        <w:t xml:space="preserve"/>
+      </w:r>
+    </w:p>
+    <w:p>
+      <w:pPr>
+        <w:pStyle w:val="Heading2"/>
+        <w:spacing w:after="140" w:before="280"/>
+      </w:pPr>
+      <w:r>
+        <w:rPr>
+          <w:rFonts w:ascii="Arial" w:cs="Arial" w:eastAsia="Arial" w:hAnsi="Arial"/>
+          <w:b/>
+          <w:bCs/>
+          <w:color w:val="1F4E79"/>
+          <w:sz w:val="26"/>
+          <w:szCs w:val="26"/>
+        </w:rPr>
+        <w:t xml:space="preserve">4.2 — Install Claude Code</w:t>
+      </w:r>
+    </w:p>
+    <w:p>
+      <w:pPr>
+        <w:pStyle w:val="ListParagraph"/>
+        <w:numPr>
+          <w:ilvl w:val="0"/>
+          <w:numId w:val="8"/>
+        </w:numPr>
+        <w:spacing w:after="60" w:before="60"/>
+      </w:pPr>
+      <w:r>
+        <w:rPr>
+          <w:rFonts w:ascii="Arial" w:cs="Arial" w:eastAsia="Arial" w:hAnsi="Arial"/>
+          <w:sz w:val="22"/>
+          <w:szCs w:val="22"/>
+        </w:rPr>
+        <w:t xml:space="preserve">Open Terminal (macOS) or Command Prompt (Windows)</w:t>
+      </w:r>
+    </w:p>
+    <w:p>
+      <w:pPr>
+        <w:pStyle w:val="ListParagraph"/>
+        <w:numPr>
+          <w:ilvl w:val="0"/>
+          <w:numId w:val="8"/>
+        </w:numPr>
+        <w:spacing w:after="60" w:before="60"/>
+      </w:pPr>
+      <w:r>
+        <w:rPr>
+          <w:rFonts w:ascii="Arial" w:cs="Arial" w:eastAsia="Arial" w:hAnsi="Arial"/>
+          <w:sz w:val="22"/>
+          <w:szCs w:val="22"/>
+        </w:rPr>
+        <w:t xml:space="preserve">Run the following command:</w:t>
       </w:r>
     </w:p>
     <w:p>
@@ -894,135 +1467,43 @@
           <w:sz w:val="20"/>
           <w:szCs w:val="20"/>
         </w:rPr>
-        <w:t xml:space="preserve">gh --version</w:t>
-      </w:r>
-    </w:p>
-    <w:p>
-      <w:pPr>
-        <w:spacing w:after="80" w:before="80"/>
-      </w:pPr>
-      <w:r>
-        <w:rPr>
-          <w:rFonts w:ascii="Arial" w:cs="Arial" w:eastAsia="Arial" w:hAnsi="Arial"/>
-          <w:sz w:val="22"/>
-          <w:szCs w:val="22"/>
-        </w:rPr>
-        <w:t xml:space="preserve">You should see something like: gh version 2.x.x</w:t>
-      </w:r>
-    </w:p>
-    <w:p>
-      <w:pPr>
-        <w:spacing w:after="0" w:before="160"/>
-      </w:pPr>
-      <w:r>
-        <w:t xml:space="preserve"/>
-      </w:r>
-    </w:p>
-    <w:p>
-      <w:pPr>
-        <w:pStyle w:val="Heading2"/>
-        <w:spacing w:after="140" w:before="280"/>
-      </w:pPr>
-      <w:r>
-        <w:rPr>
-          <w:rFonts w:ascii="Arial" w:cs="Arial" w:eastAsia="Arial" w:hAnsi="Arial"/>
-          <w:b/>
-          <w:bCs/>
-          <w:color w:val="1F4E79"/>
-          <w:sz w:val="26"/>
-          <w:szCs w:val="26"/>
-        </w:rPr>
-        <w:t xml:space="preserve">3b — Windows Installation</w:t>
-      </w:r>
-    </w:p>
-    <w:p>
-      <w:pPr>
-        <w:pStyle w:val="ListParagraph"/>
-        <w:numPr>
-          <w:ilvl w:val="0"/>
-          <w:numId w:val="7"/>
-        </w:numPr>
-        <w:spacing w:after="60" w:before="60"/>
-      </w:pPr>
-      <w:r>
-        <w:rPr>
-          <w:rFonts w:ascii="Arial" w:cs="Arial" w:eastAsia="Arial" w:hAnsi="Arial"/>
-          <w:sz w:val="22"/>
-          <w:szCs w:val="22"/>
-        </w:rPr>
-        <w:t xml:space="preserve">Open your browser and go to https://cli.github.com</w:t>
-      </w:r>
-    </w:p>
-    <w:p>
-      <w:pPr>
-        <w:pStyle w:val="ListParagraph"/>
-        <w:numPr>
-          <w:ilvl w:val="0"/>
-          <w:numId w:val="7"/>
-        </w:numPr>
-        <w:spacing w:after="60" w:before="60"/>
-      </w:pPr>
-      <w:r>
-        <w:rPr>
-          <w:rFonts w:ascii="Arial" w:cs="Arial" w:eastAsia="Arial" w:hAnsi="Arial"/>
-          <w:sz w:val="22"/>
-          <w:szCs w:val="22"/>
-        </w:rPr>
-        <w:t xml:space="preserve">Click "Download for Windows"</w:t>
-      </w:r>
-    </w:p>
-    <w:p>
-      <w:pPr>
-        <w:pStyle w:val="ListParagraph"/>
-        <w:numPr>
-          <w:ilvl w:val="0"/>
-          <w:numId w:val="7"/>
-        </w:numPr>
-        <w:spacing w:after="60" w:before="60"/>
-      </w:pPr>
-      <w:r>
-        <w:rPr>
-          <w:rFonts w:ascii="Arial" w:cs="Arial" w:eastAsia="Arial" w:hAnsi="Arial"/>
-          <w:sz w:val="22"/>
-          <w:szCs w:val="22"/>
-        </w:rPr>
-        <w:t xml:space="preserve">Run the downloaded .msi installer file and follow the setup wizard</w:t>
-      </w:r>
-    </w:p>
-    <w:p>
-      <w:pPr>
-        <w:pStyle w:val="ListParagraph"/>
-        <w:numPr>
-          <w:ilvl w:val="0"/>
-          <w:numId w:val="7"/>
-        </w:numPr>
-        <w:spacing w:after="60" w:before="60"/>
-      </w:pPr>
-      <w:r>
-        <w:rPr>
-          <w:rFonts w:ascii="Arial" w:cs="Arial" w:eastAsia="Arial" w:hAnsi="Arial"/>
-          <w:sz w:val="22"/>
-          <w:szCs w:val="22"/>
-        </w:rPr>
-        <w:t xml:space="preserve">Open Command Prompt: press Win + R, type "cmd", and press Enter</w:t>
-      </w:r>
-    </w:p>
-    <w:p>
-      <w:pPr>
-        <w:pStyle w:val="ListParagraph"/>
-        <w:numPr>
-          <w:ilvl w:val="0"/>
-          <w:numId w:val="7"/>
-        </w:numPr>
-        <w:spacing w:after="60" w:before="60"/>
-      </w:pPr>
-      <w:r>
-        <w:rPr>
-          <w:rFonts w:ascii="Arial" w:cs="Arial" w:eastAsia="Arial" w:hAnsi="Arial"/>
-          <w:sz w:val="22"/>
-          <w:szCs w:val="22"/>
-        </w:rPr>
-        <w:t xml:space="preserve">Verify the installation:</w:t>
+        <w:t xml:space="preserve">npm install -g @anthropic-ai/claude-code</w:t>
+      </w:r>
+    </w:p>
+    <w:p>
+      <w:pPr>
+        <w:pStyle w:val="ListParagraph"/>
+        <w:numPr>
+          <w:ilvl w:val="0"/>
+          <w:numId w:val="8"/>
+        </w:numPr>
+        <w:spacing w:after="60" w:before="60"/>
+      </w:pPr>
+      <w:r>
+        <w:rPr>
+          <w:rFonts w:ascii="Arial" w:cs="Arial" w:eastAsia="Arial" w:hAnsi="Arial"/>
+          <w:sz w:val="22"/>
+          <w:szCs w:val="22"/>
+        </w:rPr>
+        <w:t xml:space="preserve">Wait for the installation to complete</w:t>
+      </w:r>
+    </w:p>
+    <w:p>
+      <w:pPr>
+        <w:pStyle w:val="ListParagraph"/>
+        <w:numPr>
+          <w:ilvl w:val="0"/>
+          <w:numId w:val="8"/>
+        </w:numPr>
+        <w:spacing w:after="60" w:before="60"/>
+      </w:pPr>
+      <w:r>
+        <w:rPr>
+          <w:rFonts w:ascii="Arial" w:cs="Arial" w:eastAsia="Arial" w:hAnsi="Arial"/>
+          <w:sz w:val="22"/>
+          <w:szCs w:val="22"/>
+        </w:rPr>
+        <w:t xml:space="preserve">Verify it installed correctly:</w:t>
       </w:r>
     </w:p>
     <w:p>
@@ -1038,55 +1519,7 @@
           <w:sz w:val="20"/>
           <w:szCs w:val="20"/>
         </w:rPr>
-        <w:t xml:space="preserve">gh --version</w:t>
-      </w:r>
-    </w:p>
-    <w:p>
-      <w:pPr>
-        <w:spacing w:after="80" w:before="80"/>
-      </w:pPr>
-      <w:r>
-        <w:rPr>
-          <w:rFonts w:ascii="Arial" w:cs="Arial" w:eastAsia="Arial" w:hAnsi="Arial"/>
-          <w:sz w:val="22"/>
-          <w:szCs w:val="22"/>
-        </w:rPr>
-        <w:t xml:space="preserve">You should see something like: gh version 2.x.x</w:t>
-      </w:r>
-    </w:p>
-    <w:p>
-      <w:r>
-        <w:br w:type="page"/>
-      </w:r>
-    </w:p>
-    <w:p>
-      <w:pPr>
-        <w:pStyle w:val="Heading1"/>
-        <w:spacing w:after="200" w:before="400"/>
-      </w:pPr>
-      <w:r>
-        <w:rPr>
-          <w:rFonts w:ascii="Arial" w:cs="Arial" w:eastAsia="Arial" w:hAnsi="Arial"/>
-          <w:b/>
-          <w:bCs/>
-          <w:color w:val="FFFFFF"/>
-          <w:sz w:val="32"/>
-          <w:szCs w:val="32"/>
-        </w:rPr>
-        <w:t xml:space="preserve">Section 4 — Authenticate GitHub CLI</w:t>
-      </w:r>
-    </w:p>
-    <w:p>
-      <w:pPr>
-        <w:spacing w:after="80" w:before="80"/>
-      </w:pPr>
-      <w:r>
-        <w:rPr>
-          <w:rFonts w:ascii="Arial" w:cs="Arial" w:eastAsia="Arial" w:hAnsi="Arial"/>
-          <w:sz w:val="22"/>
-          <w:szCs w:val="22"/>
-        </w:rPr>
-        <w:t xml:space="preserve">Now that GitHub CLI is installed, you need to link it to your GitHub account.</w:t>
+        <w:t xml:space="preserve">claude --version</w:t>
       </w:r>
     </w:p>
     <w:p>
@@ -1111,25 +1544,25 @@
           <w:sz w:val="26"/>
           <w:szCs w:val="26"/>
         </w:rPr>
-        <w:t xml:space="preserve">4.1 — Authentication Steps</w:t>
-      </w:r>
-    </w:p>
-    <w:p>
-      <w:pPr>
-        <w:pStyle w:val="ListParagraph"/>
-        <w:numPr>
-          <w:ilvl w:val="0"/>
-          <w:numId w:val="8"/>
-        </w:numPr>
-        <w:spacing w:after="60" w:before="60"/>
-      </w:pPr>
-      <w:r>
-        <w:rPr>
-          <w:rFonts w:ascii="Arial" w:cs="Arial" w:eastAsia="Arial" w:hAnsi="Arial"/>
-          <w:sz w:val="22"/>
-          <w:szCs w:val="22"/>
-        </w:rPr>
-        <w:t xml:space="preserve">In Terminal (macOS) or Command Prompt (Windows), run:</w:t>
+        <w:t xml:space="preserve">4.3 — First Launch and Login</w:t>
+      </w:r>
+    </w:p>
+    <w:p>
+      <w:pPr>
+        <w:pStyle w:val="ListParagraph"/>
+        <w:numPr>
+          <w:ilvl w:val="0"/>
+          <w:numId w:val="9"/>
+        </w:numPr>
+        <w:spacing w:after="60" w:before="60"/>
+      </w:pPr>
+      <w:r>
+        <w:rPr>
+          <w:rFonts w:ascii="Arial" w:cs="Arial" w:eastAsia="Arial" w:hAnsi="Arial"/>
+          <w:sz w:val="22"/>
+          <w:szCs w:val="22"/>
+        </w:rPr>
+        <w:t xml:space="preserve">In Terminal or Command Prompt, run:</w:t>
       </w:r>
     </w:p>
     <w:p>
@@ -1145,151 +1578,82 @@
           <w:sz w:val="20"/>
           <w:szCs w:val="20"/>
         </w:rPr>
-        <w:t xml:space="preserve">gh auth login</w:t>
-      </w:r>
-    </w:p>
-    <w:p>
-      <w:pPr>
-        <w:pStyle w:val="ListParagraph"/>
-        <w:numPr>
-          <w:ilvl w:val="0"/>
-          <w:numId w:val="8"/>
-        </w:numPr>
-        <w:spacing w:after="60" w:before="60"/>
-      </w:pPr>
-      <w:r>
-        <w:rPr>
-          <w:rFonts w:ascii="Arial" w:cs="Arial" w:eastAsia="Arial" w:hAnsi="Arial"/>
-          <w:sz w:val="22"/>
-          <w:szCs w:val="22"/>
-        </w:rPr>
-        <w:t xml:space="preserve">When asked "Where do you use GitHub?", choose: GitHub.com</w:t>
-      </w:r>
-    </w:p>
-    <w:p>
-      <w:pPr>
-        <w:pStyle w:val="ListParagraph"/>
-        <w:numPr>
-          <w:ilvl w:val="0"/>
-          <w:numId w:val="8"/>
-        </w:numPr>
-        <w:spacing w:after="60" w:before="60"/>
-      </w:pPr>
-      <w:r>
-        <w:rPr>
-          <w:rFonts w:ascii="Arial" w:cs="Arial" w:eastAsia="Arial" w:hAnsi="Arial"/>
-          <w:sz w:val="22"/>
-          <w:szCs w:val="22"/>
-        </w:rPr>
-        <w:t xml:space="preserve">When asked "What is your preferred protocol?", choose: HTTPS</w:t>
-      </w:r>
-    </w:p>
-    <w:p>
-      <w:pPr>
-        <w:pStyle w:val="ListParagraph"/>
-        <w:numPr>
-          <w:ilvl w:val="0"/>
-          <w:numId w:val="8"/>
-        </w:numPr>
-        <w:spacing w:after="60" w:before="60"/>
-      </w:pPr>
-      <w:r>
-        <w:rPr>
-          <w:rFonts w:ascii="Arial" w:cs="Arial" w:eastAsia="Arial" w:hAnsi="Arial"/>
-          <w:sz w:val="22"/>
-          <w:szCs w:val="22"/>
-        </w:rPr>
-        <w:t xml:space="preserve">When asked "Authenticate Git with your GitHub credentials?", answer: Yes</w:t>
-      </w:r>
-    </w:p>
-    <w:p>
-      <w:pPr>
-        <w:pStyle w:val="ListParagraph"/>
-        <w:numPr>
-          <w:ilvl w:val="0"/>
-          <w:numId w:val="8"/>
-        </w:numPr>
-        <w:spacing w:after="60" w:before="60"/>
-      </w:pPr>
-      <w:r>
-        <w:rPr>
-          <w:rFonts w:ascii="Arial" w:cs="Arial" w:eastAsia="Arial" w:hAnsi="Arial"/>
-          <w:sz w:val="22"/>
-          <w:szCs w:val="22"/>
-        </w:rPr>
-        <w:t xml:space="preserve">When asked "How would you like to authenticate?", choose: Login with a web browser</w:t>
-      </w:r>
-    </w:p>
-    <w:p>
-      <w:pPr>
-        <w:pStyle w:val="ListParagraph"/>
-        <w:numPr>
-          <w:ilvl w:val="0"/>
-          <w:numId w:val="8"/>
-        </w:numPr>
-        <w:spacing w:after="60" w:before="60"/>
-      </w:pPr>
-      <w:r>
-        <w:rPr>
-          <w:rFonts w:ascii="Arial" w:cs="Arial" w:eastAsia="Arial" w:hAnsi="Arial"/>
-          <w:sz w:val="22"/>
-          <w:szCs w:val="22"/>
-        </w:rPr>
-        <w:t xml:space="preserve">A one-time code will appear in your terminal — copy it</w:t>
-      </w:r>
-    </w:p>
-    <w:p>
-      <w:pPr>
-        <w:pStyle w:val="ListParagraph"/>
-        <w:numPr>
-          <w:ilvl w:val="0"/>
-          <w:numId w:val="8"/>
-        </w:numPr>
-        <w:spacing w:after="60" w:before="60"/>
-      </w:pPr>
-      <w:r>
-        <w:rPr>
-          <w:rFonts w:ascii="Arial" w:cs="Arial" w:eastAsia="Arial" w:hAnsi="Arial"/>
-          <w:sz w:val="22"/>
-          <w:szCs w:val="22"/>
-        </w:rPr>
-        <w:t xml:space="preserve">Press Enter — your browser will open automatically</w:t>
-      </w:r>
-    </w:p>
-    <w:p>
-      <w:pPr>
-        <w:pStyle w:val="ListParagraph"/>
-        <w:numPr>
-          <w:ilvl w:val="0"/>
-          <w:numId w:val="8"/>
-        </w:numPr>
-        <w:spacing w:after="60" w:before="60"/>
-      </w:pPr>
-      <w:r>
-        <w:rPr>
-          <w:rFonts w:ascii="Arial" w:cs="Arial" w:eastAsia="Arial" w:hAnsi="Arial"/>
-          <w:sz w:val="22"/>
-          <w:szCs w:val="22"/>
-        </w:rPr>
-        <w:t xml:space="preserve">Paste the code on the GitHub authorization page and click Authorize</w:t>
-      </w:r>
-    </w:p>
-    <w:p>
-      <w:pPr>
-        <w:pStyle w:val="ListParagraph"/>
-        <w:numPr>
-          <w:ilvl w:val="0"/>
-          <w:numId w:val="8"/>
-        </w:numPr>
-        <w:spacing w:after="60" w:before="60"/>
-      </w:pPr>
-      <w:r>
-        <w:rPr>
-          <w:rFonts w:ascii="Arial" w:cs="Arial" w:eastAsia="Arial" w:hAnsi="Arial"/>
-          <w:sz w:val="22"/>
-          <w:szCs w:val="22"/>
-        </w:rPr>
-        <w:t xml:space="preserve">Return to your terminal — you should see: Logged in as [your username]</w:t>
+        <w:t xml:space="preserve">claude</w:t>
+      </w:r>
+    </w:p>
+    <w:p>
+      <w:pPr>
+        <w:pStyle w:val="ListParagraph"/>
+        <w:numPr>
+          <w:ilvl w:val="0"/>
+          <w:numId w:val="9"/>
+        </w:numPr>
+        <w:spacing w:after="60" w:before="60"/>
+      </w:pPr>
+      <w:r>
+        <w:rPr>
+          <w:rFonts w:ascii="Arial" w:cs="Arial" w:eastAsia="Arial" w:hAnsi="Arial"/>
+          <w:sz w:val="22"/>
+          <w:szCs w:val="22"/>
+        </w:rPr>
+        <w:t xml:space="preserve">Follow the on-screen prompts to log in with your Claude (Anthropic) account</w:t>
+      </w:r>
+    </w:p>
+    <w:p>
+      <w:pPr>
+        <w:pStyle w:val="ListParagraph"/>
+        <w:numPr>
+          <w:ilvl w:val="0"/>
+          <w:numId w:val="9"/>
+        </w:numPr>
+        <w:spacing w:after="60" w:before="60"/>
+      </w:pPr>
+      <w:r>
+        <w:rPr>
+          <w:rFonts w:ascii="Arial" w:cs="Arial" w:eastAsia="Arial" w:hAnsi="Arial"/>
+          <w:sz w:val="22"/>
+          <w:szCs w:val="22"/>
+        </w:rPr>
+        <w:t xml:space="preserve">Once logged in, Claude Code is ready to use</w:t>
+      </w:r>
+    </w:p>
+    <w:p>
+      <w:pPr>
+        <w:spacing w:after="0" w:before="80"/>
+      </w:pPr>
+      <w:r>
+        <w:t xml:space="preserve"/>
+      </w:r>
+    </w:p>
+    <w:p>
+      <w:pPr>
+        <w:shd w:fill="EBF3FB" w:val="clear"/>
+        <w:spacing w:after="100" w:before="100"/>
+        <w:ind w:left="720"/>
+      </w:pPr>
+      <w:r>
+        <w:rPr>
+          <w:rFonts w:ascii="Arial" w:cs="Arial" w:eastAsia="Arial" w:hAnsi="Arial"/>
+          <w:b/>
+          <w:bCs/>
+          <w:i/>
+          <w:iCs/>
+          <w:color w:val="1F4E79"/>
+          <w:sz w:val="22"/>
+          <w:szCs w:val="22"/>
+        </w:rPr>
+        <w:t xml:space="preserve">Note: </w:t>
+      </w:r>
+      <w:r>
+        <w:rPr>
+          <w:rFonts w:ascii="Arial" w:cs="Arial" w:eastAsia="Arial" w:hAnsi="Arial"/>
+          <w:i/>
+          <w:iCs/>
+          <w:color w:val="444444"/>
+          <w:sz w:val="22"/>
+          <w:szCs w:val="22"/>
+        </w:rPr>
+        <w:t xml:space="preserve">Use the same email and password you used to sign up at claude.ai.</w:t>
       </w:r>
     </w:p>
     <w:p>
@@ -1314,7 +1678,7 @@
           <w:sz w:val="26"/>
           <w:szCs w:val="26"/>
         </w:rPr>
-        <w:t xml:space="preserve">4.2 — Verify Authentication</w:t>
+        <w:t xml:space="preserve">4.4 — Connect the GitHub Connector in Claude Code</w:t>
       </w:r>
     </w:p>
     <w:p>
@@ -1327,7 +1691,33 @@
           <w:sz w:val="22"/>
           <w:szCs w:val="22"/>
         </w:rPr>
-        <w:t xml:space="preserve">Run the following to confirm everything is working:</w:t>
+        <w:t xml:space="preserve">Just like in the web version, you need to connect the GitHub connector inside Claude Code:</w:t>
+      </w:r>
+    </w:p>
+    <w:p>
+      <w:pPr>
+        <w:spacing w:after="0" w:before="60"/>
+      </w:pPr>
+      <w:r>
+        <w:t xml:space="preserve"/>
+      </w:r>
+    </w:p>
+    <w:p>
+      <w:pPr>
+        <w:pStyle w:val="ListParagraph"/>
+        <w:numPr>
+          <w:ilvl w:val="0"/>
+          <w:numId w:val="10"/>
+        </w:numPr>
+        <w:spacing w:after="60" w:before="60"/>
+      </w:pPr>
+      <w:r>
+        <w:rPr>
+          <w:rFonts w:ascii="Arial" w:cs="Arial" w:eastAsia="Arial" w:hAnsi="Arial"/>
+          <w:sz w:val="22"/>
+          <w:szCs w:val="22"/>
+        </w:rPr>
+        <w:t xml:space="preserve">Launch Claude Code in your project folder:</w:t>
       </w:r>
     </w:p>
     <w:p>
@@ -1343,131 +1733,25 @@
           <w:sz w:val="20"/>
           <w:szCs w:val="20"/>
         </w:rPr>
-        <w:t xml:space="preserve">gh auth status</w:t>
-      </w:r>
-    </w:p>
-    <w:p>
-      <w:pPr>
-        <w:spacing w:after="80" w:before="80"/>
-      </w:pPr>
-      <w:r>
-        <w:rPr>
-          <w:rFonts w:ascii="Arial" w:cs="Arial" w:eastAsia="Arial" w:hAnsi="Arial"/>
-          <w:sz w:val="22"/>
-          <w:szCs w:val="22"/>
-        </w:rPr>
-        <w:t xml:space="preserve">You should see your username and a confirmation that you are logged in.</w:t>
-      </w:r>
-    </w:p>
-    <w:p>
-      <w:pPr>
-        <w:spacing w:after="0" w:before="100"/>
-      </w:pPr>
-      <w:r>
-        <w:t xml:space="preserve"/>
-      </w:r>
-    </w:p>
-    <w:p>
-      <w:pPr>
-        <w:spacing w:after="100" w:before="100"/>
-        <w:ind w:left="720"/>
-      </w:pPr>
-      <w:r>
-        <w:rPr>
-          <w:rFonts w:ascii="Arial" w:cs="Arial" w:eastAsia="Arial" w:hAnsi="Arial"/>
-          <w:b/>
-          <w:bCs/>
-          <w:i/>
-          <w:iCs/>
-          <w:color w:val="1F4E79"/>
-          <w:sz w:val="22"/>
-          <w:szCs w:val="22"/>
-        </w:rPr>
-        <w:t xml:space="preserve">Note: </w:t>
-      </w:r>
-      <w:r>
-        <w:rPr>
-          <w:rFonts w:ascii="Arial" w:cs="Arial" w:eastAsia="Arial" w:hAnsi="Arial"/>
-          <w:i/>
-          <w:iCs/>
-          <w:color w:val="444444"/>
-          <w:sz w:val="22"/>
-          <w:szCs w:val="22"/>
-        </w:rPr>
-        <w:t xml:space="preserve">If your browser does not open automatically, manually go to https://github.com/login/device and enter the one-time code from your terminal.</w:t>
-      </w:r>
-    </w:p>
-    <w:p>
-      <w:r>
-        <w:br w:type="page"/>
-      </w:r>
-    </w:p>
-    <w:p>
-      <w:pPr>
-        <w:pStyle w:val="Heading1"/>
-        <w:spacing w:after="200" w:before="400"/>
-      </w:pPr>
-      <w:r>
-        <w:rPr>
-          <w:rFonts w:ascii="Arial" w:cs="Arial" w:eastAsia="Arial" w:hAnsi="Arial"/>
-          <w:b/>
-          <w:bCs/>
-          <w:color w:val="FFFFFF"/>
-          <w:sz w:val="32"/>
-          <w:szCs w:val="32"/>
-        </w:rPr>
-        <w:t xml:space="preserve">Section 5 — Install Claude Code</w:t>
-      </w:r>
-    </w:p>
-    <w:p>
-      <w:pPr>
-        <w:spacing w:after="80" w:before="80"/>
-      </w:pPr>
-      <w:r>
-        <w:rPr>
-          <w:rFonts w:ascii="Arial" w:cs="Arial" w:eastAsia="Arial" w:hAnsi="Arial"/>
-          <w:sz w:val="22"/>
-          <w:szCs w:val="22"/>
-        </w:rPr>
-        <w:t xml:space="preserve">Claude Code is an AI coding assistant that runs directly in your terminal. It helps you edit files, write content, understand code, and much more — all by chatting in plain language.</w:t>
-      </w:r>
-    </w:p>
-    <w:p>
-      <w:pPr>
-        <w:spacing w:after="0" w:before="100"/>
-      </w:pPr>
-      <w:r>
-        <w:t xml:space="preserve"/>
-      </w:r>
-    </w:p>
-    <w:p>
-      <w:pPr>
-        <w:pStyle w:val="Heading2"/>
-        <w:spacing w:after="140" w:before="280"/>
-      </w:pPr>
-      <w:r>
-        <w:rPr>
-          <w:rFonts w:ascii="Arial" w:cs="Arial" w:eastAsia="Arial" w:hAnsi="Arial"/>
-          <w:b/>
-          <w:bCs/>
-          <w:color w:val="1F4E79"/>
-          <w:sz w:val="26"/>
-          <w:szCs w:val="26"/>
-        </w:rPr>
-        <w:t xml:space="preserve">5.1 — Install Node.js</w:t>
-      </w:r>
-    </w:p>
-    <w:p>
-      <w:pPr>
-        <w:spacing w:after="80" w:before="80"/>
-      </w:pPr>
-      <w:r>
-        <w:rPr>
-          <w:rFonts w:ascii="Arial" w:cs="Arial" w:eastAsia="Arial" w:hAnsi="Arial"/>
-          <w:sz w:val="22"/>
-          <w:szCs w:val="22"/>
-        </w:rPr>
-        <w:t xml:space="preserve">Claude Code requires Node.js. Check if you already have it:</w:t>
+        <w:t xml:space="preserve">claude</w:t>
+      </w:r>
+    </w:p>
+    <w:p>
+      <w:pPr>
+        <w:pStyle w:val="ListParagraph"/>
+        <w:numPr>
+          <w:ilvl w:val="0"/>
+          <w:numId w:val="10"/>
+        </w:numPr>
+        <w:spacing w:after="60" w:before="60"/>
+      </w:pPr>
+      <w:r>
+        <w:rPr>
+          <w:rFonts w:ascii="Arial" w:cs="Arial" w:eastAsia="Arial" w:hAnsi="Arial"/>
+          <w:sz w:val="22"/>
+          <w:szCs w:val="22"/>
+        </w:rPr>
+        <w:t xml:space="preserve">Type the following to trigger connector setup:</w:t>
       </w:r>
     </w:p>
     <w:p>
@@ -1483,7 +1767,122 @@
           <w:sz w:val="20"/>
           <w:szCs w:val="20"/>
         </w:rPr>
-        <w:t xml:space="preserve">node --version</w:t>
+        <w:t xml:space="preserve">/connectors</w:t>
+      </w:r>
+    </w:p>
+    <w:p>
+      <w:pPr>
+        <w:pStyle w:val="ListParagraph"/>
+        <w:numPr>
+          <w:ilvl w:val="0"/>
+          <w:numId w:val="10"/>
+        </w:numPr>
+        <w:spacing w:after="60" w:before="60"/>
+      </w:pPr>
+      <w:r>
+        <w:rPr>
+          <w:rFonts w:ascii="Arial" w:cs="Arial" w:eastAsia="Arial" w:hAnsi="Arial"/>
+          <w:sz w:val="22"/>
+          <w:szCs w:val="22"/>
+        </w:rPr>
+        <w:t xml:space="preserve">Select GitHub from the list of available connectors</w:t>
+      </w:r>
+    </w:p>
+    <w:p>
+      <w:pPr>
+        <w:pStyle w:val="ListParagraph"/>
+        <w:numPr>
+          <w:ilvl w:val="0"/>
+          <w:numId w:val="10"/>
+        </w:numPr>
+        <w:spacing w:after="60" w:before="60"/>
+      </w:pPr>
+      <w:r>
+        <w:rPr>
+          <w:rFonts w:ascii="Arial" w:cs="Arial" w:eastAsia="Arial" w:hAnsi="Arial"/>
+          <w:sz w:val="22"/>
+          <w:szCs w:val="22"/>
+        </w:rPr>
+        <w:t xml:space="preserve">Follow the authorization steps (same as Section 3.2)</w:t>
+      </w:r>
+    </w:p>
+    <w:p>
+      <w:pPr>
+        <w:pStyle w:val="ListParagraph"/>
+        <w:numPr>
+          <w:ilvl w:val="0"/>
+          <w:numId w:val="10"/>
+        </w:numPr>
+        <w:spacing w:after="60" w:before="60"/>
+      </w:pPr>
+      <w:r>
+        <w:rPr>
+          <w:rFonts w:ascii="Arial" w:cs="Arial" w:eastAsia="Arial" w:hAnsi="Arial"/>
+          <w:sz w:val="22"/>
+          <w:szCs w:val="22"/>
+        </w:rPr>
+        <w:t xml:space="preserve">Once authorized, Claude Code can read and write to your GitHub repositories</w:t>
+      </w:r>
+    </w:p>
+    <w:p>
+      <w:pPr>
+        <w:spacing w:after="0" w:before="80"/>
+      </w:pPr>
+      <w:r>
+        <w:t xml:space="preserve"/>
+      </w:r>
+    </w:p>
+    <w:p>
+      <w:pPr>
+        <w:shd w:fill="EAF7EA" w:val="clear"/>
+        <w:spacing w:after="100" w:before="100"/>
+        <w:ind w:left="720"/>
+      </w:pPr>
+      <w:r>
+        <w:rPr>
+          <w:rFonts w:ascii="Arial" w:cs="Arial" w:eastAsia="Arial" w:hAnsi="Arial"/>
+          <w:b/>
+          <w:bCs/>
+          <w:i/>
+          <w:iCs/>
+          <w:color w:val="276221"/>
+          <w:sz w:val="22"/>
+          <w:szCs w:val="22"/>
+        </w:rPr>
+        <w:t xml:space="preserve">Tip: </w:t>
+      </w:r>
+      <w:r>
+        <w:rPr>
+          <w:rFonts w:ascii="Arial" w:cs="Arial" w:eastAsia="Arial" w:hAnsi="Arial"/>
+          <w:i/>
+          <w:iCs/>
+          <w:color w:val="444444"/>
+          <w:sz w:val="22"/>
+          <w:szCs w:val="22"/>
+        </w:rPr>
+        <w:t xml:space="preserve">You only need to connect the GitHub connector once. It will remain connected for future sessions.</w:t>
+      </w:r>
+    </w:p>
+    <w:p>
+      <w:r>
+        <w:br w:type="page"/>
+      </w:r>
+    </w:p>
+    <w:p>
+      <w:pPr>
+        <w:pStyle w:val="Heading1"/>
+        <w:spacing w:after="200" w:before="400"/>
+      </w:pPr>
+      <w:r>
+        <w:rPr>
+          <w:rFonts w:ascii="Arial" w:cs="Arial" w:eastAsia="Arial" w:hAnsi="Arial"/>
+          <w:b/>
+          <w:bCs/>
+          <w:color w:val="FFFFFF"/>
+          <w:sz w:val="32"/>
+          <w:szCs w:val="32"/>
+        </w:rPr>
+        <w:t xml:space="preserve">Section 5 — Clone the Repository</w:t>
       </w:r>
     </w:p>
     <w:p>
@@ -1496,15 +1895,32 @@
           <w:sz w:val="22"/>
           <w:szCs w:val="22"/>
         </w:rPr>
-        <w:t xml:space="preserve">If you see a version number (e.g. v18.x.x), skip to Section 5.2.</w:t>
-      </w:r>
-    </w:p>
-    <w:p>
-      <w:pPr>
-        <w:spacing w:after="0" w:before="80"/>
-      </w:pPr>
-      <w:r>
-        <w:t xml:space="preserve"/>
+        <w:t xml:space="preserve">Cloning means downloading a copy of the project to your computer so you can work on it locally.</w:t>
+      </w:r>
+    </w:p>
+    <w:p>
+      <w:pPr>
+        <w:spacing w:after="0" w:before="100"/>
+      </w:pPr>
+      <w:r>
+        <w:t xml:space="preserve"/>
+      </w:r>
+    </w:p>
+    <w:p>
+      <w:pPr>
+        <w:pStyle w:val="Heading2"/>
+        <w:spacing w:after="140" w:before="280"/>
+      </w:pPr>
+      <w:r>
+        <w:rPr>
+          <w:rFonts w:ascii="Arial" w:cs="Arial" w:eastAsia="Arial" w:hAnsi="Arial"/>
+          <w:b/>
+          <w:bCs/>
+          <w:color w:val="1F4E79"/>
+          <w:sz w:val="26"/>
+          <w:szCs w:val="26"/>
+        </w:rPr>
+        <w:t xml:space="preserve">5.1 — Clone via Claude Code</w:t>
       </w:r>
     </w:p>
     <w:p>
@@ -1517,7 +1933,7 @@
           <w:sz w:val="22"/>
           <w:szCs w:val="22"/>
         </w:rPr>
-        <w:t xml:space="preserve">If Node.js is not installed:</w:t>
+        <w:t xml:space="preserve">The easiest way to clone the repository is to ask Claude directly inside Claude Code:</w:t>
       </w:r>
     </w:p>
     <w:p>
@@ -1533,17 +1949,17 @@
         <w:pStyle w:val="ListParagraph"/>
         <w:numPr>
           <w:ilvl w:val="0"/>
-          <w:numId w:val="2"/>
-        </w:numPr>
-        <w:spacing w:after="60" w:before="60"/>
-      </w:pPr>
-      <w:r>
-        <w:rPr>
-          <w:rFonts w:ascii="Arial" w:cs="Arial" w:eastAsia="Arial" w:hAnsi="Arial"/>
-          <w:sz w:val="22"/>
-          <w:szCs w:val="22"/>
-        </w:rPr>
-        <w:t xml:space="preserve">macOS: run in Terminal:</w:t>
+          <w:numId w:val="11"/>
+        </w:numPr>
+        <w:spacing w:after="60" w:before="60"/>
+      </w:pPr>
+      <w:r>
+        <w:rPr>
+          <w:rFonts w:ascii="Arial" w:cs="Arial" w:eastAsia="Arial" w:hAnsi="Arial"/>
+          <w:sz w:val="22"/>
+          <w:szCs w:val="22"/>
+        </w:rPr>
+        <w:t xml:space="preserve">Open Terminal and launch Claude Code:</w:t>
       </w:r>
     </w:p>
     <w:p>
@@ -1559,68 +1975,25 @@
           <w:sz w:val="20"/>
           <w:szCs w:val="20"/>
         </w:rPr>
-        <w:t xml:space="preserve">brew install node</w:t>
-      </w:r>
-    </w:p>
-    <w:p>
-      <w:pPr>
-        <w:pStyle w:val="ListParagraph"/>
-        <w:numPr>
-          <w:ilvl w:val="0"/>
-          <w:numId w:val="2"/>
-        </w:numPr>
-        <w:spacing w:after="60" w:before="60"/>
-      </w:pPr>
-      <w:r>
-        <w:rPr>
-          <w:rFonts w:ascii="Arial" w:cs="Arial" w:eastAsia="Arial" w:hAnsi="Arial"/>
-          <w:sz w:val="22"/>
-          <w:szCs w:val="22"/>
-        </w:rPr>
-        <w:t xml:space="preserve">Windows: go to https://nodejs.org, download the LTS version, and run the installer</w:t>
-      </w:r>
-    </w:p>
-    <w:p>
-      <w:pPr>
-        <w:spacing w:after="0" w:before="100"/>
-      </w:pPr>
-      <w:r>
-        <w:t xml:space="preserve"/>
-      </w:r>
-    </w:p>
-    <w:p>
-      <w:pPr>
-        <w:pStyle w:val="Heading2"/>
-        <w:spacing w:after="140" w:before="280"/>
-      </w:pPr>
-      <w:r>
-        <w:rPr>
-          <w:rFonts w:ascii="Arial" w:cs="Arial" w:eastAsia="Arial" w:hAnsi="Arial"/>
-          <w:b/>
-          <w:bCs/>
-          <w:color w:val="1F4E79"/>
-          <w:sz w:val="26"/>
-          <w:szCs w:val="26"/>
-        </w:rPr>
-        <w:t xml:space="preserve">5.2 — Install Claude Code</w:t>
-      </w:r>
-    </w:p>
-    <w:p>
-      <w:pPr>
-        <w:pStyle w:val="ListParagraph"/>
-        <w:numPr>
-          <w:ilvl w:val="0"/>
-          <w:numId w:val="9"/>
-        </w:numPr>
-        <w:spacing w:after="60" w:before="60"/>
-      </w:pPr>
-      <w:r>
-        <w:rPr>
-          <w:rFonts w:ascii="Arial" w:cs="Arial" w:eastAsia="Arial" w:hAnsi="Arial"/>
-          <w:sz w:val="22"/>
-          <w:szCs w:val="22"/>
-        </w:rPr>
-        <w:t xml:space="preserve">In Terminal or Command Prompt, run:</w:t>
+        <w:t xml:space="preserve">claude</w:t>
+      </w:r>
+    </w:p>
+    <w:p>
+      <w:pPr>
+        <w:pStyle w:val="ListParagraph"/>
+        <w:numPr>
+          <w:ilvl w:val="0"/>
+          <w:numId w:val="11"/>
+        </w:numPr>
+        <w:spacing w:after="60" w:before="60"/>
+      </w:pPr>
+      <w:r>
+        <w:rPr>
+          <w:rFonts w:ascii="Arial" w:cs="Arial" w:eastAsia="Arial" w:hAnsi="Arial"/>
+          <w:sz w:val="22"/>
+          <w:szCs w:val="22"/>
+        </w:rPr>
+        <w:t xml:space="preserve">Ask Claude to clone the repository for you:</w:t>
       </w:r>
     </w:p>
     <w:p>
@@ -1636,43 +2009,43 @@
           <w:sz w:val="20"/>
           <w:szCs w:val="20"/>
         </w:rPr>
-        <w:t xml:space="preserve">npm install -g @anthropic-ai/claude-code</w:t>
-      </w:r>
-    </w:p>
-    <w:p>
-      <w:pPr>
-        <w:pStyle w:val="ListParagraph"/>
-        <w:numPr>
-          <w:ilvl w:val="0"/>
-          <w:numId w:val="9"/>
-        </w:numPr>
-        <w:spacing w:after="60" w:before="60"/>
-      </w:pPr>
-      <w:r>
-        <w:rPr>
-          <w:rFonts w:ascii="Arial" w:cs="Arial" w:eastAsia="Arial" w:hAnsi="Arial"/>
-          <w:sz w:val="22"/>
-          <w:szCs w:val="22"/>
-        </w:rPr>
-        <w:t xml:space="preserve">Wait for installation to complete</w:t>
-      </w:r>
-    </w:p>
-    <w:p>
-      <w:pPr>
-        <w:pStyle w:val="ListParagraph"/>
-        <w:numPr>
-          <w:ilvl w:val="0"/>
-          <w:numId w:val="9"/>
-        </w:numPr>
-        <w:spacing w:after="60" w:before="60"/>
-      </w:pPr>
-      <w:r>
-        <w:rPr>
-          <w:rFonts w:ascii="Arial" w:cs="Arial" w:eastAsia="Arial" w:hAnsi="Arial"/>
-          <w:sz w:val="22"/>
-          <w:szCs w:val="22"/>
-        </w:rPr>
-        <w:t xml:space="preserve">Verify the installation:</w:t>
+        <w:t xml:space="preserve">Clone the easvrm/Training-Package-for-Replication repository into my Documents folder</w:t>
+      </w:r>
+    </w:p>
+    <w:p>
+      <w:pPr>
+        <w:pStyle w:val="ListParagraph"/>
+        <w:numPr>
+          <w:ilvl w:val="0"/>
+          <w:numId w:val="11"/>
+        </w:numPr>
+        <w:spacing w:after="60" w:before="60"/>
+      </w:pPr>
+      <w:r>
+        <w:rPr>
+          <w:rFonts w:ascii="Arial" w:cs="Arial" w:eastAsia="Arial" w:hAnsi="Arial"/>
+          <w:sz w:val="22"/>
+          <w:szCs w:val="22"/>
+        </w:rPr>
+        <w:t xml:space="preserve">Claude will run the necessary commands and confirm when done</w:t>
+      </w:r>
+    </w:p>
+    <w:p>
+      <w:pPr>
+        <w:pStyle w:val="ListParagraph"/>
+        <w:numPr>
+          <w:ilvl w:val="0"/>
+          <w:numId w:val="11"/>
+        </w:numPr>
+        <w:spacing w:after="60" w:before="60"/>
+      </w:pPr>
+      <w:r>
+        <w:rPr>
+          <w:rFonts w:ascii="Arial" w:cs="Arial" w:eastAsia="Arial" w:hAnsi="Arial"/>
+          <w:sz w:val="22"/>
+          <w:szCs w:val="22"/>
+        </w:rPr>
+        <w:t xml:space="preserve">Navigate into the project folder:</w:t>
       </w:r>
     </w:p>
     <w:p>
@@ -1688,7 +2061,7 @@
           <w:sz w:val="20"/>
           <w:szCs w:val="20"/>
         </w:rPr>
-        <w:t xml:space="preserve">claude --version</w:t>
+        <w:t xml:space="preserve">cd ~/Documents/Training-Package-for-Replication</w:t>
       </w:r>
     </w:p>
     <w:p>
@@ -1713,25 +2086,20 @@
           <w:sz w:val="26"/>
           <w:szCs w:val="26"/>
         </w:rPr>
-        <w:t xml:space="preserve">5.3 — First Launch and Login</w:t>
-      </w:r>
-    </w:p>
-    <w:p>
-      <w:pPr>
-        <w:pStyle w:val="ListParagraph"/>
-        <w:numPr>
-          <w:ilvl w:val="0"/>
-          <w:numId w:val="10"/>
-        </w:numPr>
-        <w:spacing w:after="60" w:before="60"/>
-      </w:pPr>
-      <w:r>
-        <w:rPr>
-          <w:rFonts w:ascii="Arial" w:cs="Arial" w:eastAsia="Arial" w:hAnsi="Arial"/>
-          <w:sz w:val="22"/>
-          <w:szCs w:val="22"/>
-        </w:rPr>
-        <w:t xml:space="preserve">Run Claude Code for the first time:</w:t>
+        <w:t xml:space="preserve">5.2 — Clone Manually (Alternative)</w:t>
+      </w:r>
+    </w:p>
+    <w:p>
+      <w:pPr>
+        <w:spacing w:after="80" w:before="80"/>
+      </w:pPr>
+      <w:r>
+        <w:rPr>
+          <w:rFonts w:ascii="Arial" w:cs="Arial" w:eastAsia="Arial" w:hAnsi="Arial"/>
+          <w:sz w:val="22"/>
+          <w:szCs w:val="22"/>
+        </w:rPr>
+        <w:t xml:space="preserve">If you prefer to clone manually, open Terminal and run:</w:t>
       </w:r>
     </w:p>
     <w:p>
@@ -1747,43 +2115,7 @@
           <w:sz w:val="20"/>
           <w:szCs w:val="20"/>
         </w:rPr>
-        <w:t xml:space="preserve">claude</w:t>
-      </w:r>
-    </w:p>
-    <w:p>
-      <w:pPr>
-        <w:pStyle w:val="ListParagraph"/>
-        <w:numPr>
-          <w:ilvl w:val="0"/>
-          <w:numId w:val="10"/>
-        </w:numPr>
-        <w:spacing w:after="60" w:before="60"/>
-      </w:pPr>
-      <w:r>
-        <w:rPr>
-          <w:rFonts w:ascii="Arial" w:cs="Arial" w:eastAsia="Arial" w:hAnsi="Arial"/>
-          <w:sz w:val="22"/>
-          <w:szCs w:val="22"/>
-        </w:rPr>
-        <w:t xml:space="preserve">Follow the on-screen prompts to log in with your Anthropic account</w:t>
-      </w:r>
-    </w:p>
-    <w:p>
-      <w:pPr>
-        <w:pStyle w:val="ListParagraph"/>
-        <w:numPr>
-          <w:ilvl w:val="0"/>
-          <w:numId w:val="10"/>
-        </w:numPr>
-        <w:spacing w:after="60" w:before="60"/>
-      </w:pPr>
-      <w:r>
-        <w:rPr>
-          <w:rFonts w:ascii="Arial" w:cs="Arial" w:eastAsia="Arial" w:hAnsi="Arial"/>
-          <w:sz w:val="22"/>
-          <w:szCs w:val="22"/>
-        </w:rPr>
-        <w:t xml:space="preserve">Once logged in, Claude is ready to use</w:t>
+        <w:t xml:space="preserve">git clone https://github.com/easvrm/Training-Package-for-Replication.git</w:t>
       </w:r>
     </w:p>
     <w:p>
@@ -1796,6 +2128,7 @@
     </w:p>
     <w:p>
       <w:pPr>
+        <w:shd w:fill="EBF3FB" w:val="clear"/>
         <w:spacing w:after="100" w:before="100"/>
         <w:ind w:left="720"/>
       </w:pPr>
@@ -1821,7 +2154,7 @@
           <w:sz w:val="22"/>
           <w:szCs w:val="22"/>
         </w:rPr>
-        <w:t xml:space="preserve">If you don’t have an Anthropic account, you will be prompted to create one at claude.ai.</w:t>
+        <w:t xml:space="preserve">You only need to clone the repository once. After that, use git pull to get updates.</w:t>
       </w:r>
     </w:p>
     <w:p>
@@ -1843,7 +2176,7 @@
           <w:sz w:val="32"/>
           <w:szCs w:val="32"/>
         </w:rPr>
-        <w:t xml:space="preserve">Section 6 — Clone the Repository</w:t>
+        <w:t xml:space="preserve">Section 6 — Daily Workflow</w:t>
       </w:r>
     </w:p>
     <w:p>
@@ -1856,7 +2189,7 @@
           <w:sz w:val="22"/>
           <w:szCs w:val="22"/>
         </w:rPr>
-        <w:t xml:space="preserve">Cloning means downloading a copy of the project to your computer so you can work on it locally.</w:t>
+        <w:t xml:space="preserve">This is the process you will follow every time you want to make changes. You can do everything by talking to Claude in plain English — no need to memorize commands.</w:t>
       </w:r>
     </w:p>
     <w:p>
@@ -1881,43 +2214,7 @@
           <w:sz w:val="26"/>
           <w:szCs w:val="26"/>
         </w:rPr>
-        <w:t xml:space="preserve">6.1 — Clone the Project</w:t>
-      </w:r>
-    </w:p>
-    <w:p>
-      <w:pPr>
-        <w:pStyle w:val="ListParagraph"/>
-        <w:numPr>
-          <w:ilvl w:val="0"/>
-          <w:numId w:val="11"/>
-        </w:numPr>
-        <w:spacing w:after="60" w:before="60"/>
-      </w:pPr>
-      <w:r>
-        <w:rPr>
-          <w:rFonts w:ascii="Arial" w:cs="Arial" w:eastAsia="Arial" w:hAnsi="Arial"/>
-          <w:sz w:val="22"/>
-          <w:szCs w:val="22"/>
-        </w:rPr>
-        <w:t xml:space="preserve">Open Terminal (macOS) or Command Prompt (Windows)</w:t>
-      </w:r>
-    </w:p>
-    <w:p>
-      <w:pPr>
-        <w:pStyle w:val="ListParagraph"/>
-        <w:numPr>
-          <w:ilvl w:val="0"/>
-          <w:numId w:val="11"/>
-        </w:numPr>
-        <w:spacing w:after="60" w:before="60"/>
-      </w:pPr>
-      <w:r>
-        <w:rPr>
-          <w:rFonts w:ascii="Arial" w:cs="Arial" w:eastAsia="Arial" w:hAnsi="Arial"/>
-          <w:sz w:val="22"/>
-          <w:szCs w:val="22"/>
-        </w:rPr>
-        <w:t xml:space="preserve">Navigate to the folder where you want to save the project:</w:t>
+        <w:t xml:space="preserve">Step 1 — Open the Project in Claude Code</w:t>
       </w:r>
     </w:p>
     <w:p>
@@ -1933,25 +2230,7 @@
           <w:sz w:val="20"/>
           <w:szCs w:val="20"/>
         </w:rPr>
-        <w:t xml:space="preserve">cd ~/Documents</w:t>
-      </w:r>
-    </w:p>
-    <w:p>
-      <w:pPr>
-        <w:pStyle w:val="ListParagraph"/>
-        <w:numPr>
-          <w:ilvl w:val="0"/>
-          <w:numId w:val="11"/>
-        </w:numPr>
-        <w:spacing w:after="60" w:before="60"/>
-      </w:pPr>
-      <w:r>
-        <w:rPr>
-          <w:rFonts w:ascii="Arial" w:cs="Arial" w:eastAsia="Arial" w:hAnsi="Arial"/>
-          <w:sz w:val="22"/>
-          <w:szCs w:val="22"/>
-        </w:rPr>
-        <w:t xml:space="preserve">Clone the repository:</w:t>
+        <w:t xml:space="preserve">cd ~/Documents/Training-Package-for-Replication</w:t>
       </w:r>
     </w:p>
     <w:p>
@@ -1967,25 +2246,84 @@
           <w:sz w:val="20"/>
           <w:szCs w:val="20"/>
         </w:rPr>
-        <w:t xml:space="preserve">git clone https://github.com/easvrm/Training-Package-for-Replication.git</w:t>
-      </w:r>
-    </w:p>
-    <w:p>
-      <w:pPr>
-        <w:pStyle w:val="ListParagraph"/>
-        <w:numPr>
-          <w:ilvl w:val="0"/>
-          <w:numId w:val="11"/>
-        </w:numPr>
-        <w:spacing w:after="60" w:before="60"/>
-      </w:pPr>
-      <w:r>
-        <w:rPr>
-          <w:rFonts w:ascii="Arial" w:cs="Arial" w:eastAsia="Arial" w:hAnsi="Arial"/>
-          <w:sz w:val="22"/>
-          <w:szCs w:val="22"/>
-        </w:rPr>
-        <w:t xml:space="preserve">Enter the project folder:</w:t>
+        <w:t xml:space="preserve">claude</w:t>
+      </w:r>
+    </w:p>
+    <w:p>
+      <w:pPr>
+        <w:spacing w:after="0" w:before="80"/>
+      </w:pPr>
+      <w:r>
+        <w:t xml:space="preserve"/>
+      </w:r>
+    </w:p>
+    <w:p>
+      <w:pPr>
+        <w:shd w:fill="EAF7EA" w:val="clear"/>
+        <w:spacing w:after="100" w:before="100"/>
+        <w:ind w:left="720"/>
+      </w:pPr>
+      <w:r>
+        <w:rPr>
+          <w:rFonts w:ascii="Arial" w:cs="Arial" w:eastAsia="Arial" w:hAnsi="Arial"/>
+          <w:b/>
+          <w:bCs/>
+          <w:i/>
+          <w:iCs/>
+          <w:color w:val="276221"/>
+          <w:sz w:val="22"/>
+          <w:szCs w:val="22"/>
+        </w:rPr>
+        <w:t xml:space="preserve">Tip: </w:t>
+      </w:r>
+      <w:r>
+        <w:rPr>
+          <w:rFonts w:ascii="Arial" w:cs="Arial" w:eastAsia="Arial" w:hAnsi="Arial"/>
+          <w:i/>
+          <w:iCs/>
+          <w:color w:val="444444"/>
+          <w:sz w:val="22"/>
+          <w:szCs w:val="22"/>
+        </w:rPr>
+        <w:t xml:space="preserve">You can also ask Claude via the web connector at claude.ai if you prefer not to use the terminal.</w:t>
+      </w:r>
+    </w:p>
+    <w:p>
+      <w:pPr>
+        <w:spacing w:after="0" w:before="120"/>
+      </w:pPr>
+      <w:r>
+        <w:t xml:space="preserve"/>
+      </w:r>
+    </w:p>
+    <w:p>
+      <w:pPr>
+        <w:pStyle w:val="Heading2"/>
+        <w:spacing w:after="140" w:before="280"/>
+      </w:pPr>
+      <w:r>
+        <w:rPr>
+          <w:rFonts w:ascii="Arial" w:cs="Arial" w:eastAsia="Arial" w:hAnsi="Arial"/>
+          <w:b/>
+          <w:bCs/>
+          <w:color w:val="1F4E79"/>
+          <w:sz w:val="26"/>
+          <w:szCs w:val="26"/>
+        </w:rPr>
+        <w:t xml:space="preserve">Step 2 — Pull the Latest Version</w:t>
+      </w:r>
+    </w:p>
+    <w:p>
+      <w:pPr>
+        <w:spacing w:after="80" w:before="80"/>
+      </w:pPr>
+      <w:r>
+        <w:rPr>
+          <w:rFonts w:ascii="Arial" w:cs="Arial" w:eastAsia="Arial" w:hAnsi="Arial"/>
+          <w:sz w:val="22"/>
+          <w:szCs w:val="22"/>
+        </w:rPr>
+        <w:t xml:space="preserve">Always start by asking Claude to get the latest changes:</w:t>
       </w:r>
     </w:p>
     <w:p>
@@ -2001,25 +2339,20 @@
           <w:sz w:val="20"/>
           <w:szCs w:val="20"/>
         </w:rPr>
-        <w:t xml:space="preserve">cd Training-Package-for-Replication</w:t>
-      </w:r>
-    </w:p>
-    <w:p>
-      <w:pPr>
-        <w:pStyle w:val="ListParagraph"/>
-        <w:numPr>
-          <w:ilvl w:val="0"/>
-          <w:numId w:val="11"/>
-        </w:numPr>
-        <w:spacing w:after="60" w:before="60"/>
-      </w:pPr>
-      <w:r>
-        <w:rPr>
-          <w:rFonts w:ascii="Arial" w:cs="Arial" w:eastAsia="Arial" w:hAnsi="Arial"/>
-          <w:sz w:val="22"/>
-          <w:szCs w:val="22"/>
-        </w:rPr>
-        <w:t xml:space="preserve">Verify the contents were downloaded:</w:t>
+        <w:t xml:space="preserve">Pull the latest version of the project from GitHub</w:t>
+      </w:r>
+    </w:p>
+    <w:p>
+      <w:pPr>
+        <w:spacing w:after="80" w:before="80"/>
+      </w:pPr>
+      <w:r>
+        <w:rPr>
+          <w:rFonts w:ascii="Arial" w:cs="Arial" w:eastAsia="Arial" w:hAnsi="Arial"/>
+          <w:sz w:val="22"/>
+          <w:szCs w:val="22"/>
+        </w:rPr>
+        <w:t xml:space="preserve">Or run directly:</w:t>
       </w:r>
     </w:p>
     <w:p>
@@ -2035,7 +2368,7 @@
           <w:sz w:val="20"/>
           <w:szCs w:val="20"/>
         </w:rPr>
-        <w:t xml:space="preserve">ls</w:t>
+        <w:t xml:space="preserve">git pull origin master</w:t>
       </w:r>
     </w:p>
     <w:p>
@@ -2048,27 +2381,7 @@
     </w:p>
     <w:p>
       <w:pPr>
-        <w:spacing w:after="80" w:before="80"/>
-      </w:pPr>
-      <w:r>
-        <w:rPr>
-          <w:rFonts w:ascii="Arial" w:cs="Arial" w:eastAsia="Arial" w:hAnsi="Arial"/>
-          <w:sz w:val="22"/>
-          <w:szCs w:val="22"/>
-        </w:rPr>
-        <w:t xml:space="preserve">You should see the project files listed in your terminal.</w:t>
-      </w:r>
-    </w:p>
-    <w:p>
-      <w:pPr>
-        <w:spacing w:after="0" w:before="100"/>
-      </w:pPr>
-      <w:r>
-        <w:t xml:space="preserve"/>
-      </w:r>
-    </w:p>
-    <w:p>
-      <w:pPr>
+        <w:shd w:fill="EBF3FB" w:val="clear"/>
         <w:spacing w:after="100" w:before="100"/>
         <w:ind w:left="720"/>
       </w:pPr>
@@ -2094,47 +2407,12 @@
           <w:sz w:val="22"/>
           <w:szCs w:val="22"/>
         </w:rPr>
-        <w:t xml:space="preserve">You only need to clone the repository once. After that, you use git pull to get updates (see Section 7).</w:t>
-      </w:r>
-    </w:p>
-    <w:p>
-      <w:r>
-        <w:br w:type="page"/>
-      </w:r>
-    </w:p>
-    <w:p>
-      <w:pPr>
-        <w:pStyle w:val="Heading1"/>
-        <w:spacing w:after="200" w:before="400"/>
-      </w:pPr>
-      <w:r>
-        <w:rPr>
-          <w:rFonts w:ascii="Arial" w:cs="Arial" w:eastAsia="Arial" w:hAnsi="Arial"/>
-          <w:b/>
-          <w:bCs/>
-          <w:color w:val="FFFFFF"/>
-          <w:sz w:val="32"/>
-          <w:szCs w:val="32"/>
-        </w:rPr>
-        <w:t xml:space="preserve">Section 7 — Daily Workflow</w:t>
-      </w:r>
-    </w:p>
-    <w:p>
-      <w:pPr>
-        <w:spacing w:after="80" w:before="80"/>
-      </w:pPr>
-      <w:r>
-        <w:rPr>
-          <w:rFonts w:ascii="Arial" w:cs="Arial" w:eastAsia="Arial" w:hAnsi="Arial"/>
-          <w:sz w:val="22"/>
-          <w:szCs w:val="22"/>
-        </w:rPr>
-        <w:t xml:space="preserve">This is the process you will follow every time you want to make changes to the project. Follow these steps in order every time.</w:t>
-      </w:r>
-    </w:p>
-    <w:p>
-      <w:pPr>
-        <w:spacing w:after="0" w:before="100"/>
+        <w:t xml:space="preserve">Never skip this step. It ensures you have the most up-to-date version before making changes.</w:t>
+      </w:r>
+    </w:p>
+    <w:p>
+      <w:pPr>
+        <w:spacing w:after="0" w:before="120"/>
       </w:pPr>
       <w:r>
         <w:t xml:space="preserve"/>
@@ -2154,7 +2432,7 @@
           <w:sz w:val="26"/>
           <w:szCs w:val="26"/>
         </w:rPr>
-        <w:t xml:space="preserve">Step 1 — Open the Project in Claude Code</w:t>
+        <w:t xml:space="preserve">Step 3 — Create Your Working Branch</w:t>
       </w:r>
     </w:p>
     <w:p>
@@ -2167,7 +2445,7 @@
           <w:sz w:val="22"/>
           <w:szCs w:val="22"/>
         </w:rPr>
-        <w:t xml:space="preserve">Navigate to the project folder and launch Claude:</w:t>
+        <w:t xml:space="preserve">Ask Claude to create a branch for your work:</w:t>
       </w:r>
     </w:p>
     <w:p>
@@ -2183,7 +2461,20 @@
           <w:sz w:val="20"/>
           <w:szCs w:val="20"/>
         </w:rPr>
-        <w:t xml:space="preserve">cd ~/Documents/Training-Package-for-Replication</w:t>
+        <w:t xml:space="preserve">Create a new branch called feature/your-name-topic</w:t>
+      </w:r>
+    </w:p>
+    <w:p>
+      <w:pPr>
+        <w:spacing w:after="80" w:before="80"/>
+      </w:pPr>
+      <w:r>
+        <w:rPr>
+          <w:rFonts w:ascii="Arial" w:cs="Arial" w:eastAsia="Arial" w:hAnsi="Arial"/>
+          <w:sz w:val="22"/>
+          <w:szCs w:val="22"/>
+        </w:rPr>
+        <w:t xml:space="preserve">Example:</w:t>
       </w:r>
     </w:p>
     <w:p>
@@ -2199,12 +2490,12 @@
           <w:sz w:val="20"/>
           <w:szCs w:val="20"/>
         </w:rPr>
-        <w:t xml:space="preserve">claude</w:t>
-      </w:r>
-    </w:p>
-    <w:p>
-      <w:pPr>
-        <w:spacing w:after="0" w:before="60"/>
+        <w:t xml:space="preserve">Create a new branch called feature/alice-module2-update</w:t>
+      </w:r>
+    </w:p>
+    <w:p>
+      <w:pPr>
+        <w:spacing w:after="0" w:before="80"/>
       </w:pPr>
       <w:r>
         <w:t xml:space="preserve"/>
@@ -2220,45 +2511,7 @@
           <w:sz w:val="22"/>
           <w:szCs w:val="22"/>
         </w:rPr>
-        <w:t xml:space="preserve">You are now in Claude Code and can start asking Claude for help.</w:t>
-      </w:r>
-    </w:p>
-    <w:p>
-      <w:pPr>
-        <w:spacing w:after="0" w:before="120"/>
-      </w:pPr>
-      <w:r>
-        <w:t xml:space="preserve"/>
-      </w:r>
-    </w:p>
-    <w:p>
-      <w:pPr>
-        <w:pStyle w:val="Heading2"/>
-        <w:spacing w:after="140" w:before="280"/>
-      </w:pPr>
-      <w:r>
-        <w:rPr>
-          <w:rFonts w:ascii="Arial" w:cs="Arial" w:eastAsia="Arial" w:hAnsi="Arial"/>
-          <w:b/>
-          <w:bCs/>
-          <w:color w:val="1F4E79"/>
-          <w:sz w:val="26"/>
-          <w:szCs w:val="26"/>
-        </w:rPr>
-        <w:t xml:space="preserve">Step 2 — Always Pull the Latest Version First</w:t>
-      </w:r>
-    </w:p>
-    <w:p>
-      <w:pPr>
-        <w:spacing w:after="80" w:before="80"/>
-      </w:pPr>
-      <w:r>
-        <w:rPr>
-          <w:rFonts w:ascii="Arial" w:cs="Arial" w:eastAsia="Arial" w:hAnsi="Arial"/>
-          <w:sz w:val="22"/>
-          <w:szCs w:val="22"/>
-        </w:rPr>
-        <w:t xml:space="preserve">Before making any changes, always download the latest version to avoid conflicts:</w:t>
+        <w:t xml:space="preserve">Or run directly:</w:t>
       </w:r>
     </w:p>
     <w:p>
@@ -2274,45 +2527,7 @@
           <w:sz w:val="20"/>
           <w:szCs w:val="20"/>
         </w:rPr>
-        <w:t xml:space="preserve">git pull origin master</w:t>
-      </w:r>
-    </w:p>
-    <w:p>
-      <w:pPr>
-        <w:spacing w:after="0" w:before="60"/>
-      </w:pPr>
-      <w:r>
-        <w:t xml:space="preserve"/>
-      </w:r>
-    </w:p>
-    <w:p>
-      <w:pPr>
-        <w:spacing w:after="100" w:before="100"/>
-        <w:ind w:left="720"/>
-      </w:pPr>
-      <w:r>
-        <w:rPr>
-          <w:rFonts w:ascii="Arial" w:cs="Arial" w:eastAsia="Arial" w:hAnsi="Arial"/>
-          <w:b/>
-          <w:bCs/>
-          <w:i/>
-          <w:iCs/>
-          <w:color w:val="1F4E79"/>
-          <w:sz w:val="22"/>
-          <w:szCs w:val="22"/>
-        </w:rPr>
-        <w:t xml:space="preserve">Note: </w:t>
-      </w:r>
-      <w:r>
-        <w:rPr>
-          <w:rFonts w:ascii="Arial" w:cs="Arial" w:eastAsia="Arial" w:hAnsi="Arial"/>
-          <w:i/>
-          <w:iCs/>
-          <w:color w:val="444444"/>
-          <w:sz w:val="22"/>
-          <w:szCs w:val="22"/>
-        </w:rPr>
-        <w:t xml:space="preserve">Never skip this step. If someone else made changes since you last worked, this ensures you have their updates.</w:t>
+        <w:t xml:space="preserve">git checkout -b feature/your-name-topic</w:t>
       </w:r>
     </w:p>
     <w:p>
@@ -2337,7 +2552,7 @@
           <w:sz w:val="26"/>
           <w:szCs w:val="26"/>
         </w:rPr>
-        <w:t xml:space="preserve">Step 3 — Create Your Working Branch</w:t>
+        <w:t xml:space="preserve">Step 4 — Make Your Changes Using Claude</w:t>
       </w:r>
     </w:p>
     <w:p>
@@ -2350,7 +2565,128 @@
           <w:sz w:val="22"/>
           <w:szCs w:val="22"/>
         </w:rPr>
-        <w:t xml:space="preserve">A branch is your own personal workspace. It lets you make changes without affecting the main project until your work is reviewed.</w:t>
+        <w:t xml:space="preserve">Ask Claude for help in plain English. For example:</w:t>
+      </w:r>
+    </w:p>
+    <w:p>
+      <w:pPr>
+        <w:spacing w:after="0" w:before="60"/>
+      </w:pPr>
+      <w:r>
+        <w:t xml:space="preserve"/>
+      </w:r>
+    </w:p>
+    <w:p>
+      <w:pPr>
+        <w:pStyle w:val="ListParagraph"/>
+        <w:numPr>
+          <w:ilvl w:val="0"/>
+          <w:numId w:val="2"/>
+        </w:numPr>
+        <w:spacing w:after="60" w:before="60"/>
+      </w:pPr>
+      <w:r>
+        <w:rPr>
+          <w:rFonts w:ascii="Arial" w:cs="Arial" w:eastAsia="Arial" w:hAnsi="Arial"/>
+          <w:sz w:val="22"/>
+          <w:szCs w:val="22"/>
+        </w:rPr>
+        <w:t xml:space="preserve">"Update the introduction text in songa-docs.html to mention the new module"</w:t>
+      </w:r>
+    </w:p>
+    <w:p>
+      <w:pPr>
+        <w:pStyle w:val="ListParagraph"/>
+        <w:numPr>
+          <w:ilvl w:val="0"/>
+          <w:numId w:val="2"/>
+        </w:numPr>
+        <w:spacing w:after="60" w:before="60"/>
+      </w:pPr>
+      <w:r>
+        <w:rPr>
+          <w:rFonts w:ascii="Arial" w:cs="Arial" w:eastAsia="Arial" w:hAnsi="Arial"/>
+          <w:sz w:val="22"/>
+          <w:szCs w:val="22"/>
+        </w:rPr>
+        <w:t xml:space="preserve">"Fix the broken image reference on page 5"</w:t>
+      </w:r>
+    </w:p>
+    <w:p>
+      <w:pPr>
+        <w:pStyle w:val="ListParagraph"/>
+        <w:numPr>
+          <w:ilvl w:val="0"/>
+          <w:numId w:val="2"/>
+        </w:numPr>
+        <w:spacing w:after="60" w:before="60"/>
+      </w:pPr>
+      <w:r>
+        <w:rPr>
+          <w:rFonts w:ascii="Arial" w:cs="Arial" w:eastAsia="Arial" w:hAnsi="Arial"/>
+          <w:sz w:val="22"/>
+          <w:szCs w:val="22"/>
+        </w:rPr>
+        <w:t xml:space="preserve">"Add a new section about field data collection after the overview"</w:t>
+      </w:r>
+    </w:p>
+    <w:p>
+      <w:pPr>
+        <w:spacing w:after="0" w:before="60"/>
+      </w:pPr>
+      <w:r>
+        <w:t xml:space="preserve"/>
+      </w:r>
+    </w:p>
+    <w:p>
+      <w:pPr>
+        <w:spacing w:after="80" w:before="80"/>
+      </w:pPr>
+      <w:r>
+        <w:rPr>
+          <w:rFonts w:ascii="Arial" w:cs="Arial" w:eastAsia="Arial" w:hAnsi="Arial"/>
+          <w:sz w:val="22"/>
+          <w:szCs w:val="22"/>
+        </w:rPr>
+        <w:t xml:space="preserve">Claude will read the files, suggest changes, and apply them for you. Review the changes before moving to the next step.</w:t>
+      </w:r>
+    </w:p>
+    <w:p>
+      <w:pPr>
+        <w:spacing w:after="0" w:before="120"/>
+      </w:pPr>
+      <w:r>
+        <w:t xml:space="preserve"/>
+      </w:r>
+    </w:p>
+    <w:p>
+      <w:pPr>
+        <w:pStyle w:val="Heading2"/>
+        <w:spacing w:after="140" w:before="280"/>
+      </w:pPr>
+      <w:r>
+        <w:rPr>
+          <w:rFonts w:ascii="Arial" w:cs="Arial" w:eastAsia="Arial" w:hAnsi="Arial"/>
+          <w:b/>
+          <w:bCs/>
+          <w:color w:val="1F4E79"/>
+          <w:sz w:val="26"/>
+          <w:szCs w:val="26"/>
+        </w:rPr>
+        <w:t xml:space="preserve">Step 5 — Commit Your Changes</w:t>
+      </w:r>
+    </w:p>
+    <w:p>
+      <w:pPr>
+        <w:spacing w:after="80" w:before="80"/>
+      </w:pPr>
+      <w:r>
+        <w:rPr>
+          <w:rFonts w:ascii="Arial" w:cs="Arial" w:eastAsia="Arial" w:hAnsi="Arial"/>
+          <w:sz w:val="22"/>
+          <w:szCs w:val="22"/>
+        </w:rPr>
+        <w:t xml:space="preserve">Ask Claude to save your work:</w:t>
       </w:r>
     </w:p>
     <w:p>
@@ -2366,15 +2702,7 @@
           <w:sz w:val="20"/>
           <w:szCs w:val="20"/>
         </w:rPr>
-        <w:t xml:space="preserve">git checkout -b feature/your-name-topic</w:t>
-      </w:r>
-    </w:p>
-    <w:p>
-      <w:pPr>
-        <w:spacing w:after="0" w:before="60"/>
-      </w:pPr>
-      <w:r>
-        <w:t xml:space="preserve"/>
+        <w:t xml:space="preserve">Commit my changes with the message: Add facilitator notes to Module 3</w:t>
       </w:r>
     </w:p>
     <w:p>
@@ -2387,7 +2715,7 @@
           <w:sz w:val="22"/>
           <w:szCs w:val="22"/>
         </w:rPr>
-        <w:t xml:space="preserve">Replace your-name-topic with something descriptive. Examples:</w:t>
+        <w:t xml:space="preserve">Or run directly:</w:t>
       </w:r>
     </w:p>
     <w:p>
@@ -2403,7 +2731,7 @@
           <w:sz w:val="20"/>
           <w:szCs w:val="20"/>
         </w:rPr>
-        <w:t xml:space="preserve">git checkout -b feature/alice-module2-update</w:t>
+        <w:t xml:space="preserve">git add .</w:t>
       </w:r>
     </w:p>
     <w:p>
@@ -2419,7 +2747,7 @@
           <w:sz w:val="20"/>
           <w:szCs w:val="20"/>
         </w:rPr>
-        <w:t xml:space="preserve">git checkout -b feature/bob-fix-broken-link</w:t>
+        <w:t xml:space="preserve">git commit -m "Brief description of your change"</w:t>
       </w:r>
     </w:p>
     <w:p>
@@ -2444,7 +2772,7 @@
           <w:sz w:val="26"/>
           <w:szCs w:val="26"/>
         </w:rPr>
-        <w:t xml:space="preserve">Step 4 — Make Your Changes Using Claude</w:t>
+        <w:t xml:space="preserve">Step 6 — Push Your Branch to GitHub</w:t>
       </w:r>
     </w:p>
     <w:p>
@@ -2457,128 +2785,7 @@
           <w:sz w:val="22"/>
           <w:szCs w:val="22"/>
         </w:rPr>
-        <w:t xml:space="preserve">Inside Claude Code, you can ask Claude for help in plain English. For example:</w:t>
-      </w:r>
-    </w:p>
-    <w:p>
-      <w:pPr>
-        <w:spacing w:after="0" w:before="60"/>
-      </w:pPr>
-      <w:r>
-        <w:t xml:space="preserve"/>
-      </w:r>
-    </w:p>
-    <w:p>
-      <w:pPr>
-        <w:pStyle w:val="ListParagraph"/>
-        <w:numPr>
-          <w:ilvl w:val="0"/>
-          <w:numId w:val="2"/>
-        </w:numPr>
-        <w:spacing w:after="60" w:before="60"/>
-      </w:pPr>
-      <w:r>
-        <w:rPr>
-          <w:rFonts w:ascii="Arial" w:cs="Arial" w:eastAsia="Arial" w:hAnsi="Arial"/>
-          <w:sz w:val="22"/>
-          <w:szCs w:val="22"/>
-        </w:rPr>
-        <w:t xml:space="preserve">"Update the introduction text in songa-docs.html to mention the new module"</w:t>
-      </w:r>
-    </w:p>
-    <w:p>
-      <w:pPr>
-        <w:pStyle w:val="ListParagraph"/>
-        <w:numPr>
-          <w:ilvl w:val="0"/>
-          <w:numId w:val="2"/>
-        </w:numPr>
-        <w:spacing w:after="60" w:before="60"/>
-      </w:pPr>
-      <w:r>
-        <w:rPr>
-          <w:rFonts w:ascii="Arial" w:cs="Arial" w:eastAsia="Arial" w:hAnsi="Arial"/>
-          <w:sz w:val="22"/>
-          <w:szCs w:val="22"/>
-        </w:rPr>
-        <w:t xml:space="preserve">"Fix the broken image reference on page 5"</w:t>
-      </w:r>
-    </w:p>
-    <w:p>
-      <w:pPr>
-        <w:pStyle w:val="ListParagraph"/>
-        <w:numPr>
-          <w:ilvl w:val="0"/>
-          <w:numId w:val="2"/>
-        </w:numPr>
-        <w:spacing w:after="60" w:before="60"/>
-      </w:pPr>
-      <w:r>
-        <w:rPr>
-          <w:rFonts w:ascii="Arial" w:cs="Arial" w:eastAsia="Arial" w:hAnsi="Arial"/>
-          <w:sz w:val="22"/>
-          <w:szCs w:val="22"/>
-        </w:rPr>
-        <w:t xml:space="preserve">"Add a new section about field data collection"</w:t>
-      </w:r>
-    </w:p>
-    <w:p>
-      <w:pPr>
-        <w:spacing w:after="0" w:before="60"/>
-      </w:pPr>
-      <w:r>
-        <w:t xml:space="preserve"/>
-      </w:r>
-    </w:p>
-    <w:p>
-      <w:pPr>
-        <w:spacing w:after="80" w:before="80"/>
-      </w:pPr>
-      <w:r>
-        <w:rPr>
-          <w:rFonts w:ascii="Arial" w:cs="Arial" w:eastAsia="Arial" w:hAnsi="Arial"/>
-          <w:sz w:val="22"/>
-          <w:szCs w:val="22"/>
-        </w:rPr>
-        <w:t xml:space="preserve">Claude will read the files, suggest changes, and apply them for you.</w:t>
-      </w:r>
-    </w:p>
-    <w:p>
-      <w:pPr>
-        <w:spacing w:after="0" w:before="120"/>
-      </w:pPr>
-      <w:r>
-        <w:t xml:space="preserve"/>
-      </w:r>
-    </w:p>
-    <w:p>
-      <w:pPr>
-        <w:pStyle w:val="Heading2"/>
-        <w:spacing w:after="140" w:before="280"/>
-      </w:pPr>
-      <w:r>
-        <w:rPr>
-          <w:rFonts w:ascii="Arial" w:cs="Arial" w:eastAsia="Arial" w:hAnsi="Arial"/>
-          <w:b/>
-          <w:bCs/>
-          <w:color w:val="1F4E79"/>
-          <w:sz w:val="26"/>
-          <w:szCs w:val="26"/>
-        </w:rPr>
-        <w:t xml:space="preserve">Step 5 — Stage and Commit Your Changes</w:t>
-      </w:r>
-    </w:p>
-    <w:p>
-      <w:pPr>
-        <w:spacing w:after="80" w:before="80"/>
-      </w:pPr>
-      <w:r>
-        <w:rPr>
-          <w:rFonts w:ascii="Arial" w:cs="Arial" w:eastAsia="Arial" w:hAnsi="Arial"/>
-          <w:sz w:val="22"/>
-          <w:szCs w:val="22"/>
-        </w:rPr>
-        <w:t xml:space="preserve">When you are happy with your changes, save them to Git:</w:t>
+        <w:t xml:space="preserve">Ask Claude to upload your branch:</w:t>
       </w:r>
     </w:p>
     <w:p>
@@ -2594,7 +2801,20 @@
           <w:sz w:val="20"/>
           <w:szCs w:val="20"/>
         </w:rPr>
-        <w:t xml:space="preserve">git add .</w:t>
+        <w:t xml:space="preserve">Push my branch to GitHub</w:t>
+      </w:r>
+    </w:p>
+    <w:p>
+      <w:pPr>
+        <w:spacing w:after="80" w:before="80"/>
+      </w:pPr>
+      <w:r>
+        <w:rPr>
+          <w:rFonts w:ascii="Arial" w:cs="Arial" w:eastAsia="Arial" w:hAnsi="Arial"/>
+          <w:sz w:val="22"/>
+          <w:szCs w:val="22"/>
+        </w:rPr>
+        <w:t xml:space="preserve">Or run directly:</w:t>
       </w:r>
     </w:p>
     <w:p>
@@ -2610,15 +2830,32 @@
           <w:sz w:val="20"/>
           <w:szCs w:val="20"/>
         </w:rPr>
-        <w:t xml:space="preserve">git commit -m "Brief description of your change"</w:t>
-      </w:r>
-    </w:p>
-    <w:p>
-      <w:pPr>
-        <w:spacing w:after="0" w:before="60"/>
-      </w:pPr>
-      <w:r>
-        <w:t xml:space="preserve"/>
+        <w:t xml:space="preserve">git push origin feature/your-name-topic</w:t>
+      </w:r>
+    </w:p>
+    <w:p>
+      <w:pPr>
+        <w:spacing w:after="0" w:before="120"/>
+      </w:pPr>
+      <w:r>
+        <w:t xml:space="preserve"/>
+      </w:r>
+    </w:p>
+    <w:p>
+      <w:pPr>
+        <w:pStyle w:val="Heading2"/>
+        <w:spacing w:after="140" w:before="280"/>
+      </w:pPr>
+      <w:r>
+        <w:rPr>
+          <w:rFonts w:ascii="Arial" w:cs="Arial" w:eastAsia="Arial" w:hAnsi="Arial"/>
+          <w:b/>
+          <w:bCs/>
+          <w:color w:val="1F4E79"/>
+          <w:sz w:val="26"/>
+          <w:szCs w:val="26"/>
+        </w:rPr>
+        <w:t xml:space="preserve">Step 7 — Open a Pull Request</w:t>
       </w:r>
     </w:p>
     <w:p>
@@ -2631,7 +2868,7 @@
           <w:sz w:val="22"/>
           <w:szCs w:val="22"/>
         </w:rPr>
-        <w:t xml:space="preserve">Examples of good commit messages:</w:t>
+        <w:t xml:space="preserve">Ask Claude to create a Pull Request for review:</w:t>
       </w:r>
     </w:p>
     <w:p>
@@ -2647,39 +2884,28 @@
           <w:sz w:val="20"/>
           <w:szCs w:val="20"/>
         </w:rPr>
-        <w:t xml:space="preserve">"Add facilitator notes to Module 3"</w:t>
-      </w:r>
-    </w:p>
-    <w:p>
-      <w:pPr>
-        <w:shd w:fill="F0F0F0" w:val="clear"/>
-        <w:spacing w:after="60" w:before="60"/>
-        <w:ind w:left="720"/>
-      </w:pPr>
-      <w:r>
-        <w:rPr>
-          <w:rFonts w:ascii="Courier New" w:cs="Courier New" w:eastAsia="Courier New" w:hAnsi="Courier New"/>
-          <w:color w:val="333333"/>
-          <w:sz w:val="20"/>
-          <w:szCs w:val="20"/>
-        </w:rPr>
-        <w:t xml:space="preserve">"Fix broken image on page 12"</w:t>
-      </w:r>
-    </w:p>
-    <w:p>
-      <w:pPr>
-        <w:shd w:fill="F0F0F0" w:val="clear"/>
-        <w:spacing w:after="60" w:before="60"/>
-        <w:ind w:left="720"/>
-      </w:pPr>
-      <w:r>
-        <w:rPr>
-          <w:rFonts w:ascii="Courier New" w:cs="Courier New" w:eastAsia="Courier New" w:hAnsi="Courier New"/>
-          <w:color w:val="333333"/>
-          <w:sz w:val="20"/>
-          <w:szCs w:val="20"/>
-        </w:rPr>
-        <w:t xml:space="preserve">"Update contact information in footer"</w:t>
+        <w:t xml:space="preserve">Open a pull request titled "Add Module 3 facilitator notes" with a short description of what I changed</w:t>
+      </w:r>
+    </w:p>
+    <w:p>
+      <w:pPr>
+        <w:spacing w:after="0" w:before="60"/>
+      </w:pPr>
+      <w:r>
+        <w:t xml:space="preserve"/>
+      </w:r>
+    </w:p>
+    <w:p>
+      <w:pPr>
+        <w:spacing w:after="80" w:before="80"/>
+      </w:pPr>
+      <w:r>
+        <w:rPr>
+          <w:rFonts w:ascii="Arial" w:cs="Arial" w:eastAsia="Arial" w:hAnsi="Arial"/>
+          <w:sz w:val="22"/>
+          <w:szCs w:val="22"/>
+        </w:rPr>
+        <w:t xml:space="preserve">Claude will use the GitHub connector to create the PR on your behalf.</w:t>
       </w:r>
     </w:p>
     <w:p>
@@ -2704,7 +2930,7 @@
           <w:sz w:val="26"/>
           <w:szCs w:val="26"/>
         </w:rPr>
-        <w:t xml:space="preserve">Step 6 — Push Your Branch to GitHub</w:t>
+        <w:t xml:space="preserve">Step 8 — Wait for Review</w:t>
       </w:r>
     </w:p>
     <w:p>
@@ -2717,23 +2943,7 @@
           <w:sz w:val="22"/>
           <w:szCs w:val="22"/>
         </w:rPr>
-        <w:t xml:space="preserve">Upload your branch to GitHub so it can be reviewed:</w:t>
-      </w:r>
-    </w:p>
-    <w:p>
-      <w:pPr>
-        <w:shd w:fill="F0F0F0" w:val="clear"/>
-        <w:spacing w:after="60" w:before="60"/>
-        <w:ind w:left="720"/>
-      </w:pPr>
-      <w:r>
-        <w:rPr>
-          <w:rFonts w:ascii="Courier New" w:cs="Courier New" w:eastAsia="Courier New" w:hAnsi="Courier New"/>
-          <w:color w:val="333333"/>
-          <w:sz w:val="20"/>
-          <w:szCs w:val="20"/>
-        </w:rPr>
-        <w:t xml:space="preserve">git push origin feature/your-name-topic</w:t>
+        <w:t xml:space="preserve">The admin will receive a notification and review your Pull Request. They may:</w:t>
       </w:r>
     </w:p>
     <w:p>
@@ -2746,6 +2956,68 @@
     </w:p>
     <w:p>
       <w:pPr>
+        <w:pStyle w:val="ListParagraph"/>
+        <w:numPr>
+          <w:ilvl w:val="0"/>
+          <w:numId w:val="2"/>
+        </w:numPr>
+        <w:spacing w:after="60" w:before="60"/>
+      </w:pPr>
+      <w:r>
+        <w:rPr>
+          <w:rFonts w:ascii="Arial" w:cs="Arial" w:eastAsia="Arial" w:hAnsi="Arial"/>
+          <w:sz w:val="22"/>
+          <w:szCs w:val="22"/>
+        </w:rPr>
+        <w:t xml:space="preserve">Approve and merge your changes into the main project</w:t>
+      </w:r>
+    </w:p>
+    <w:p>
+      <w:pPr>
+        <w:pStyle w:val="ListParagraph"/>
+        <w:numPr>
+          <w:ilvl w:val="0"/>
+          <w:numId w:val="2"/>
+        </w:numPr>
+        <w:spacing w:after="60" w:before="60"/>
+      </w:pPr>
+      <w:r>
+        <w:rPr>
+          <w:rFonts w:ascii="Arial" w:cs="Arial" w:eastAsia="Arial" w:hAnsi="Arial"/>
+          <w:sz w:val="22"/>
+          <w:szCs w:val="22"/>
+        </w:rPr>
+        <w:t xml:space="preserve">Leave comments asking for adjustments</w:t>
+      </w:r>
+    </w:p>
+    <w:p>
+      <w:pPr>
+        <w:pStyle w:val="ListParagraph"/>
+        <w:numPr>
+          <w:ilvl w:val="0"/>
+          <w:numId w:val="2"/>
+        </w:numPr>
+        <w:spacing w:after="60" w:before="60"/>
+      </w:pPr>
+      <w:r>
+        <w:rPr>
+          <w:rFonts w:ascii="Arial" w:cs="Arial" w:eastAsia="Arial" w:hAnsi="Arial"/>
+          <w:sz w:val="22"/>
+          <w:szCs w:val="22"/>
+        </w:rPr>
+        <w:t xml:space="preserve">Request changes before merging</w:t>
+      </w:r>
+    </w:p>
+    <w:p>
+      <w:pPr>
+        <w:spacing w:after="0" w:before="60"/>
+      </w:pPr>
+      <w:r>
+        <w:t xml:space="preserve"/>
+      </w:r>
+    </w:p>
+    <w:p>
+      <w:pPr>
         <w:spacing w:after="80" w:before="80"/>
       </w:pPr>
       <w:r>
@@ -2754,219 +3026,7 @@
           <w:sz w:val="22"/>
           <w:szCs w:val="22"/>
         </w:rPr>
-        <w:t xml:space="preserve">Replace feature/your-name-topic with the actual name of your branch.</w:t>
-      </w:r>
-    </w:p>
-    <w:p>
-      <w:pPr>
-        <w:spacing w:after="0" w:before="120"/>
-      </w:pPr>
-      <w:r>
-        <w:t xml:space="preserve"/>
-      </w:r>
-    </w:p>
-    <w:p>
-      <w:pPr>
-        <w:pStyle w:val="Heading2"/>
-        <w:spacing w:after="140" w:before="280"/>
-      </w:pPr>
-      <w:r>
-        <w:rPr>
-          <w:rFonts w:ascii="Arial" w:cs="Arial" w:eastAsia="Arial" w:hAnsi="Arial"/>
-          <w:b/>
-          <w:bCs/>
-          <w:color w:val="1F4E79"/>
-          <w:sz w:val="26"/>
-          <w:szCs w:val="26"/>
-        </w:rPr>
-        <w:t xml:space="preserve">Step 7 — Open a Pull Request</w:t>
-      </w:r>
-    </w:p>
-    <w:p>
-      <w:pPr>
-        <w:spacing w:after="80" w:before="80"/>
-      </w:pPr>
-      <w:r>
-        <w:rPr>
-          <w:rFonts w:ascii="Arial" w:cs="Arial" w:eastAsia="Arial" w:hAnsi="Arial"/>
-          <w:sz w:val="22"/>
-          <w:szCs w:val="22"/>
-        </w:rPr>
-        <w:t xml:space="preserve">A Pull Request (PR) is how you ask the admin to review and approve your changes:</w:t>
-      </w:r>
-    </w:p>
-    <w:p>
-      <w:pPr>
-        <w:shd w:fill="F0F0F0" w:val="clear"/>
-        <w:spacing w:after="60" w:before="60"/>
-        <w:ind w:left="720"/>
-      </w:pPr>
-      <w:r>
-        <w:rPr>
-          <w:rFonts w:ascii="Courier New" w:cs="Courier New" w:eastAsia="Courier New" w:hAnsi="Courier New"/>
-          <w:color w:val="333333"/>
-          <w:sz w:val="20"/>
-          <w:szCs w:val="20"/>
-        </w:rPr>
-        <w:t xml:space="preserve">gh pr create --title "Your title" --body "What you changed and why"</w:t>
-      </w:r>
-    </w:p>
-    <w:p>
-      <w:pPr>
-        <w:spacing w:after="0" w:before="60"/>
-      </w:pPr>
-      <w:r>
-        <w:t xml:space="preserve"/>
-      </w:r>
-    </w:p>
-    <w:p>
-      <w:pPr>
-        <w:spacing w:after="80" w:before="80"/>
-      </w:pPr>
-      <w:r>
-        <w:rPr>
-          <w:rFonts w:ascii="Arial" w:cs="Arial" w:eastAsia="Arial" w:hAnsi="Arial"/>
-          <w:sz w:val="22"/>
-          <w:szCs w:val="22"/>
-        </w:rPr>
-        <w:t xml:space="preserve">Example:</w:t>
-      </w:r>
-    </w:p>
-    <w:p>
-      <w:pPr>
-        <w:shd w:fill="F0F0F0" w:val="clear"/>
-        <w:spacing w:after="60" w:before="60"/>
-        <w:ind w:left="720"/>
-      </w:pPr>
-      <w:r>
-        <w:rPr>
-          <w:rFonts w:ascii="Courier New" w:cs="Courier New" w:eastAsia="Courier New" w:hAnsi="Courier New"/>
-          <w:color w:val="333333"/>
-          <w:sz w:val="20"/>
-          <w:szCs w:val="20"/>
-        </w:rPr>
-        <w:t xml:space="preserve">gh pr create --title "Add Module 3 facilitator notes" --body "Added detailed notes for the facilitator section of Module 3 as requested."</w:t>
-      </w:r>
-    </w:p>
-    <w:p>
-      <w:pPr>
-        <w:spacing w:after="0" w:before="120"/>
-      </w:pPr>
-      <w:r>
-        <w:t xml:space="preserve"/>
-      </w:r>
-    </w:p>
-    <w:p>
-      <w:pPr>
-        <w:pStyle w:val="Heading2"/>
-        <w:spacing w:after="140" w:before="280"/>
-      </w:pPr>
-      <w:r>
-        <w:rPr>
-          <w:rFonts w:ascii="Arial" w:cs="Arial" w:eastAsia="Arial" w:hAnsi="Arial"/>
-          <w:b/>
-          <w:bCs/>
-          <w:color w:val="1F4E79"/>
-          <w:sz w:val="26"/>
-          <w:szCs w:val="26"/>
-        </w:rPr>
-        <w:t xml:space="preserve">Step 8 — Wait for Review</w:t>
-      </w:r>
-    </w:p>
-    <w:p>
-      <w:pPr>
-        <w:spacing w:after="80" w:before="80"/>
-      </w:pPr>
-      <w:r>
-        <w:rPr>
-          <w:rFonts w:ascii="Arial" w:cs="Arial" w:eastAsia="Arial" w:hAnsi="Arial"/>
-          <w:sz w:val="22"/>
-          <w:szCs w:val="22"/>
-        </w:rPr>
-        <w:t xml:space="preserve">The admin will receive a notification and review your Pull Request. They may:</w:t>
-      </w:r>
-    </w:p>
-    <w:p>
-      <w:pPr>
-        <w:spacing w:after="0" w:before="60"/>
-      </w:pPr>
-      <w:r>
-        <w:t xml:space="preserve"/>
-      </w:r>
-    </w:p>
-    <w:p>
-      <w:pPr>
-        <w:pStyle w:val="ListParagraph"/>
-        <w:numPr>
-          <w:ilvl w:val="0"/>
-          <w:numId w:val="2"/>
-        </w:numPr>
-        <w:spacing w:after="60" w:before="60"/>
-      </w:pPr>
-      <w:r>
-        <w:rPr>
-          <w:rFonts w:ascii="Arial" w:cs="Arial" w:eastAsia="Arial" w:hAnsi="Arial"/>
-          <w:sz w:val="22"/>
-          <w:szCs w:val="22"/>
-        </w:rPr>
-        <w:t xml:space="preserve">Approve and merge your changes into the main project</w:t>
-      </w:r>
-    </w:p>
-    <w:p>
-      <w:pPr>
-        <w:pStyle w:val="ListParagraph"/>
-        <w:numPr>
-          <w:ilvl w:val="0"/>
-          <w:numId w:val="2"/>
-        </w:numPr>
-        <w:spacing w:after="60" w:before="60"/>
-      </w:pPr>
-      <w:r>
-        <w:rPr>
-          <w:rFonts w:ascii="Arial" w:cs="Arial" w:eastAsia="Arial" w:hAnsi="Arial"/>
-          <w:sz w:val="22"/>
-          <w:szCs w:val="22"/>
-        </w:rPr>
-        <w:t xml:space="preserve">Leave comments asking for adjustments</w:t>
-      </w:r>
-    </w:p>
-    <w:p>
-      <w:pPr>
-        <w:pStyle w:val="ListParagraph"/>
-        <w:numPr>
-          <w:ilvl w:val="0"/>
-          <w:numId w:val="2"/>
-        </w:numPr>
-        <w:spacing w:after="60" w:before="60"/>
-      </w:pPr>
-      <w:r>
-        <w:rPr>
-          <w:rFonts w:ascii="Arial" w:cs="Arial" w:eastAsia="Arial" w:hAnsi="Arial"/>
-          <w:sz w:val="22"/>
-          <w:szCs w:val="22"/>
-        </w:rPr>
-        <w:t xml:space="preserve">Request changes before merging</w:t>
-      </w:r>
-    </w:p>
-    <w:p>
-      <w:pPr>
-        <w:spacing w:after="0" w:before="60"/>
-      </w:pPr>
-      <w:r>
-        <w:t xml:space="preserve"/>
-      </w:r>
-    </w:p>
-    <w:p>
-      <w:pPr>
-        <w:spacing w:after="80" w:before="80"/>
-      </w:pPr>
-      <w:r>
-        <w:rPr>
-          <w:rFonts w:ascii="Arial" w:cs="Arial" w:eastAsia="Arial" w:hAnsi="Arial"/>
-          <w:sz w:val="22"/>
-          <w:szCs w:val="22"/>
-        </w:rPr>
-        <w:t xml:space="preserve">You will receive an email notification when your PR is reviewed.</w:t>
+        <w:t xml:space="preserve">You will receive an email notification when your PR is reviewed. You can also ask Claude: "What is the status of my pull request?"</w:t>
       </w:r>
     </w:p>
     <w:p>
@@ -2988,7 +3048,7 @@
           <w:sz w:val="32"/>
           <w:szCs w:val="32"/>
         </w:rPr>
-        <w:t xml:space="preserve">Section 8 — Quick Command Reference</w:t>
+        <w:t xml:space="preserve">Section 7 — Quick Command Reference</w:t>
       </w:r>
     </w:p>
     <w:p>
@@ -3001,7 +3061,7 @@
           <w:sz w:val="22"/>
           <w:szCs w:val="22"/>
         </w:rPr>
-        <w:t xml:space="preserve">Use this table as a cheat sheet when working on the project.</w:t>
+        <w:t xml:space="preserve">Use this table when you prefer to run Git commands manually instead of asking Claude.</w:t>
       </w:r>
     </w:p>
     <w:p>
@@ -3489,128 +3549,6 @@
                 <w:sz w:val="20"/>
                 <w:szCs w:val="20"/>
               </w:rPr>
-              <w:t xml:space="preserve">gh pr create</w:t>
-            </w:r>
-          </w:p>
-        </w:tc>
-        <w:tc>
-          <w:tcPr>
-            <w:tcW w:type="dxa" w:w="5360"/>
-            <w:tcBorders>
-              <w:top w:val="single" w:color="CCCCCC" w:sz="1"/>
-              <w:left w:val="single" w:color="CCCCCC" w:sz="1"/>
-              <w:bottom w:val="single" w:color="CCCCCC" w:sz="1"/>
-              <w:right w:val="single" w:color="CCCCCC" w:sz="1"/>
-            </w:tcBorders>
-            <w:shd w:fill="F5F5F5" w:val="clear"/>
-            <w:tcMar>
-              <w:top w:type="dxa" w:w="80"/>
-              <w:left w:type="dxa" w:w="150"/>
-              <w:bottom w:type="dxa" w:w="80"/>
-              <w:right w:type="dxa" w:w="150"/>
-            </w:tcMar>
-          </w:tcPr>
-          <w:p>
-            <w:r>
-              <w:rPr>
-                <w:rFonts w:ascii="Arial" w:cs="Arial" w:eastAsia="Arial" w:hAnsi="Arial"/>
-                <w:sz w:val="22"/>
-                <w:szCs w:val="22"/>
-              </w:rPr>
-              <w:t xml:space="preserve">Opens a Pull Request for review</w:t>
-            </w:r>
-          </w:p>
-        </w:tc>
-      </w:tr>
-      <w:tr>
-        <w:tc>
-          <w:tcPr>
-            <w:tcW w:type="dxa" w:w="4000"/>
-            <w:tcBorders>
-              <w:top w:val="single" w:color="CCCCCC" w:sz="1"/>
-              <w:left w:val="single" w:color="CCCCCC" w:sz="1"/>
-              <w:bottom w:val="single" w:color="CCCCCC" w:sz="1"/>
-              <w:right w:val="single" w:color="CCCCCC" w:sz="1"/>
-            </w:tcBorders>
-            <w:shd w:fill="FFFFFF" w:val="clear"/>
-            <w:tcMar>
-              <w:top w:type="dxa" w:w="80"/>
-              <w:left w:type="dxa" w:w="150"/>
-              <w:bottom w:type="dxa" w:w="80"/>
-              <w:right w:type="dxa" w:w="150"/>
-            </w:tcMar>
-          </w:tcPr>
-          <w:p>
-            <w:r>
-              <w:rPr>
-                <w:rFonts w:ascii="Courier New" w:cs="Courier New" w:eastAsia="Courier New" w:hAnsi="Courier New"/>
-                <w:b/>
-                <w:bCs/>
-                <w:color w:val="C7254E"/>
-                <w:sz w:val="20"/>
-                <w:szCs w:val="20"/>
-              </w:rPr>
-              <w:t xml:space="preserve">gh auth status</w:t>
-            </w:r>
-          </w:p>
-        </w:tc>
-        <w:tc>
-          <w:tcPr>
-            <w:tcW w:type="dxa" w:w="5360"/>
-            <w:tcBorders>
-              <w:top w:val="single" w:color="CCCCCC" w:sz="1"/>
-              <w:left w:val="single" w:color="CCCCCC" w:sz="1"/>
-              <w:bottom w:val="single" w:color="CCCCCC" w:sz="1"/>
-              <w:right w:val="single" w:color="CCCCCC" w:sz="1"/>
-            </w:tcBorders>
-            <w:shd w:fill="FFFFFF" w:val="clear"/>
-            <w:tcMar>
-              <w:top w:type="dxa" w:w="80"/>
-              <w:left w:type="dxa" w:w="150"/>
-              <w:bottom w:type="dxa" w:w="80"/>
-              <w:right w:type="dxa" w:w="150"/>
-            </w:tcMar>
-          </w:tcPr>
-          <w:p>
-            <w:r>
-              <w:rPr>
-                <w:rFonts w:ascii="Arial" w:cs="Arial" w:eastAsia="Arial" w:hAnsi="Arial"/>
-                <w:sz w:val="22"/>
-                <w:szCs w:val="22"/>
-              </w:rPr>
-              <w:t xml:space="preserve">Checks if you are logged in to GitHub CLI</w:t>
-            </w:r>
-          </w:p>
-        </w:tc>
-      </w:tr>
-      <w:tr>
-        <w:tc>
-          <w:tcPr>
-            <w:tcW w:type="dxa" w:w="4000"/>
-            <w:tcBorders>
-              <w:top w:val="single" w:color="CCCCCC" w:sz="1"/>
-              <w:left w:val="single" w:color="CCCCCC" w:sz="1"/>
-              <w:bottom w:val="single" w:color="CCCCCC" w:sz="1"/>
-              <w:right w:val="single" w:color="CCCCCC" w:sz="1"/>
-            </w:tcBorders>
-            <w:shd w:fill="F5F5F5" w:val="clear"/>
-            <w:tcMar>
-              <w:top w:type="dxa" w:w="80"/>
-              <w:left w:type="dxa" w:w="150"/>
-              <w:bottom w:type="dxa" w:w="80"/>
-              <w:right w:type="dxa" w:w="150"/>
-            </w:tcMar>
-          </w:tcPr>
-          <w:p>
-            <w:r>
-              <w:rPr>
-                <w:rFonts w:ascii="Courier New" w:cs="Courier New" w:eastAsia="Courier New" w:hAnsi="Courier New"/>
-                <w:b/>
-                <w:bCs/>
-                <w:color w:val="C7254E"/>
-                <w:sz w:val="20"/>
-                <w:szCs w:val="20"/>
-              </w:rPr>
               <w:t xml:space="preserve">claude</w:t>
             </w:r>
           </w:p>
@@ -3664,25 +3602,12 @@
           <w:sz w:val="32"/>
           <w:szCs w:val="32"/>
         </w:rPr>
-        <w:t xml:space="preserve">Section 9 — Troubleshooting</w:t>
-      </w:r>
-    </w:p>
-    <w:p>
-      <w:pPr>
-        <w:spacing w:after="80" w:before="80"/>
-      </w:pPr>
-      <w:r>
-        <w:rPr>
-          <w:rFonts w:ascii="Arial" w:cs="Arial" w:eastAsia="Arial" w:hAnsi="Arial"/>
-          <w:sz w:val="22"/>
-          <w:szCs w:val="22"/>
-        </w:rPr>
-        <w:t xml:space="preserve">If something goes wrong, check the table below for common issues and solutions.</w:t>
-      </w:r>
-    </w:p>
-    <w:p>
-      <w:pPr>
-        <w:spacing w:after="0" w:before="100"/>
+        <w:t xml:space="preserve">Section 8 — Troubleshooting</w:t>
+      </w:r>
+    </w:p>
+    <w:p>
+      <w:pPr>
+        <w:spacing w:after="0" w:before="60"/>
       </w:pPr>
       <w:r>
         <w:t xml:space="preserve"/>
@@ -3702,20 +3627,7 @@
           <w:sz w:val="26"/>
           <w:szCs w:val="26"/>
         </w:rPr>
-        <w:t xml:space="preserve">"command not found: gh"</w:t>
-      </w:r>
-    </w:p>
-    <w:p>
-      <w:pPr>
-        <w:spacing w:after="80" w:before="80"/>
-      </w:pPr>
-      <w:r>
-        <w:rPr>
-          <w:rFonts w:ascii="Arial" w:cs="Arial" w:eastAsia="Arial" w:hAnsi="Arial"/>
-          <w:sz w:val="22"/>
-          <w:szCs w:val="22"/>
-        </w:rPr>
-        <w:t xml:space="preserve">GitHub CLI is not installed or not recognized.</w:t>
+        <w:t xml:space="preserve">GitHub Connector Not Showing in Claude</w:t>
       </w:r>
     </w:p>
     <w:p>
@@ -3733,7 +3645,7 @@
           <w:sz w:val="22"/>
           <w:szCs w:val="22"/>
         </w:rPr>
-        <w:t xml:space="preserve">macOS: go back to Section 3a and run brew install gh</w:t>
+        <w:t xml:space="preserve">Make sure you are logged in to claude.ai</w:t>
       </w:r>
     </w:p>
     <w:p>
@@ -3751,7 +3663,43 @@
           <w:sz w:val="22"/>
           <w:szCs w:val="22"/>
         </w:rPr>
-        <w:t xml:space="preserve">Windows: go back to Section 3b and reinstall from https://cli.github.com</w:t>
+        <w:t xml:space="preserve">Try refreshing the page and opening a new chat</w:t>
+      </w:r>
+    </w:p>
+    <w:p>
+      <w:pPr>
+        <w:pStyle w:val="ListParagraph"/>
+        <w:numPr>
+          <w:ilvl w:val="0"/>
+          <w:numId w:val="2"/>
+        </w:numPr>
+        <w:spacing w:after="60" w:before="60"/>
+      </w:pPr>
+      <w:r>
+        <w:rPr>
+          <w:rFonts w:ascii="Arial" w:cs="Arial" w:eastAsia="Arial" w:hAnsi="Arial"/>
+          <w:sz w:val="22"/>
+          <w:szCs w:val="22"/>
+        </w:rPr>
+        <w:t xml:space="preserve">Look for a plug icon or "Add tools" button near the message input box</w:t>
+      </w:r>
+    </w:p>
+    <w:p>
+      <w:pPr>
+        <w:pStyle w:val="ListParagraph"/>
+        <w:numPr>
+          <w:ilvl w:val="0"/>
+          <w:numId w:val="2"/>
+        </w:numPr>
+        <w:spacing w:after="60" w:before="60"/>
+      </w:pPr>
+      <w:r>
+        <w:rPr>
+          <w:rFonts w:ascii="Arial" w:cs="Arial" w:eastAsia="Arial" w:hAnsi="Arial"/>
+          <w:sz w:val="22"/>
+          <w:szCs w:val="22"/>
+        </w:rPr>
+        <w:t xml:space="preserve">If still not visible, contact the admin</w:t>
       </w:r>
     </w:p>
     <w:p>
@@ -3776,20 +3724,7 @@
           <w:sz w:val="26"/>
           <w:szCs w:val="26"/>
         </w:rPr>
-        <w:t xml:space="preserve">"command not found: claude"</w:t>
-      </w:r>
-    </w:p>
-    <w:p>
-      <w:pPr>
-        <w:spacing w:after="80" w:before="80"/>
-      </w:pPr>
-      <w:r>
-        <w:rPr>
-          <w:rFonts w:ascii="Arial" w:cs="Arial" w:eastAsia="Arial" w:hAnsi="Arial"/>
-          <w:sz w:val="22"/>
-          <w:szCs w:val="22"/>
-        </w:rPr>
-        <w:t xml:space="preserve">Claude Code is not installed.</w:t>
+        <w:t xml:space="preserve">"Authorization Failed" When Connecting GitHub</w:t>
       </w:r>
     </w:p>
     <w:p>
@@ -3807,7 +3742,43 @@
           <w:sz w:val="22"/>
           <w:szCs w:val="22"/>
         </w:rPr>
-        <w:t xml:space="preserve">Go back to Section 5 and run: npm install -g @anthropic-ai/claude-code</w:t>
+        <w:t xml:space="preserve">Make sure you are logged in to GitHub in the same browser</w:t>
+      </w:r>
+    </w:p>
+    <w:p>
+      <w:pPr>
+        <w:pStyle w:val="ListParagraph"/>
+        <w:numPr>
+          <w:ilvl w:val="0"/>
+          <w:numId w:val="2"/>
+        </w:numPr>
+        <w:spacing w:after="60" w:before="60"/>
+      </w:pPr>
+      <w:r>
+        <w:rPr>
+          <w:rFonts w:ascii="Arial" w:cs="Arial" w:eastAsia="Arial" w:hAnsi="Arial"/>
+          <w:sz w:val="22"/>
+          <w:szCs w:val="22"/>
+        </w:rPr>
+        <w:t xml:space="preserve">Try disconnecting and reconnecting the GitHub connector</w:t>
+      </w:r>
+    </w:p>
+    <w:p>
+      <w:pPr>
+        <w:pStyle w:val="ListParagraph"/>
+        <w:numPr>
+          <w:ilvl w:val="0"/>
+          <w:numId w:val="2"/>
+        </w:numPr>
+        <w:spacing w:after="60" w:before="60"/>
+      </w:pPr>
+      <w:r>
+        <w:rPr>
+          <w:rFonts w:ascii="Arial" w:cs="Arial" w:eastAsia="Arial" w:hAnsi="Arial"/>
+          <w:sz w:val="22"/>
+          <w:szCs w:val="22"/>
+        </w:rPr>
+        <w:t xml:space="preserve">Check that you accepted the easvrm organization invitation (Section 1.2)</w:t>
       </w:r>
     </w:p>
     <w:p>
@@ -3832,20 +3803,7 @@
           <w:sz w:val="26"/>
           <w:szCs w:val="26"/>
         </w:rPr>
-        <w:t xml:space="preserve">"Permission denied" or "Repository not found"</w:t>
-      </w:r>
-    </w:p>
-    <w:p>
-      <w:pPr>
-        <w:spacing w:after="80" w:before="80"/>
-      </w:pPr>
-      <w:r>
-        <w:rPr>
-          <w:rFonts w:ascii="Arial" w:cs="Arial" w:eastAsia="Arial" w:hAnsi="Arial"/>
-          <w:sz w:val="22"/>
-          <w:szCs w:val="22"/>
-        </w:rPr>
-        <w:t xml:space="preserve">You may not have been added to the repository yet.</w:t>
+        <w:t xml:space="preserve">"command not found: claude"</w:t>
       </w:r>
     </w:p>
     <w:p>
@@ -3863,84 +3821,7 @@
           <w:sz w:val="22"/>
           <w:szCs w:val="22"/>
         </w:rPr>
-        <w:t xml:space="preserve">Check your email for a GitHub invitation from the admin</w:t>
-      </w:r>
-    </w:p>
-    <w:p>
-      <w:pPr>
-        <w:pStyle w:val="ListParagraph"/>
-        <w:numPr>
-          <w:ilvl w:val="0"/>
-          <w:numId w:val="2"/>
-        </w:numPr>
-        <w:spacing w:after="60" w:before="60"/>
-      </w:pPr>
-      <w:r>
-        <w:rPr>
-          <w:rFonts w:ascii="Arial" w:cs="Arial" w:eastAsia="Arial" w:hAnsi="Arial"/>
-          <w:sz w:val="22"/>
-          <w:szCs w:val="22"/>
-        </w:rPr>
-        <w:t xml:space="preserve">Contact the admin at john.punzalan@eisnetwork.co</w:t>
-      </w:r>
-    </w:p>
-    <w:p>
-      <w:pPr>
-        <w:spacing w:after="0" w:before="120"/>
-      </w:pPr>
-      <w:r>
-        <w:t xml:space="preserve"/>
-      </w:r>
-    </w:p>
-    <w:p>
-      <w:pPr>
-        <w:pStyle w:val="Heading2"/>
-        <w:spacing w:after="140" w:before="280"/>
-      </w:pPr>
-      <w:r>
-        <w:rPr>
-          <w:rFonts w:ascii="Arial" w:cs="Arial" w:eastAsia="Arial" w:hAnsi="Arial"/>
-          <w:b/>
-          <w:bCs/>
-          <w:color w:val="1F4E79"/>
-          <w:sz w:val="26"/>
-          <w:szCs w:val="26"/>
-        </w:rPr>
-        <w:t xml:space="preserve">Merge Conflict</w:t>
-      </w:r>
-    </w:p>
-    <w:p>
-      <w:pPr>
-        <w:spacing w:after="80" w:before="80"/>
-      </w:pPr>
-      <w:r>
-        <w:rPr>
-          <w:rFonts w:ascii="Arial" w:cs="Arial" w:eastAsia="Arial" w:hAnsi="Arial"/>
-          <w:sz w:val="22"/>
-          <w:szCs w:val="22"/>
-        </w:rPr>
-        <w:t xml:space="preserve">A merge conflict happens when two people edited the same part of a file. Ask Claude for help:</w:t>
-      </w:r>
-    </w:p>
-    <w:p>
-      <w:pPr>
-        <w:spacing w:after="0" w:before="60"/>
-      </w:pPr>
-      <w:r>
-        <w:t xml:space="preserve"/>
-      </w:r>
-    </w:p>
-    <w:p>
-      <w:pPr>
-        <w:spacing w:after="80" w:before="80"/>
-      </w:pPr>
-      <w:r>
-        <w:rPr>
-          <w:rFonts w:ascii="Arial" w:cs="Arial" w:eastAsia="Arial" w:hAnsi="Arial"/>
-          <w:sz w:val="22"/>
-          <w:szCs w:val="22"/>
-        </w:rPr>
-        <w:t xml:space="preserve">Inside your project folder, open Claude and say:</w:t>
+        <w:t xml:space="preserve">Claude Code is not installed. Go back to Section 4 and run:</w:t>
       </w:r>
     </w:p>
     <w:p>
@@ -3956,20 +3837,7 @@
           <w:sz w:val="20"/>
           <w:szCs w:val="20"/>
         </w:rPr>
-        <w:t xml:space="preserve">"I have a merge conflict in [filename]. Help me fix it."</w:t>
-      </w:r>
-    </w:p>
-    <w:p>
-      <w:pPr>
-        <w:spacing w:after="80" w:before="80"/>
-      </w:pPr>
-      <w:r>
-        <w:rPr>
-          <w:rFonts w:ascii="Arial" w:cs="Arial" w:eastAsia="Arial" w:hAnsi="Arial"/>
-          <w:sz w:val="22"/>
-          <w:szCs w:val="22"/>
-        </w:rPr>
-        <w:t xml:space="preserve">Claude will guide you through resolving it step by step.</w:t>
+        <w:t xml:space="preserve">npm install -g @anthropic-ai/claude-code</w:t>
       </w:r>
     </w:p>
     <w:p>
@@ -3994,20 +3862,7 @@
           <w:sz w:val="26"/>
           <w:szCs w:val="26"/>
         </w:rPr>
-        <w:t xml:space="preserve">Browser Does Not Open During gh auth login</w:t>
-      </w:r>
-    </w:p>
-    <w:p>
-      <w:pPr>
-        <w:spacing w:after="80" w:before="80"/>
-      </w:pPr>
-      <w:r>
-        <w:rPr>
-          <w:rFonts w:ascii="Arial" w:cs="Arial" w:eastAsia="Arial" w:hAnsi="Arial"/>
-          <w:sz w:val="22"/>
-          <w:szCs w:val="22"/>
-        </w:rPr>
-        <w:t xml:space="preserve">If your browser does not open automatically during authentication:</w:t>
+        <w:t xml:space="preserve">"Permission denied" or "Repository not found"</w:t>
       </w:r>
     </w:p>
     <w:p>
@@ -4025,7 +3880,7 @@
           <w:sz w:val="22"/>
           <w:szCs w:val="22"/>
         </w:rPr>
-        <w:t xml:space="preserve">Manually open your browser</w:t>
+        <w:t xml:space="preserve">Check your email for a GitHub invitation from the admin</w:t>
       </w:r>
     </w:p>
     <w:p>
@@ -4043,7 +3898,7 @@
           <w:sz w:val="22"/>
           <w:szCs w:val="22"/>
         </w:rPr>
-        <w:t xml:space="preserve">Go to: https://github.com/login/device</w:t>
+        <w:t xml:space="preserve">Make sure you accepted the invitation (Section 1.2)</w:t>
       </w:r>
     </w:p>
     <w:p>
@@ -4061,7 +3916,7 @@
           <w:sz w:val="22"/>
           <w:szCs w:val="22"/>
         </w:rPr>
-        <w:t xml:space="preserve">Enter the one-time code displayed in your terminal</w:t>
+        <w:t xml:space="preserve">Contact the admin at john.punzalan@eisnetwork.co</w:t>
       </w:r>
     </w:p>
     <w:p>
@@ -4086,7 +3941,7 @@
           <w:sz w:val="26"/>
           <w:szCs w:val="26"/>
         </w:rPr>
-        <w:t xml:space="preserve">"node: command not found"</w:t>
+        <w:t xml:space="preserve">Merge Conflict</w:t>
       </w:r>
     </w:p>
     <w:p>
@@ -4099,103 +3954,7 @@
           <w:sz w:val="22"/>
           <w:szCs w:val="22"/>
         </w:rPr>
-        <w:t xml:space="preserve">Node.js is not installed.</w:t>
-      </w:r>
-    </w:p>
-    <w:p>
-      <w:pPr>
-        <w:pStyle w:val="ListParagraph"/>
-        <w:numPr>
-          <w:ilvl w:val="0"/>
-          <w:numId w:val="2"/>
-        </w:numPr>
-        <w:spacing w:after="60" w:before="60"/>
-      </w:pPr>
-      <w:r>
-        <w:rPr>
-          <w:rFonts w:ascii="Arial" w:cs="Arial" w:eastAsia="Arial" w:hAnsi="Arial"/>
-          <w:sz w:val="22"/>
-          <w:szCs w:val="22"/>
-        </w:rPr>
-        <w:t xml:space="preserve">macOS: run brew install node</w:t>
-      </w:r>
-    </w:p>
-    <w:p>
-      <w:pPr>
-        <w:pStyle w:val="ListParagraph"/>
-        <w:numPr>
-          <w:ilvl w:val="0"/>
-          <w:numId w:val="2"/>
-        </w:numPr>
-        <w:spacing w:after="60" w:before="60"/>
-      </w:pPr>
-      <w:r>
-        <w:rPr>
-          <w:rFonts w:ascii="Arial" w:cs="Arial" w:eastAsia="Arial" w:hAnsi="Arial"/>
-          <w:sz w:val="22"/>
-          <w:szCs w:val="22"/>
-        </w:rPr>
-        <w:t xml:space="preserve">Windows: download from https://nodejs.org (LTS version)</w:t>
-      </w:r>
-    </w:p>
-    <w:p>
-      <w:r>
-        <w:br w:type="page"/>
-      </w:r>
-    </w:p>
-    <w:p>
-      <w:pPr>
-        <w:pStyle w:val="Heading1"/>
-        <w:spacing w:after="200" w:before="400"/>
-      </w:pPr>
-      <w:r>
-        <w:rPr>
-          <w:rFonts w:ascii="Arial" w:cs="Arial" w:eastAsia="Arial" w:hAnsi="Arial"/>
-          <w:b/>
-          <w:bCs/>
-          <w:color w:val="FFFFFF"/>
-          <w:sz w:val="32"/>
-          <w:szCs w:val="32"/>
-        </w:rPr>
-        <w:t xml:space="preserve">Section 10 — Getting Help</w:t>
-      </w:r>
-    </w:p>
-    <w:p>
-      <w:pPr>
-        <w:spacing w:after="0" w:before="80"/>
-      </w:pPr>
-      <w:r>
-        <w:t xml:space="preserve"/>
-      </w:r>
-    </w:p>
-    <w:p>
-      <w:pPr>
-        <w:pStyle w:val="Heading2"/>
-        <w:spacing w:after="140" w:before="280"/>
-      </w:pPr>
-      <w:r>
-        <w:rPr>
-          <w:rFonts w:ascii="Arial" w:cs="Arial" w:eastAsia="Arial" w:hAnsi="Arial"/>
-          <w:b/>
-          <w:bCs/>
-          <w:color w:val="1F4E79"/>
-          <w:sz w:val="26"/>
-          <w:szCs w:val="26"/>
-        </w:rPr>
-        <w:t xml:space="preserve">Ask Claude Directly</w:t>
-      </w:r>
-    </w:p>
-    <w:p>
-      <w:pPr>
-        <w:spacing w:after="80" w:before="80"/>
-      </w:pPr>
-      <w:r>
-        <w:rPr>
-          <w:rFonts w:ascii="Arial" w:cs="Arial" w:eastAsia="Arial" w:hAnsi="Arial"/>
-          <w:sz w:val="22"/>
-          <w:szCs w:val="22"/>
-        </w:rPr>
-        <w:t xml:space="preserve">The fastest way to get help is to ask Claude inside your project folder:</w:t>
+        <w:t xml:space="preserve">If two people edited the same part of a file, ask Claude to help:</w:t>
       </w:r>
     </w:p>
     <w:p>
@@ -4211,7 +3970,141 @@
           <w:sz w:val="20"/>
           <w:szCs w:val="20"/>
         </w:rPr>
-        <w:t xml:space="preserve">cd ~/Documents/Training-Package-for-Replication</w:t>
+        <w:t xml:space="preserve">I have a merge conflict in [filename]. Help me fix it.</w:t>
+      </w:r>
+    </w:p>
+    <w:p>
+      <w:pPr>
+        <w:spacing w:after="80" w:before="80"/>
+      </w:pPr>
+      <w:r>
+        <w:rPr>
+          <w:rFonts w:ascii="Arial" w:cs="Arial" w:eastAsia="Arial" w:hAnsi="Arial"/>
+          <w:sz w:val="22"/>
+          <w:szCs w:val="22"/>
+        </w:rPr>
+        <w:t xml:space="preserve">Claude will walk you through resolving it step by step.</w:t>
+      </w:r>
+    </w:p>
+    <w:p>
+      <w:pPr>
+        <w:spacing w:after="0" w:before="120"/>
+      </w:pPr>
+      <w:r>
+        <w:t xml:space="preserve"/>
+      </w:r>
+    </w:p>
+    <w:p>
+      <w:pPr>
+        <w:pStyle w:val="Heading2"/>
+        <w:spacing w:after="140" w:before="280"/>
+      </w:pPr>
+      <w:r>
+        <w:rPr>
+          <w:rFonts w:ascii="Arial" w:cs="Arial" w:eastAsia="Arial" w:hAnsi="Arial"/>
+          <w:b/>
+          <w:bCs/>
+          <w:color w:val="1F4E79"/>
+          <w:sz w:val="26"/>
+          <w:szCs w:val="26"/>
+        </w:rPr>
+        <w:t xml:space="preserve">"node: command not found"</w:t>
+      </w:r>
+    </w:p>
+    <w:p>
+      <w:pPr>
+        <w:pStyle w:val="ListParagraph"/>
+        <w:numPr>
+          <w:ilvl w:val="0"/>
+          <w:numId w:val="2"/>
+        </w:numPr>
+        <w:spacing w:after="60" w:before="60"/>
+      </w:pPr>
+      <w:r>
+        <w:rPr>
+          <w:rFonts w:ascii="Arial" w:cs="Arial" w:eastAsia="Arial" w:hAnsi="Arial"/>
+          <w:sz w:val="22"/>
+          <w:szCs w:val="22"/>
+        </w:rPr>
+        <w:t xml:space="preserve">macOS: run brew install node in Terminal</w:t>
+      </w:r>
+    </w:p>
+    <w:p>
+      <w:pPr>
+        <w:pStyle w:val="ListParagraph"/>
+        <w:numPr>
+          <w:ilvl w:val="0"/>
+          <w:numId w:val="2"/>
+        </w:numPr>
+        <w:spacing w:after="60" w:before="60"/>
+      </w:pPr>
+      <w:r>
+        <w:rPr>
+          <w:rFonts w:ascii="Arial" w:cs="Arial" w:eastAsia="Arial" w:hAnsi="Arial"/>
+          <w:sz w:val="22"/>
+          <w:szCs w:val="22"/>
+        </w:rPr>
+        <w:t xml:space="preserve">Windows: download from https://nodejs.org (LTS version)</w:t>
+      </w:r>
+    </w:p>
+    <w:p>
+      <w:r>
+        <w:br w:type="page"/>
+      </w:r>
+    </w:p>
+    <w:p>
+      <w:pPr>
+        <w:pStyle w:val="Heading1"/>
+        <w:spacing w:after="200" w:before="400"/>
+      </w:pPr>
+      <w:r>
+        <w:rPr>
+          <w:rFonts w:ascii="Arial" w:cs="Arial" w:eastAsia="Arial" w:hAnsi="Arial"/>
+          <w:b/>
+          <w:bCs/>
+          <w:color w:val="FFFFFF"/>
+          <w:sz w:val="32"/>
+          <w:szCs w:val="32"/>
+        </w:rPr>
+        <w:t xml:space="preserve">Section 9 — Getting Help</w:t>
+      </w:r>
+    </w:p>
+    <w:p>
+      <w:pPr>
+        <w:spacing w:after="0" w:before="80"/>
+      </w:pPr>
+      <w:r>
+        <w:t xml:space="preserve"/>
+      </w:r>
+    </w:p>
+    <w:p>
+      <w:pPr>
+        <w:pStyle w:val="Heading2"/>
+        <w:spacing w:after="140" w:before="280"/>
+      </w:pPr>
+      <w:r>
+        <w:rPr>
+          <w:rFonts w:ascii="Arial" w:cs="Arial" w:eastAsia="Arial" w:hAnsi="Arial"/>
+          <w:b/>
+          <w:bCs/>
+          <w:color w:val="1F4E79"/>
+          <w:sz w:val="26"/>
+          <w:szCs w:val="26"/>
+        </w:rPr>
+        <w:t xml:space="preserve">Ask Claude Directly</w:t>
+      </w:r>
+    </w:p>
+    <w:p>
+      <w:pPr>
+        <w:spacing w:after="80" w:before="80"/>
+      </w:pPr>
+      <w:r>
+        <w:rPr>
+          <w:rFonts w:ascii="Arial" w:cs="Arial" w:eastAsia="Arial" w:hAnsi="Arial"/>
+          <w:sz w:val="22"/>
+          <w:szCs w:val="22"/>
+        </w:rPr>
+        <w:t xml:space="preserve">The fastest way to get help is to ask Claude. In the web version at claude.ai, or inside Claude Code:</w:t>
       </w:r>
     </w:p>
     <w:p>
@@ -4303,7 +4196,7 @@
         </w:rPr>
         <w:t xml:space="preserve">Repository Issues: </w:t>
       </w:r>
-      <w:hyperlink w:history="1" r:id="rIdntsdbv6phmiqrezluxwta">
+      <w:hyperlink w:history="1" r:id="rIdn_xn8heie1xok1qpidbgz">
         <w:r>
           <w:rPr>
             <w:rStyle w:val="Hyperlink"/>

</xml_diff>

<commit_message>
Update Onboarding Guide: assume Claude native app pre-installed, simplify to 8 sections
Co-Authored-By: Claude Sonnet 4.6 <noreply@anthropic.com>
</commit_message>
<xml_diff>
--- a/Collaborator-Onboarding-Guide.docx
+++ b/Collaborator-Onboarding-Guide.docx
@@ -235,6 +235,24 @@
           <w:sz w:val="22"/>
           <w:szCs w:val="22"/>
         </w:rPr>
+        <w:t xml:space="preserve">The Claude native app already installed on your computer</w:t>
+      </w:r>
+    </w:p>
+    <w:p>
+      <w:pPr>
+        <w:pStyle w:val="ListParagraph"/>
+        <w:numPr>
+          <w:ilvl w:val="0"/>
+          <w:numId w:val="2"/>
+        </w:numPr>
+        <w:spacing w:after="60" w:before="60"/>
+      </w:pPr>
+      <w:r>
+        <w:rPr>
+          <w:rFonts w:ascii="Arial" w:cs="Arial" w:eastAsia="Arial" w:hAnsi="Arial"/>
+          <w:sz w:val="22"/>
+          <w:szCs w:val="22"/>
+        </w:rPr>
         <w:t xml:space="preserve">A GitHub account (instructions below if you need to create one)</w:t>
       </w:r>
     </w:p>
@@ -788,7 +806,7 @@
           <w:sz w:val="22"/>
           <w:szCs w:val="22"/>
         </w:rPr>
-        <w:t xml:space="preserve">Claude has a built-in GitHub connector that allows you to interact with GitHub repositories directly inside Claude — no command-line setup required. This is the easiest way to work with Git.</w:t>
+        <w:t xml:space="preserve">Claude has a built-in GitHub connector that lets you interact with GitHub repositories directly inside Claude — no command-line knowledge required. You need to connect it once in both the native app and the web version.</w:t>
       </w:r>
     </w:p>
     <w:p>
@@ -813,7 +831,28 @@
           <w:sz w:val="26"/>
           <w:szCs w:val="26"/>
         </w:rPr>
-        <w:t xml:space="preserve">3.1 — Open Claude and Access Connectors</w:t>
+        <w:t xml:space="preserve">3.1 — Connect in the Claude Native App</w:t>
+      </w:r>
+    </w:p>
+    <w:p>
+      <w:pPr>
+        <w:spacing w:after="80" w:before="80"/>
+      </w:pPr>
+      <w:r>
+        <w:rPr>
+          <w:rFonts w:ascii="Arial" w:cs="Arial" w:eastAsia="Arial" w:hAnsi="Arial"/>
+          <w:sz w:val="22"/>
+          <w:szCs w:val="22"/>
+        </w:rPr>
+        <w:t xml:space="preserve">Since the Claude native app is already installed on your computer, open it and follow these steps:</w:t>
+      </w:r>
+    </w:p>
+    <w:p>
+      <w:pPr>
+        <w:spacing w:after="0" w:before="60"/>
+      </w:pPr>
+      <w:r>
+        <w:t xml:space="preserve"/>
       </w:r>
     </w:p>
     <w:p>
@@ -831,7 +870,7 @@
           <w:sz w:val="22"/>
           <w:szCs w:val="22"/>
         </w:rPr>
-        <w:t xml:space="preserve">Go to https://claude.ai and log in</w:t>
+        <w:t xml:space="preserve">Open the Claude native app on your computer</w:t>
       </w:r>
     </w:p>
     <w:p>
@@ -849,7 +888,7 @@
           <w:sz w:val="22"/>
           <w:szCs w:val="22"/>
         </w:rPr>
-        <w:t xml:space="preserve">Start a new conversation by clicking "New chat" in the left sidebar</w:t>
+        <w:t xml:space="preserve">Start a new conversation</w:t>
       </w:r>
     </w:p>
     <w:p>
@@ -867,7 +906,7 @@
           <w:sz w:val="22"/>
           <w:szCs w:val="22"/>
         </w:rPr>
-        <w:t xml:space="preserve">In the chat input area, look for the connector or tools icon (a plug icon or "Add tools")</w:t>
+        <w:t xml:space="preserve">Look for the connector or tools icon near the message input box (a plug icon or grid icon)</w:t>
       </w:r>
     </w:p>
     <w:p>
@@ -885,7 +924,79 @@
           <w:sz w:val="22"/>
           <w:szCs w:val="22"/>
         </w:rPr>
-        <w:t xml:space="preserve">Click on it to open the connectors panel</w:t>
+        <w:t xml:space="preserve">Click it to open the connectors panel</w:t>
+      </w:r>
+    </w:p>
+    <w:p>
+      <w:pPr>
+        <w:pStyle w:val="ListParagraph"/>
+        <w:numPr>
+          <w:ilvl w:val="0"/>
+          <w:numId w:val="6"/>
+        </w:numPr>
+        <w:spacing w:after="60" w:before="60"/>
+      </w:pPr>
+      <w:r>
+        <w:rPr>
+          <w:rFonts w:ascii="Arial" w:cs="Arial" w:eastAsia="Arial" w:hAnsi="Arial"/>
+          <w:sz w:val="22"/>
+          <w:szCs w:val="22"/>
+        </w:rPr>
+        <w:t xml:space="preserve">Search for "GitHub" and click on it</w:t>
+      </w:r>
+    </w:p>
+    <w:p>
+      <w:pPr>
+        <w:pStyle w:val="ListParagraph"/>
+        <w:numPr>
+          <w:ilvl w:val="0"/>
+          <w:numId w:val="6"/>
+        </w:numPr>
+        <w:spacing w:after="60" w:before="60"/>
+      </w:pPr>
+      <w:r>
+        <w:rPr>
+          <w:rFonts w:ascii="Arial" w:cs="Arial" w:eastAsia="Arial" w:hAnsi="Arial"/>
+          <w:sz w:val="22"/>
+          <w:szCs w:val="22"/>
+        </w:rPr>
+        <w:t xml:space="preserve">Click "Connect" or "Authorize"</w:t>
+      </w:r>
+    </w:p>
+    <w:p>
+      <w:pPr>
+        <w:pStyle w:val="ListParagraph"/>
+        <w:numPr>
+          <w:ilvl w:val="0"/>
+          <w:numId w:val="6"/>
+        </w:numPr>
+        <w:spacing w:after="60" w:before="60"/>
+      </w:pPr>
+      <w:r>
+        <w:rPr>
+          <w:rFonts w:ascii="Arial" w:cs="Arial" w:eastAsia="Arial" w:hAnsi="Arial"/>
+          <w:sz w:val="22"/>
+          <w:szCs w:val="22"/>
+        </w:rPr>
+        <w:t xml:space="preserve">A GitHub authorization page will open in your browser — click "Authorize"</w:t>
+      </w:r>
+    </w:p>
+    <w:p>
+      <w:pPr>
+        <w:pStyle w:val="ListParagraph"/>
+        <w:numPr>
+          <w:ilvl w:val="0"/>
+          <w:numId w:val="6"/>
+        </w:numPr>
+        <w:spacing w:after="60" w:before="60"/>
+      </w:pPr>
+      <w:r>
+        <w:rPr>
+          <w:rFonts w:ascii="Arial" w:cs="Arial" w:eastAsia="Arial" w:hAnsi="Arial"/>
+          <w:sz w:val="22"/>
+          <w:szCs w:val="22"/>
+        </w:rPr>
+        <w:t xml:space="preserve">Return to the Claude app — the GitHub connector is now active</w:t>
       </w:r>
     </w:p>
     <w:p>
@@ -924,7 +1035,7 @@
           <w:sz w:val="22"/>
           <w:szCs w:val="22"/>
         </w:rPr>
-        <w:t xml:space="preserve">The connector icon looks like a small plug or grid icon near the message input box.</w:t>
+        <w:t xml:space="preserve">You only need to do this once. The connector will stay connected for all future sessions.</w:t>
       </w:r>
     </w:p>
     <w:p>
@@ -949,7 +1060,28 @@
           <w:sz w:val="26"/>
           <w:szCs w:val="26"/>
         </w:rPr>
-        <w:t xml:space="preserve">3.2 — Add the GitHub Connector</w:t>
+        <w:t xml:space="preserve">3.2 — Connect in the Claude Web Version (claude.ai)</w:t>
+      </w:r>
+    </w:p>
+    <w:p>
+      <w:pPr>
+        <w:spacing w:after="80" w:before="80"/>
+      </w:pPr>
+      <w:r>
+        <w:rPr>
+          <w:rFonts w:ascii="Arial" w:cs="Arial" w:eastAsia="Arial" w:hAnsi="Arial"/>
+          <w:sz w:val="22"/>
+          <w:szCs w:val="22"/>
+        </w:rPr>
+        <w:t xml:space="preserve">You can also use Claude from your browser at https://claude.ai. The GitHub connector needs to be connected there as well:</w:t>
+      </w:r>
+    </w:p>
+    <w:p>
+      <w:pPr>
+        <w:spacing w:after="0" w:before="60"/>
+      </w:pPr>
+      <w:r>
+        <w:t xml:space="preserve"/>
       </w:r>
     </w:p>
     <w:p>
@@ -967,7 +1099,7 @@
           <w:sz w:val="22"/>
           <w:szCs w:val="22"/>
         </w:rPr>
-        <w:t xml:space="preserve">In the connectors panel, search for "GitHub"</w:t>
+        <w:t xml:space="preserve">Go to https://claude.ai and log in with your Claude account</w:t>
       </w:r>
     </w:p>
     <w:p>
@@ -985,7 +1117,7 @@
           <w:sz w:val="22"/>
           <w:szCs w:val="22"/>
         </w:rPr>
-        <w:t xml:space="preserve">Click on the GitHub connector</w:t>
+        <w:t xml:space="preserve">Start a new conversation by clicking "New chat" in the left sidebar</w:t>
       </w:r>
     </w:p>
     <w:p>
@@ -1003,7 +1135,7 @@
           <w:sz w:val="22"/>
           <w:szCs w:val="22"/>
         </w:rPr>
-        <w:t xml:space="preserve">Click "Connect" or "Authorize"</w:t>
+        <w:t xml:space="preserve">Click the connector or tools icon near the message input box</w:t>
       </w:r>
     </w:p>
     <w:p>
@@ -1021,7 +1153,7 @@
           <w:sz w:val="22"/>
           <w:szCs w:val="22"/>
         </w:rPr>
-        <w:t xml:space="preserve">A GitHub authorization page will open in your browser</w:t>
+        <w:t xml:space="preserve">Search for "GitHub" and click on it</w:t>
       </w:r>
     </w:p>
     <w:p>
@@ -1039,7 +1171,7 @@
           <w:sz w:val="22"/>
           <w:szCs w:val="22"/>
         </w:rPr>
-        <w:t xml:space="preserve">Click "Authorize" to grant Claude access to your GitHub account</w:t>
+        <w:t xml:space="preserve">Click "Connect" or "Authorize" and complete the GitHub authorization</w:t>
       </w:r>
     </w:p>
     <w:p>
@@ -1057,7 +1189,7 @@
           <w:sz w:val="22"/>
           <w:szCs w:val="22"/>
         </w:rPr>
-        <w:t xml:space="preserve">You will be redirected back to Claude — the GitHub connector is now active</w:t>
+        <w:t xml:space="preserve">The GitHub connector is now active in the web version as well</w:t>
       </w:r>
     </w:p>
     <w:p>
@@ -1134,7 +1266,7 @@
           <w:sz w:val="22"/>
           <w:szCs w:val="22"/>
         </w:rPr>
-        <w:t xml:space="preserve">To confirm the connector is working, type the following message in Claude:</w:t>
+        <w:t xml:space="preserve">To confirm the connector is working in either the app or the web version, type:</w:t>
       </w:r>
     </w:p>
     <w:p>
@@ -1201,7 +1333,7 @@
           <w:sz w:val="32"/>
           <w:szCs w:val="32"/>
         </w:rPr>
-        <w:t xml:space="preserve">Section 4 — Install Claude Code (Desktop)</w:t>
+        <w:t xml:space="preserve">Section 4 — Clone the Repository</w:t>
       </w:r>
     </w:p>
     <w:p>
@@ -1214,7 +1346,7 @@
           <w:sz w:val="22"/>
           <w:szCs w:val="22"/>
         </w:rPr>
-        <w:t xml:space="preserve">Claude Code is the desktop version of Claude that runs on your computer. It gives you more power when working with files and projects locally.</w:t>
+        <w:t xml:space="preserve">Cloning means downloading a copy of the project to your computer so you can work on it locally.</w:t>
       </w:r>
     </w:p>
     <w:p>
@@ -1239,7 +1371,7 @@
           <w:sz w:val="26"/>
           <w:szCs w:val="26"/>
         </w:rPr>
-        <w:t xml:space="preserve">4.1 — Install Node.js</w:t>
+        <w:t xml:space="preserve">4.1 — Clone by Asking Claude</w:t>
       </w:r>
     </w:p>
     <w:p>
@@ -1252,7 +1384,51 @@
           <w:sz w:val="22"/>
           <w:szCs w:val="22"/>
         </w:rPr>
-        <w:t xml:space="preserve">Claude Code requires Node.js. First check if you already have it:</w:t>
+        <w:t xml:space="preserve">The easiest way is to ask Claude directly inside the native app:</w:t>
+      </w:r>
+    </w:p>
+    <w:p>
+      <w:pPr>
+        <w:spacing w:after="0" w:before="60"/>
+      </w:pPr>
+      <w:r>
+        <w:t xml:space="preserve"/>
+      </w:r>
+    </w:p>
+    <w:p>
+      <w:pPr>
+        <w:pStyle w:val="ListParagraph"/>
+        <w:numPr>
+          <w:ilvl w:val="0"/>
+          <w:numId w:val="8"/>
+        </w:numPr>
+        <w:spacing w:after="60" w:before="60"/>
+      </w:pPr>
+      <w:r>
+        <w:rPr>
+          <w:rFonts w:ascii="Arial" w:cs="Arial" w:eastAsia="Arial" w:hAnsi="Arial"/>
+          <w:sz w:val="22"/>
+          <w:szCs w:val="22"/>
+        </w:rPr>
+        <w:t xml:space="preserve">Open the Claude native app</w:t>
+      </w:r>
+    </w:p>
+    <w:p>
+      <w:pPr>
+        <w:pStyle w:val="ListParagraph"/>
+        <w:numPr>
+          <w:ilvl w:val="0"/>
+          <w:numId w:val="8"/>
+        </w:numPr>
+        <w:spacing w:after="60" w:before="60"/>
+      </w:pPr>
+      <w:r>
+        <w:rPr>
+          <w:rFonts w:ascii="Arial" w:cs="Arial" w:eastAsia="Arial" w:hAnsi="Arial"/>
+          <w:sz w:val="22"/>
+          <w:szCs w:val="22"/>
+        </w:rPr>
+        <w:t xml:space="preserve">Ask Claude to clone the repository for you:</w:t>
       </w:r>
     </w:p>
     <w:p>
@@ -1268,7 +1444,50 @@
           <w:sz w:val="20"/>
           <w:szCs w:val="20"/>
         </w:rPr>
-        <w:t xml:space="preserve">node --version</w:t>
+        <w:t xml:space="preserve">Clone the easvrm/Training-Package-for-Replication repository into my Documents folder</w:t>
+      </w:r>
+    </w:p>
+    <w:p>
+      <w:pPr>
+        <w:pStyle w:val="ListParagraph"/>
+        <w:numPr>
+          <w:ilvl w:val="0"/>
+          <w:numId w:val="8"/>
+        </w:numPr>
+        <w:spacing w:after="60" w:before="60"/>
+      </w:pPr>
+      <w:r>
+        <w:rPr>
+          <w:rFonts w:ascii="Arial" w:cs="Arial" w:eastAsia="Arial" w:hAnsi="Arial"/>
+          <w:sz w:val="22"/>
+          <w:szCs w:val="22"/>
+        </w:rPr>
+        <w:t xml:space="preserve">Claude will run the necessary commands and confirm when done</w:t>
+      </w:r>
+    </w:p>
+    <w:p>
+      <w:pPr>
+        <w:spacing w:after="0" w:before="100"/>
+      </w:pPr>
+      <w:r>
+        <w:t xml:space="preserve"/>
+      </w:r>
+    </w:p>
+    <w:p>
+      <w:pPr>
+        <w:pStyle w:val="Heading2"/>
+        <w:spacing w:after="140" w:before="280"/>
+      </w:pPr>
+      <w:r>
+        <w:rPr>
+          <w:rFonts w:ascii="Arial" w:cs="Arial" w:eastAsia="Arial" w:hAnsi="Arial"/>
+          <w:b/>
+          <w:bCs/>
+          <w:color w:val="1F4E79"/>
+          <w:sz w:val="26"/>
+          <w:szCs w:val="26"/>
+        </w:rPr>
+        <w:t xml:space="preserve">4.2 — Clone Manually (Alternative)</w:t>
       </w:r>
     </w:p>
     <w:p>
@@ -1281,64 +1500,7 @@
           <w:sz w:val="22"/>
           <w:szCs w:val="22"/>
         </w:rPr>
-        <w:t xml:space="preserve">If you see a version number (e.g. v18.x.x or higher), skip to Section 4.2.</w:t>
-      </w:r>
-    </w:p>
-    <w:p>
-      <w:pPr>
-        <w:spacing w:after="0" w:before="80"/>
-      </w:pPr>
-      <w:r>
-        <w:t xml:space="preserve"/>
-      </w:r>
-    </w:p>
-    <w:p>
-      <w:pPr>
-        <w:spacing w:after="80" w:before="80"/>
-      </w:pPr>
-      <w:r>
-        <w:rPr>
-          <w:rFonts w:ascii="Arial" w:cs="Arial" w:eastAsia="Arial" w:hAnsi="Arial"/>
-          <w:sz w:val="22"/>
-          <w:szCs w:val="22"/>
-        </w:rPr>
-        <w:t xml:space="preserve">If Node.js is not installed:</w:t>
-      </w:r>
-    </w:p>
-    <w:p>
-      <w:pPr>
-        <w:spacing w:after="0" w:before="60"/>
-      </w:pPr>
-      <w:r>
-        <w:t xml:space="preserve"/>
-      </w:r>
-    </w:p>
-    <w:p>
-      <w:pPr>
-        <w:pStyle w:val="ListParagraph"/>
-        <w:numPr>
-          <w:ilvl w:val="0"/>
-          <w:numId w:val="2"/>
-        </w:numPr>
-        <w:spacing w:after="60" w:before="60"/>
-      </w:pPr>
-      <w:r>
-        <w:rPr>
-          <w:rFonts w:ascii="Arial" w:cs="Arial" w:eastAsia="Arial" w:hAnsi="Arial"/>
-          <w:b/>
-          <w:bCs/>
-          <w:sz w:val="22"/>
-          <w:szCs w:val="22"/>
-        </w:rPr>
-        <w:t xml:space="preserve">macOS: </w:t>
-      </w:r>
-      <w:r>
-        <w:rPr>
-          <w:rFonts w:ascii="Arial" w:cs="Arial" w:eastAsia="Arial" w:hAnsi="Arial"/>
-          <w:sz w:val="22"/>
-          <w:szCs w:val="22"/>
-        </w:rPr>
-        <w:t xml:space="preserve">open Terminal (Cmd + Space, type Terminal) and run:</w:t>
+        <w:t xml:space="preserve">If you prefer, open Terminal (macOS: Cmd + Space, type Terminal) or Command Prompt (Windows: Win + R, type cmd) and run:</w:t>
       </w:r>
     </w:p>
     <w:p>
@@ -1354,48 +1516,86 @@
           <w:sz w:val="20"/>
           <w:szCs w:val="20"/>
         </w:rPr>
-        <w:t xml:space="preserve">brew install node</w:t>
-      </w:r>
-    </w:p>
-    <w:p>
-      <w:pPr>
-        <w:spacing w:after="0" w:before="40"/>
-      </w:pPr>
-      <w:r>
-        <w:t xml:space="preserve"/>
-      </w:r>
-    </w:p>
-    <w:p>
-      <w:pPr>
-        <w:pStyle w:val="ListParagraph"/>
-        <w:numPr>
-          <w:ilvl w:val="0"/>
-          <w:numId w:val="2"/>
-        </w:numPr>
-        <w:spacing w:after="60" w:before="60"/>
-      </w:pPr>
-      <w:r>
-        <w:rPr>
-          <w:rFonts w:ascii="Arial" w:cs="Arial" w:eastAsia="Arial" w:hAnsi="Arial"/>
-          <w:b/>
-          <w:bCs/>
-          <w:sz w:val="22"/>
-          <w:szCs w:val="22"/>
-        </w:rPr>
-        <w:t xml:space="preserve">Windows: </w:t>
-      </w:r>
-      <w:r>
-        <w:rPr>
-          <w:rFonts w:ascii="Arial" w:cs="Arial" w:eastAsia="Arial" w:hAnsi="Arial"/>
-          <w:sz w:val="22"/>
-          <w:szCs w:val="22"/>
-        </w:rPr>
-        <w:t xml:space="preserve">go to https://nodejs.org, download the LTS version, and run the installer</w:t>
-      </w:r>
-    </w:p>
-    <w:p>
-      <w:pPr>
-        <w:spacing w:after="0" w:before="120"/>
+        <w:t xml:space="preserve">git clone https://github.com/easvrm/Training-Package-for-Replication.git</w:t>
+      </w:r>
+    </w:p>
+    <w:p>
+      <w:pPr>
+        <w:spacing w:after="0" w:before="80"/>
+      </w:pPr>
+      <w:r>
+        <w:t xml:space="preserve"/>
+      </w:r>
+    </w:p>
+    <w:p>
+      <w:pPr>
+        <w:shd w:fill="EBF3FB" w:val="clear"/>
+        <w:spacing w:after="100" w:before="100"/>
+        <w:ind w:left="720"/>
+      </w:pPr>
+      <w:r>
+        <w:rPr>
+          <w:rFonts w:ascii="Arial" w:cs="Arial" w:eastAsia="Arial" w:hAnsi="Arial"/>
+          <w:b/>
+          <w:bCs/>
+          <w:i/>
+          <w:iCs/>
+          <w:color w:val="1F4E79"/>
+          <w:sz w:val="22"/>
+          <w:szCs w:val="22"/>
+        </w:rPr>
+        <w:t xml:space="preserve">Note: </w:t>
+      </w:r>
+      <w:r>
+        <w:rPr>
+          <w:rFonts w:ascii="Arial" w:cs="Arial" w:eastAsia="Arial" w:hAnsi="Arial"/>
+          <w:i/>
+          <w:iCs/>
+          <w:color w:val="444444"/>
+          <w:sz w:val="22"/>
+          <w:szCs w:val="22"/>
+        </w:rPr>
+        <w:t xml:space="preserve">You only need to clone the repository once. After that, use git pull to get updates.</w:t>
+      </w:r>
+    </w:p>
+    <w:p>
+      <w:r>
+        <w:br w:type="page"/>
+      </w:r>
+    </w:p>
+    <w:p>
+      <w:pPr>
+        <w:pStyle w:val="Heading1"/>
+        <w:spacing w:after="200" w:before="400"/>
+      </w:pPr>
+      <w:r>
+        <w:rPr>
+          <w:rFonts w:ascii="Arial" w:cs="Arial" w:eastAsia="Arial" w:hAnsi="Arial"/>
+          <w:b/>
+          <w:bCs/>
+          <w:color w:val="FFFFFF"/>
+          <w:sz w:val="32"/>
+          <w:szCs w:val="32"/>
+        </w:rPr>
+        <w:t xml:space="preserve">Section 5 — Daily Workflow</w:t>
+      </w:r>
+    </w:p>
+    <w:p>
+      <w:pPr>
+        <w:spacing w:after="80" w:before="80"/>
+      </w:pPr>
+      <w:r>
+        <w:rPr>
+          <w:rFonts w:ascii="Arial" w:cs="Arial" w:eastAsia="Arial" w:hAnsi="Arial"/>
+          <w:sz w:val="22"/>
+          <w:szCs w:val="22"/>
+        </w:rPr>
+        <w:t xml:space="preserve">This is the process you will follow every time you want to make changes. You can do everything by talking to Claude in plain English — no need to memorize commands.</w:t>
+      </w:r>
+    </w:p>
+    <w:p>
+      <w:pPr>
+        <w:spacing w:after="0" w:before="100"/>
       </w:pPr>
       <w:r>
         <w:t xml:space="preserve"/>
@@ -1415,43 +1615,97 @@
           <w:sz w:val="26"/>
           <w:szCs w:val="26"/>
         </w:rPr>
-        <w:t xml:space="preserve">4.2 — Install Claude Code</w:t>
-      </w:r>
-    </w:p>
-    <w:p>
-      <w:pPr>
-        <w:pStyle w:val="ListParagraph"/>
-        <w:numPr>
-          <w:ilvl w:val="0"/>
-          <w:numId w:val="8"/>
-        </w:numPr>
-        <w:spacing w:after="60" w:before="60"/>
-      </w:pPr>
-      <w:r>
-        <w:rPr>
-          <w:rFonts w:ascii="Arial" w:cs="Arial" w:eastAsia="Arial" w:hAnsi="Arial"/>
-          <w:sz w:val="22"/>
-          <w:szCs w:val="22"/>
-        </w:rPr>
-        <w:t xml:space="preserve">Open Terminal (macOS) or Command Prompt (Windows)</w:t>
-      </w:r>
-    </w:p>
-    <w:p>
-      <w:pPr>
-        <w:pStyle w:val="ListParagraph"/>
-        <w:numPr>
-          <w:ilvl w:val="0"/>
-          <w:numId w:val="8"/>
-        </w:numPr>
-        <w:spacing w:after="60" w:before="60"/>
-      </w:pPr>
-      <w:r>
-        <w:rPr>
-          <w:rFonts w:ascii="Arial" w:cs="Arial" w:eastAsia="Arial" w:hAnsi="Arial"/>
-          <w:sz w:val="22"/>
-          <w:szCs w:val="22"/>
-        </w:rPr>
-        <w:t xml:space="preserve">Run the following command:</w:t>
+        <w:t xml:space="preserve">Step 1 — Open Claude</w:t>
+      </w:r>
+    </w:p>
+    <w:p>
+      <w:pPr>
+        <w:spacing w:after="80" w:before="80"/>
+      </w:pPr>
+      <w:r>
+        <w:rPr>
+          <w:rFonts w:ascii="Arial" w:cs="Arial" w:eastAsia="Arial" w:hAnsi="Arial"/>
+          <w:sz w:val="22"/>
+          <w:szCs w:val="22"/>
+        </w:rPr>
+        <w:t xml:space="preserve">Open the Claude native app on your computer. Make sure the GitHub connector is active (see Section 3).</w:t>
+      </w:r>
+    </w:p>
+    <w:p>
+      <w:pPr>
+        <w:spacing w:after="0" w:before="80"/>
+      </w:pPr>
+      <w:r>
+        <w:t xml:space="preserve"/>
+      </w:r>
+    </w:p>
+    <w:p>
+      <w:pPr>
+        <w:shd w:fill="EAF7EA" w:val="clear"/>
+        <w:spacing w:after="100" w:before="100"/>
+        <w:ind w:left="720"/>
+      </w:pPr>
+      <w:r>
+        <w:rPr>
+          <w:rFonts w:ascii="Arial" w:cs="Arial" w:eastAsia="Arial" w:hAnsi="Arial"/>
+          <w:b/>
+          <w:bCs/>
+          <w:i/>
+          <w:iCs/>
+          <w:color w:val="276221"/>
+          <w:sz w:val="22"/>
+          <w:szCs w:val="22"/>
+        </w:rPr>
+        <w:t xml:space="preserve">Tip: </w:t>
+      </w:r>
+      <w:r>
+        <w:rPr>
+          <w:rFonts w:ascii="Arial" w:cs="Arial" w:eastAsia="Arial" w:hAnsi="Arial"/>
+          <w:i/>
+          <w:iCs/>
+          <w:color w:val="444444"/>
+          <w:sz w:val="22"/>
+          <w:szCs w:val="22"/>
+        </w:rPr>
+        <w:t xml:space="preserve">You can also use the web version at claude.ai if you prefer to work from your browser.</w:t>
+      </w:r>
+    </w:p>
+    <w:p>
+      <w:pPr>
+        <w:spacing w:after="0" w:before="120"/>
+      </w:pPr>
+      <w:r>
+        <w:t xml:space="preserve"/>
+      </w:r>
+    </w:p>
+    <w:p>
+      <w:pPr>
+        <w:pStyle w:val="Heading2"/>
+        <w:spacing w:after="140" w:before="280"/>
+      </w:pPr>
+      <w:r>
+        <w:rPr>
+          <w:rFonts w:ascii="Arial" w:cs="Arial" w:eastAsia="Arial" w:hAnsi="Arial"/>
+          <w:b/>
+          <w:bCs/>
+          <w:color w:val="1F4E79"/>
+          <w:sz w:val="26"/>
+          <w:szCs w:val="26"/>
+        </w:rPr>
+        <w:t xml:space="preserve">Step 2 — Pull the Latest Version</w:t>
+      </w:r>
+    </w:p>
+    <w:p>
+      <w:pPr>
+        <w:spacing w:after="80" w:before="80"/>
+      </w:pPr>
+      <w:r>
+        <w:rPr>
+          <w:rFonts w:ascii="Arial" w:cs="Arial" w:eastAsia="Arial" w:hAnsi="Arial"/>
+          <w:sz w:val="22"/>
+          <w:szCs w:val="22"/>
+        </w:rPr>
+        <w:t xml:space="preserve">Always start by asking Claude to get the latest changes:</w:t>
       </w:r>
     </w:p>
     <w:p>
@@ -1467,43 +1721,20 @@
           <w:sz w:val="20"/>
           <w:szCs w:val="20"/>
         </w:rPr>
-        <w:t xml:space="preserve">npm install -g @anthropic-ai/claude-code</w:t>
-      </w:r>
-    </w:p>
-    <w:p>
-      <w:pPr>
-        <w:pStyle w:val="ListParagraph"/>
-        <w:numPr>
-          <w:ilvl w:val="0"/>
-          <w:numId w:val="8"/>
-        </w:numPr>
-        <w:spacing w:after="60" w:before="60"/>
-      </w:pPr>
-      <w:r>
-        <w:rPr>
-          <w:rFonts w:ascii="Arial" w:cs="Arial" w:eastAsia="Arial" w:hAnsi="Arial"/>
-          <w:sz w:val="22"/>
-          <w:szCs w:val="22"/>
-        </w:rPr>
-        <w:t xml:space="preserve">Wait for the installation to complete</w:t>
-      </w:r>
-    </w:p>
-    <w:p>
-      <w:pPr>
-        <w:pStyle w:val="ListParagraph"/>
-        <w:numPr>
-          <w:ilvl w:val="0"/>
-          <w:numId w:val="8"/>
-        </w:numPr>
-        <w:spacing w:after="60" w:before="60"/>
-      </w:pPr>
-      <w:r>
-        <w:rPr>
-          <w:rFonts w:ascii="Arial" w:cs="Arial" w:eastAsia="Arial" w:hAnsi="Arial"/>
-          <w:sz w:val="22"/>
-          <w:szCs w:val="22"/>
-        </w:rPr>
-        <w:t xml:space="preserve">Verify it installed correctly:</w:t>
+        <w:t xml:space="preserve">Pull the latest version of the project from GitHub</w:t>
+      </w:r>
+    </w:p>
+    <w:p>
+      <w:pPr>
+        <w:spacing w:after="80" w:before="80"/>
+      </w:pPr>
+      <w:r>
+        <w:rPr>
+          <w:rFonts w:ascii="Arial" w:cs="Arial" w:eastAsia="Arial" w:hAnsi="Arial"/>
+          <w:sz w:val="22"/>
+          <w:szCs w:val="22"/>
+        </w:rPr>
+        <w:t xml:space="preserve">Or run directly:</w:t>
       </w:r>
     </w:p>
     <w:p>
@@ -1519,12 +1750,51 @@
           <w:sz w:val="20"/>
           <w:szCs w:val="20"/>
         </w:rPr>
-        <w:t xml:space="preserve">claude --version</w:t>
-      </w:r>
-    </w:p>
-    <w:p>
-      <w:pPr>
-        <w:spacing w:after="0" w:before="100"/>
+        <w:t xml:space="preserve">git pull origin master</w:t>
+      </w:r>
+    </w:p>
+    <w:p>
+      <w:pPr>
+        <w:spacing w:after="0" w:before="80"/>
+      </w:pPr>
+      <w:r>
+        <w:t xml:space="preserve"/>
+      </w:r>
+    </w:p>
+    <w:p>
+      <w:pPr>
+        <w:shd w:fill="EBF3FB" w:val="clear"/>
+        <w:spacing w:after="100" w:before="100"/>
+        <w:ind w:left="720"/>
+      </w:pPr>
+      <w:r>
+        <w:rPr>
+          <w:rFonts w:ascii="Arial" w:cs="Arial" w:eastAsia="Arial" w:hAnsi="Arial"/>
+          <w:b/>
+          <w:bCs/>
+          <w:i/>
+          <w:iCs/>
+          <w:color w:val="1F4E79"/>
+          <w:sz w:val="22"/>
+          <w:szCs w:val="22"/>
+        </w:rPr>
+        <w:t xml:space="preserve">Note: </w:t>
+      </w:r>
+      <w:r>
+        <w:rPr>
+          <w:rFonts w:ascii="Arial" w:cs="Arial" w:eastAsia="Arial" w:hAnsi="Arial"/>
+          <w:i/>
+          <w:iCs/>
+          <w:color w:val="444444"/>
+          <w:sz w:val="22"/>
+          <w:szCs w:val="22"/>
+        </w:rPr>
+        <w:t xml:space="preserve">Never skip this step. It ensures you have the most up-to-date version before making changes.</w:t>
+      </w:r>
+    </w:p>
+    <w:p>
+      <w:pPr>
+        <w:spacing w:after="0" w:before="120"/>
       </w:pPr>
       <w:r>
         <w:t xml:space="preserve"/>
@@ -1544,25 +1814,20 @@
           <w:sz w:val="26"/>
           <w:szCs w:val="26"/>
         </w:rPr>
-        <w:t xml:space="preserve">4.3 — First Launch and Login</w:t>
-      </w:r>
-    </w:p>
-    <w:p>
-      <w:pPr>
-        <w:pStyle w:val="ListParagraph"/>
-        <w:numPr>
-          <w:ilvl w:val="0"/>
-          <w:numId w:val="9"/>
-        </w:numPr>
-        <w:spacing w:after="60" w:before="60"/>
-      </w:pPr>
-      <w:r>
-        <w:rPr>
-          <w:rFonts w:ascii="Arial" w:cs="Arial" w:eastAsia="Arial" w:hAnsi="Arial"/>
-          <w:sz w:val="22"/>
-          <w:szCs w:val="22"/>
-        </w:rPr>
-        <w:t xml:space="preserve">In Terminal or Command Prompt, run:</w:t>
+        <w:t xml:space="preserve">Step 3 — Create Your Working Branch</w:t>
+      </w:r>
+    </w:p>
+    <w:p>
+      <w:pPr>
+        <w:spacing w:after="80" w:before="80"/>
+      </w:pPr>
+      <w:r>
+        <w:rPr>
+          <w:rFonts w:ascii="Arial" w:cs="Arial" w:eastAsia="Arial" w:hAnsi="Arial"/>
+          <w:sz w:val="22"/>
+          <w:szCs w:val="22"/>
+        </w:rPr>
+        <w:t xml:space="preserve">Ask Claude to create a branch for your work:</w:t>
       </w:r>
     </w:p>
     <w:p>
@@ -1578,107 +1843,7 @@
           <w:sz w:val="20"/>
           <w:szCs w:val="20"/>
         </w:rPr>
-        <w:t xml:space="preserve">claude</w:t>
-      </w:r>
-    </w:p>
-    <w:p>
-      <w:pPr>
-        <w:pStyle w:val="ListParagraph"/>
-        <w:numPr>
-          <w:ilvl w:val="0"/>
-          <w:numId w:val="9"/>
-        </w:numPr>
-        <w:spacing w:after="60" w:before="60"/>
-      </w:pPr>
-      <w:r>
-        <w:rPr>
-          <w:rFonts w:ascii="Arial" w:cs="Arial" w:eastAsia="Arial" w:hAnsi="Arial"/>
-          <w:sz w:val="22"/>
-          <w:szCs w:val="22"/>
-        </w:rPr>
-        <w:t xml:space="preserve">Follow the on-screen prompts to log in with your Claude (Anthropic) account</w:t>
-      </w:r>
-    </w:p>
-    <w:p>
-      <w:pPr>
-        <w:pStyle w:val="ListParagraph"/>
-        <w:numPr>
-          <w:ilvl w:val="0"/>
-          <w:numId w:val="9"/>
-        </w:numPr>
-        <w:spacing w:after="60" w:before="60"/>
-      </w:pPr>
-      <w:r>
-        <w:rPr>
-          <w:rFonts w:ascii="Arial" w:cs="Arial" w:eastAsia="Arial" w:hAnsi="Arial"/>
-          <w:sz w:val="22"/>
-          <w:szCs w:val="22"/>
-        </w:rPr>
-        <w:t xml:space="preserve">Once logged in, Claude Code is ready to use</w:t>
-      </w:r>
-    </w:p>
-    <w:p>
-      <w:pPr>
-        <w:spacing w:after="0" w:before="80"/>
-      </w:pPr>
-      <w:r>
-        <w:t xml:space="preserve"/>
-      </w:r>
-    </w:p>
-    <w:p>
-      <w:pPr>
-        <w:shd w:fill="EBF3FB" w:val="clear"/>
-        <w:spacing w:after="100" w:before="100"/>
-        <w:ind w:left="720"/>
-      </w:pPr>
-      <w:r>
-        <w:rPr>
-          <w:rFonts w:ascii="Arial" w:cs="Arial" w:eastAsia="Arial" w:hAnsi="Arial"/>
-          <w:b/>
-          <w:bCs/>
-          <w:i/>
-          <w:iCs/>
-          <w:color w:val="1F4E79"/>
-          <w:sz w:val="22"/>
-          <w:szCs w:val="22"/>
-        </w:rPr>
-        <w:t xml:space="preserve">Note: </w:t>
-      </w:r>
-      <w:r>
-        <w:rPr>
-          <w:rFonts w:ascii="Arial" w:cs="Arial" w:eastAsia="Arial" w:hAnsi="Arial"/>
-          <w:i/>
-          <w:iCs/>
-          <w:color w:val="444444"/>
-          <w:sz w:val="22"/>
-          <w:szCs w:val="22"/>
-        </w:rPr>
-        <w:t xml:space="preserve">Use the same email and password you used to sign up at claude.ai.</w:t>
-      </w:r>
-    </w:p>
-    <w:p>
-      <w:pPr>
-        <w:spacing w:after="0" w:before="100"/>
-      </w:pPr>
-      <w:r>
-        <w:t xml:space="preserve"/>
-      </w:r>
-    </w:p>
-    <w:p>
-      <w:pPr>
-        <w:pStyle w:val="Heading2"/>
-        <w:spacing w:after="140" w:before="280"/>
-      </w:pPr>
-      <w:r>
-        <w:rPr>
-          <w:rFonts w:ascii="Arial" w:cs="Arial" w:eastAsia="Arial" w:hAnsi="Arial"/>
-          <w:b/>
-          <w:bCs/>
-          <w:color w:val="1F4E79"/>
-          <w:sz w:val="26"/>
-          <w:szCs w:val="26"/>
-        </w:rPr>
-        <w:t xml:space="preserve">4.4 — Connect the GitHub Connector in Claude Code</w:t>
+        <w:t xml:space="preserve">Create a new branch called feature/your-name-topic</w:t>
       </w:r>
     </w:p>
     <w:p>
@@ -1691,33 +1856,7 @@
           <w:sz w:val="22"/>
           <w:szCs w:val="22"/>
         </w:rPr>
-        <w:t xml:space="preserve">Just like in the web version, you need to connect the GitHub connector inside Claude Code:</w:t>
-      </w:r>
-    </w:p>
-    <w:p>
-      <w:pPr>
-        <w:spacing w:after="0" w:before="60"/>
-      </w:pPr>
-      <w:r>
-        <w:t xml:space="preserve"/>
-      </w:r>
-    </w:p>
-    <w:p>
-      <w:pPr>
-        <w:pStyle w:val="ListParagraph"/>
-        <w:numPr>
-          <w:ilvl w:val="0"/>
-          <w:numId w:val="10"/>
-        </w:numPr>
-        <w:spacing w:after="60" w:before="60"/>
-      </w:pPr>
-      <w:r>
-        <w:rPr>
-          <w:rFonts w:ascii="Arial" w:cs="Arial" w:eastAsia="Arial" w:hAnsi="Arial"/>
-          <w:sz w:val="22"/>
-          <w:szCs w:val="22"/>
-        </w:rPr>
-        <w:t xml:space="preserve">Launch Claude Code in your project folder:</w:t>
+        <w:t xml:space="preserve">Example:</w:t>
       </w:r>
     </w:p>
     <w:p>
@@ -1733,25 +1872,28 @@
           <w:sz w:val="20"/>
           <w:szCs w:val="20"/>
         </w:rPr>
-        <w:t xml:space="preserve">claude</w:t>
-      </w:r>
-    </w:p>
-    <w:p>
-      <w:pPr>
-        <w:pStyle w:val="ListParagraph"/>
-        <w:numPr>
-          <w:ilvl w:val="0"/>
-          <w:numId w:val="10"/>
-        </w:numPr>
-        <w:spacing w:after="60" w:before="60"/>
-      </w:pPr>
-      <w:r>
-        <w:rPr>
-          <w:rFonts w:ascii="Arial" w:cs="Arial" w:eastAsia="Arial" w:hAnsi="Arial"/>
-          <w:sz w:val="22"/>
-          <w:szCs w:val="22"/>
-        </w:rPr>
-        <w:t xml:space="preserve">Type the following to trigger connector setup:</w:t>
+        <w:t xml:space="preserve">Create a new branch called feature/alice-module2-update</w:t>
+      </w:r>
+    </w:p>
+    <w:p>
+      <w:pPr>
+        <w:spacing w:after="0" w:before="80"/>
+      </w:pPr>
+      <w:r>
+        <w:t xml:space="preserve"/>
+      </w:r>
+    </w:p>
+    <w:p>
+      <w:pPr>
+        <w:spacing w:after="80" w:before="80"/>
+      </w:pPr>
+      <w:r>
+        <w:rPr>
+          <w:rFonts w:ascii="Arial" w:cs="Arial" w:eastAsia="Arial" w:hAnsi="Arial"/>
+          <w:sz w:val="22"/>
+          <w:szCs w:val="22"/>
+        </w:rPr>
+        <w:t xml:space="preserve">Or run directly:</w:t>
       </w:r>
     </w:p>
     <w:p>
@@ -1767,140 +1909,12 @@
           <w:sz w:val="20"/>
           <w:szCs w:val="20"/>
         </w:rPr>
-        <w:t xml:space="preserve">/connectors</w:t>
-      </w:r>
-    </w:p>
-    <w:p>
-      <w:pPr>
-        <w:pStyle w:val="ListParagraph"/>
-        <w:numPr>
-          <w:ilvl w:val="0"/>
-          <w:numId w:val="10"/>
-        </w:numPr>
-        <w:spacing w:after="60" w:before="60"/>
-      </w:pPr>
-      <w:r>
-        <w:rPr>
-          <w:rFonts w:ascii="Arial" w:cs="Arial" w:eastAsia="Arial" w:hAnsi="Arial"/>
-          <w:sz w:val="22"/>
-          <w:szCs w:val="22"/>
-        </w:rPr>
-        <w:t xml:space="preserve">Select GitHub from the list of available connectors</w:t>
-      </w:r>
-    </w:p>
-    <w:p>
-      <w:pPr>
-        <w:pStyle w:val="ListParagraph"/>
-        <w:numPr>
-          <w:ilvl w:val="0"/>
-          <w:numId w:val="10"/>
-        </w:numPr>
-        <w:spacing w:after="60" w:before="60"/>
-      </w:pPr>
-      <w:r>
-        <w:rPr>
-          <w:rFonts w:ascii="Arial" w:cs="Arial" w:eastAsia="Arial" w:hAnsi="Arial"/>
-          <w:sz w:val="22"/>
-          <w:szCs w:val="22"/>
-        </w:rPr>
-        <w:t xml:space="preserve">Follow the authorization steps (same as Section 3.2)</w:t>
-      </w:r>
-    </w:p>
-    <w:p>
-      <w:pPr>
-        <w:pStyle w:val="ListParagraph"/>
-        <w:numPr>
-          <w:ilvl w:val="0"/>
-          <w:numId w:val="10"/>
-        </w:numPr>
-        <w:spacing w:after="60" w:before="60"/>
-      </w:pPr>
-      <w:r>
-        <w:rPr>
-          <w:rFonts w:ascii="Arial" w:cs="Arial" w:eastAsia="Arial" w:hAnsi="Arial"/>
-          <w:sz w:val="22"/>
-          <w:szCs w:val="22"/>
-        </w:rPr>
-        <w:t xml:space="preserve">Once authorized, Claude Code can read and write to your GitHub repositories</w:t>
-      </w:r>
-    </w:p>
-    <w:p>
-      <w:pPr>
-        <w:spacing w:after="0" w:before="80"/>
-      </w:pPr>
-      <w:r>
-        <w:t xml:space="preserve"/>
-      </w:r>
-    </w:p>
-    <w:p>
-      <w:pPr>
-        <w:shd w:fill="EAF7EA" w:val="clear"/>
-        <w:spacing w:after="100" w:before="100"/>
-        <w:ind w:left="720"/>
-      </w:pPr>
-      <w:r>
-        <w:rPr>
-          <w:rFonts w:ascii="Arial" w:cs="Arial" w:eastAsia="Arial" w:hAnsi="Arial"/>
-          <w:b/>
-          <w:bCs/>
-          <w:i/>
-          <w:iCs/>
-          <w:color w:val="276221"/>
-          <w:sz w:val="22"/>
-          <w:szCs w:val="22"/>
-        </w:rPr>
-        <w:t xml:space="preserve">Tip: </w:t>
-      </w:r>
-      <w:r>
-        <w:rPr>
-          <w:rFonts w:ascii="Arial" w:cs="Arial" w:eastAsia="Arial" w:hAnsi="Arial"/>
-          <w:i/>
-          <w:iCs/>
-          <w:color w:val="444444"/>
-          <w:sz w:val="22"/>
-          <w:szCs w:val="22"/>
-        </w:rPr>
-        <w:t xml:space="preserve">You only need to connect the GitHub connector once. It will remain connected for future sessions.</w:t>
-      </w:r>
-    </w:p>
-    <w:p>
-      <w:r>
-        <w:br w:type="page"/>
-      </w:r>
-    </w:p>
-    <w:p>
-      <w:pPr>
-        <w:pStyle w:val="Heading1"/>
-        <w:spacing w:after="200" w:before="400"/>
-      </w:pPr>
-      <w:r>
-        <w:rPr>
-          <w:rFonts w:ascii="Arial" w:cs="Arial" w:eastAsia="Arial" w:hAnsi="Arial"/>
-          <w:b/>
-          <w:bCs/>
-          <w:color w:val="FFFFFF"/>
-          <w:sz w:val="32"/>
-          <w:szCs w:val="32"/>
-        </w:rPr>
-        <w:t xml:space="preserve">Section 5 — Clone the Repository</w:t>
-      </w:r>
-    </w:p>
-    <w:p>
-      <w:pPr>
-        <w:spacing w:after="80" w:before="80"/>
-      </w:pPr>
-      <w:r>
-        <w:rPr>
-          <w:rFonts w:ascii="Arial" w:cs="Arial" w:eastAsia="Arial" w:hAnsi="Arial"/>
-          <w:sz w:val="22"/>
-          <w:szCs w:val="22"/>
-        </w:rPr>
-        <w:t xml:space="preserve">Cloning means downloading a copy of the project to your computer so you can work on it locally.</w:t>
-      </w:r>
-    </w:p>
-    <w:p>
-      <w:pPr>
-        <w:spacing w:after="0" w:before="100"/>
+        <w:t xml:space="preserve">git checkout -b feature/your-name-topic</w:t>
+      </w:r>
+    </w:p>
+    <w:p>
+      <w:pPr>
+        <w:spacing w:after="0" w:before="120"/>
       </w:pPr>
       <w:r>
         <w:t xml:space="preserve"/>
@@ -1920,7 +1934,7 @@
           <w:sz w:val="26"/>
           <w:szCs w:val="26"/>
         </w:rPr>
-        <w:t xml:space="preserve">5.1 — Clone via Claude Code</w:t>
+        <w:t xml:space="preserve">Step 4 — Make Your Changes Using Claude</w:t>
       </w:r>
     </w:p>
     <w:p>
@@ -1933,7 +1947,7 @@
           <w:sz w:val="22"/>
           <w:szCs w:val="22"/>
         </w:rPr>
-        <w:t xml:space="preserve">The easiest way to clone the repository is to ask Claude directly inside Claude Code:</w:t>
+        <w:t xml:space="preserve">Ask Claude for help in plain English. For example:</w:t>
       </w:r>
     </w:p>
     <w:p>
@@ -1949,17 +1963,112 @@
         <w:pStyle w:val="ListParagraph"/>
         <w:numPr>
           <w:ilvl w:val="0"/>
-          <w:numId w:val="11"/>
-        </w:numPr>
-        <w:spacing w:after="60" w:before="60"/>
-      </w:pPr>
-      <w:r>
-        <w:rPr>
-          <w:rFonts w:ascii="Arial" w:cs="Arial" w:eastAsia="Arial" w:hAnsi="Arial"/>
-          <w:sz w:val="22"/>
-          <w:szCs w:val="22"/>
-        </w:rPr>
-        <w:t xml:space="preserve">Open Terminal and launch Claude Code:</w:t>
+          <w:numId w:val="2"/>
+        </w:numPr>
+        <w:spacing w:after="60" w:before="60"/>
+      </w:pPr>
+      <w:r>
+        <w:rPr>
+          <w:rFonts w:ascii="Arial" w:cs="Arial" w:eastAsia="Arial" w:hAnsi="Arial"/>
+          <w:sz w:val="22"/>
+          <w:szCs w:val="22"/>
+        </w:rPr>
+        <w:t xml:space="preserve">"Update the introduction text in songa-docs.html to mention the new module"</w:t>
+      </w:r>
+    </w:p>
+    <w:p>
+      <w:pPr>
+        <w:pStyle w:val="ListParagraph"/>
+        <w:numPr>
+          <w:ilvl w:val="0"/>
+          <w:numId w:val="2"/>
+        </w:numPr>
+        <w:spacing w:after="60" w:before="60"/>
+      </w:pPr>
+      <w:r>
+        <w:rPr>
+          <w:rFonts w:ascii="Arial" w:cs="Arial" w:eastAsia="Arial" w:hAnsi="Arial"/>
+          <w:sz w:val="22"/>
+          <w:szCs w:val="22"/>
+        </w:rPr>
+        <w:t xml:space="preserve">"Fix the broken image reference on page 5"</w:t>
+      </w:r>
+    </w:p>
+    <w:p>
+      <w:pPr>
+        <w:pStyle w:val="ListParagraph"/>
+        <w:numPr>
+          <w:ilvl w:val="0"/>
+          <w:numId w:val="2"/>
+        </w:numPr>
+        <w:spacing w:after="60" w:before="60"/>
+      </w:pPr>
+      <w:r>
+        <w:rPr>
+          <w:rFonts w:ascii="Arial" w:cs="Arial" w:eastAsia="Arial" w:hAnsi="Arial"/>
+          <w:sz w:val="22"/>
+          <w:szCs w:val="22"/>
+        </w:rPr>
+        <w:t xml:space="preserve">"Add a new section about field data collection after the overview"</w:t>
+      </w:r>
+    </w:p>
+    <w:p>
+      <w:pPr>
+        <w:spacing w:after="0" w:before="60"/>
+      </w:pPr>
+      <w:r>
+        <w:t xml:space="preserve"/>
+      </w:r>
+    </w:p>
+    <w:p>
+      <w:pPr>
+        <w:spacing w:after="80" w:before="80"/>
+      </w:pPr>
+      <w:r>
+        <w:rPr>
+          <w:rFonts w:ascii="Arial" w:cs="Arial" w:eastAsia="Arial" w:hAnsi="Arial"/>
+          <w:sz w:val="22"/>
+          <w:szCs w:val="22"/>
+        </w:rPr>
+        <w:t xml:space="preserve">Claude will read the files, suggest changes, and apply them for you. Review the changes before moving to the next step.</w:t>
+      </w:r>
+    </w:p>
+    <w:p>
+      <w:pPr>
+        <w:spacing w:after="0" w:before="120"/>
+      </w:pPr>
+      <w:r>
+        <w:t xml:space="preserve"/>
+      </w:r>
+    </w:p>
+    <w:p>
+      <w:pPr>
+        <w:pStyle w:val="Heading2"/>
+        <w:spacing w:after="140" w:before="280"/>
+      </w:pPr>
+      <w:r>
+        <w:rPr>
+          <w:rFonts w:ascii="Arial" w:cs="Arial" w:eastAsia="Arial" w:hAnsi="Arial"/>
+          <w:b/>
+          <w:bCs/>
+          <w:color w:val="1F4E79"/>
+          <w:sz w:val="26"/>
+          <w:szCs w:val="26"/>
+        </w:rPr>
+        <w:t xml:space="preserve">Step 5 — Commit Your Changes</w:t>
+      </w:r>
+    </w:p>
+    <w:p>
+      <w:pPr>
+        <w:spacing w:after="80" w:before="80"/>
+      </w:pPr>
+      <w:r>
+        <w:rPr>
+          <w:rFonts w:ascii="Arial" w:cs="Arial" w:eastAsia="Arial" w:hAnsi="Arial"/>
+          <w:sz w:val="22"/>
+          <w:szCs w:val="22"/>
+        </w:rPr>
+        <w:t xml:space="preserve">Ask Claude to save your work:</w:t>
       </w:r>
     </w:p>
     <w:p>
@@ -1975,25 +2084,20 @@
           <w:sz w:val="20"/>
           <w:szCs w:val="20"/>
         </w:rPr>
-        <w:t xml:space="preserve">claude</w:t>
-      </w:r>
-    </w:p>
-    <w:p>
-      <w:pPr>
-        <w:pStyle w:val="ListParagraph"/>
-        <w:numPr>
-          <w:ilvl w:val="0"/>
-          <w:numId w:val="11"/>
-        </w:numPr>
-        <w:spacing w:after="60" w:before="60"/>
-      </w:pPr>
-      <w:r>
-        <w:rPr>
-          <w:rFonts w:ascii="Arial" w:cs="Arial" w:eastAsia="Arial" w:hAnsi="Arial"/>
-          <w:sz w:val="22"/>
-          <w:szCs w:val="22"/>
-        </w:rPr>
-        <w:t xml:space="preserve">Ask Claude to clone the repository for you:</w:t>
+        <w:t xml:space="preserve">Commit my changes with the message: Add facilitator notes to Module 3</w:t>
+      </w:r>
+    </w:p>
+    <w:p>
+      <w:pPr>
+        <w:spacing w:after="80" w:before="80"/>
+      </w:pPr>
+      <w:r>
+        <w:rPr>
+          <w:rFonts w:ascii="Arial" w:cs="Arial" w:eastAsia="Arial" w:hAnsi="Arial"/>
+          <w:sz w:val="22"/>
+          <w:szCs w:val="22"/>
+        </w:rPr>
+        <w:t xml:space="preserve">Or run directly:</w:t>
       </w:r>
     </w:p>
     <w:p>
@@ -2009,43 +2113,7 @@
           <w:sz w:val="20"/>
           <w:szCs w:val="20"/>
         </w:rPr>
-        <w:t xml:space="preserve">Clone the easvrm/Training-Package-for-Replication repository into my Documents folder</w:t>
-      </w:r>
-    </w:p>
-    <w:p>
-      <w:pPr>
-        <w:pStyle w:val="ListParagraph"/>
-        <w:numPr>
-          <w:ilvl w:val="0"/>
-          <w:numId w:val="11"/>
-        </w:numPr>
-        <w:spacing w:after="60" w:before="60"/>
-      </w:pPr>
-      <w:r>
-        <w:rPr>
-          <w:rFonts w:ascii="Arial" w:cs="Arial" w:eastAsia="Arial" w:hAnsi="Arial"/>
-          <w:sz w:val="22"/>
-          <w:szCs w:val="22"/>
-        </w:rPr>
-        <w:t xml:space="preserve">Claude will run the necessary commands and confirm when done</w:t>
-      </w:r>
-    </w:p>
-    <w:p>
-      <w:pPr>
-        <w:pStyle w:val="ListParagraph"/>
-        <w:numPr>
-          <w:ilvl w:val="0"/>
-          <w:numId w:val="11"/>
-        </w:numPr>
-        <w:spacing w:after="60" w:before="60"/>
-      </w:pPr>
-      <w:r>
-        <w:rPr>
-          <w:rFonts w:ascii="Arial" w:cs="Arial" w:eastAsia="Arial" w:hAnsi="Arial"/>
-          <w:sz w:val="22"/>
-          <w:szCs w:val="22"/>
-        </w:rPr>
-        <w:t xml:space="preserve">Navigate into the project folder:</w:t>
+        <w:t xml:space="preserve">git add .</w:t>
       </w:r>
     </w:p>
     <w:p>
@@ -2061,12 +2129,12 @@
           <w:sz w:val="20"/>
           <w:szCs w:val="20"/>
         </w:rPr>
-        <w:t xml:space="preserve">cd ~/Documents/Training-Package-for-Replication</w:t>
-      </w:r>
-    </w:p>
-    <w:p>
-      <w:pPr>
-        <w:spacing w:after="0" w:before="100"/>
+        <w:t xml:space="preserve">git commit -m "Brief description of your change"</w:t>
+      </w:r>
+    </w:p>
+    <w:p>
+      <w:pPr>
+        <w:spacing w:after="0" w:before="120"/>
       </w:pPr>
       <w:r>
         <w:t xml:space="preserve"/>
@@ -2086,7 +2154,7 @@
           <w:sz w:val="26"/>
           <w:szCs w:val="26"/>
         </w:rPr>
-        <w:t xml:space="preserve">5.2 — Clone Manually (Alternative)</w:t>
+        <w:t xml:space="preserve">Step 6 — Push Your Branch to GitHub</w:t>
       </w:r>
     </w:p>
     <w:p>
@@ -2099,7 +2167,7 @@
           <w:sz w:val="22"/>
           <w:szCs w:val="22"/>
         </w:rPr>
-        <w:t xml:space="preserve">If you prefer to clone manually, open Terminal and run:</w:t>
+        <w:t xml:space="preserve">Ask Claude to upload your branch:</w:t>
       </w:r>
     </w:p>
     <w:p>
@@ -2115,68 +2183,7 @@
           <w:sz w:val="20"/>
           <w:szCs w:val="20"/>
         </w:rPr>
-        <w:t xml:space="preserve">git clone https://github.com/easvrm/Training-Package-for-Replication.git</w:t>
-      </w:r>
-    </w:p>
-    <w:p>
-      <w:pPr>
-        <w:spacing w:after="0" w:before="80"/>
-      </w:pPr>
-      <w:r>
-        <w:t xml:space="preserve"/>
-      </w:r>
-    </w:p>
-    <w:p>
-      <w:pPr>
-        <w:shd w:fill="EBF3FB" w:val="clear"/>
-        <w:spacing w:after="100" w:before="100"/>
-        <w:ind w:left="720"/>
-      </w:pPr>
-      <w:r>
-        <w:rPr>
-          <w:rFonts w:ascii="Arial" w:cs="Arial" w:eastAsia="Arial" w:hAnsi="Arial"/>
-          <w:b/>
-          <w:bCs/>
-          <w:i/>
-          <w:iCs/>
-          <w:color w:val="1F4E79"/>
-          <w:sz w:val="22"/>
-          <w:szCs w:val="22"/>
-        </w:rPr>
-        <w:t xml:space="preserve">Note: </w:t>
-      </w:r>
-      <w:r>
-        <w:rPr>
-          <w:rFonts w:ascii="Arial" w:cs="Arial" w:eastAsia="Arial" w:hAnsi="Arial"/>
-          <w:i/>
-          <w:iCs/>
-          <w:color w:val="444444"/>
-          <w:sz w:val="22"/>
-          <w:szCs w:val="22"/>
-        </w:rPr>
-        <w:t xml:space="preserve">You only need to clone the repository once. After that, use git pull to get updates.</w:t>
-      </w:r>
-    </w:p>
-    <w:p>
-      <w:r>
-        <w:br w:type="page"/>
-      </w:r>
-    </w:p>
-    <w:p>
-      <w:pPr>
-        <w:pStyle w:val="Heading1"/>
-        <w:spacing w:after="200" w:before="400"/>
-      </w:pPr>
-      <w:r>
-        <w:rPr>
-          <w:rFonts w:ascii="Arial" w:cs="Arial" w:eastAsia="Arial" w:hAnsi="Arial"/>
-          <w:b/>
-          <w:bCs/>
-          <w:color w:val="FFFFFF"/>
-          <w:sz w:val="32"/>
-          <w:szCs w:val="32"/>
-        </w:rPr>
-        <w:t xml:space="preserve">Section 6 — Daily Workflow</w:t>
+        <w:t xml:space="preserve">Push my branch to GitHub</w:t>
       </w:r>
     </w:p>
     <w:p>
@@ -2189,32 +2196,7 @@
           <w:sz w:val="22"/>
           <w:szCs w:val="22"/>
         </w:rPr>
-        <w:t xml:space="preserve">This is the process you will follow every time you want to make changes. You can do everything by talking to Claude in plain English — no need to memorize commands.</w:t>
-      </w:r>
-    </w:p>
-    <w:p>
-      <w:pPr>
-        <w:spacing w:after="0" w:before="100"/>
-      </w:pPr>
-      <w:r>
-        <w:t xml:space="preserve"/>
-      </w:r>
-    </w:p>
-    <w:p>
-      <w:pPr>
-        <w:pStyle w:val="Heading2"/>
-        <w:spacing w:after="140" w:before="280"/>
-      </w:pPr>
-      <w:r>
-        <w:rPr>
-          <w:rFonts w:ascii="Arial" w:cs="Arial" w:eastAsia="Arial" w:hAnsi="Arial"/>
-          <w:b/>
-          <w:bCs/>
-          <w:color w:val="1F4E79"/>
-          <w:sz w:val="26"/>
-          <w:szCs w:val="26"/>
-        </w:rPr>
-        <w:t xml:space="preserve">Step 1 — Open the Project in Claude Code</w:t>
+        <w:t xml:space="preserve">Or run directly:</w:t>
       </w:r>
     </w:p>
     <w:p>
@@ -2230,7 +2212,45 @@
           <w:sz w:val="20"/>
           <w:szCs w:val="20"/>
         </w:rPr>
-        <w:t xml:space="preserve">cd ~/Documents/Training-Package-for-Replication</w:t>
+        <w:t xml:space="preserve">git push origin feature/your-name-topic</w:t>
+      </w:r>
+    </w:p>
+    <w:p>
+      <w:pPr>
+        <w:spacing w:after="0" w:before="120"/>
+      </w:pPr>
+      <w:r>
+        <w:t xml:space="preserve"/>
+      </w:r>
+    </w:p>
+    <w:p>
+      <w:pPr>
+        <w:pStyle w:val="Heading2"/>
+        <w:spacing w:after="140" w:before="280"/>
+      </w:pPr>
+      <w:r>
+        <w:rPr>
+          <w:rFonts w:ascii="Arial" w:cs="Arial" w:eastAsia="Arial" w:hAnsi="Arial"/>
+          <w:b/>
+          <w:bCs/>
+          <w:color w:val="1F4E79"/>
+          <w:sz w:val="26"/>
+          <w:szCs w:val="26"/>
+        </w:rPr>
+        <w:t xml:space="preserve">Step 7 — Open a Pull Request</w:t>
+      </w:r>
+    </w:p>
+    <w:p>
+      <w:pPr>
+        <w:spacing w:after="80" w:before="80"/>
+      </w:pPr>
+      <w:r>
+        <w:rPr>
+          <w:rFonts w:ascii="Arial" w:cs="Arial" w:eastAsia="Arial" w:hAnsi="Arial"/>
+          <w:sz w:val="22"/>
+          <w:szCs w:val="22"/>
+        </w:rPr>
+        <w:t xml:space="preserve">Ask Claude to create a Pull Request for review:</w:t>
       </w:r>
     </w:p>
     <w:p>
@@ -2246,46 +2266,28 @@
           <w:sz w:val="20"/>
           <w:szCs w:val="20"/>
         </w:rPr>
-        <w:t xml:space="preserve">claude</w:t>
-      </w:r>
-    </w:p>
-    <w:p>
-      <w:pPr>
-        <w:spacing w:after="0" w:before="80"/>
-      </w:pPr>
-      <w:r>
-        <w:t xml:space="preserve"/>
-      </w:r>
-    </w:p>
-    <w:p>
-      <w:pPr>
-        <w:shd w:fill="EAF7EA" w:val="clear"/>
-        <w:spacing w:after="100" w:before="100"/>
-        <w:ind w:left="720"/>
-      </w:pPr>
-      <w:r>
-        <w:rPr>
-          <w:rFonts w:ascii="Arial" w:cs="Arial" w:eastAsia="Arial" w:hAnsi="Arial"/>
-          <w:b/>
-          <w:bCs/>
-          <w:i/>
-          <w:iCs/>
-          <w:color w:val="276221"/>
-          <w:sz w:val="22"/>
-          <w:szCs w:val="22"/>
-        </w:rPr>
-        <w:t xml:space="preserve">Tip: </w:t>
-      </w:r>
-      <w:r>
-        <w:rPr>
-          <w:rFonts w:ascii="Arial" w:cs="Arial" w:eastAsia="Arial" w:hAnsi="Arial"/>
-          <w:i/>
-          <w:iCs/>
-          <w:color w:val="444444"/>
-          <w:sz w:val="22"/>
-          <w:szCs w:val="22"/>
-        </w:rPr>
-        <w:t xml:space="preserve">You can also ask Claude via the web connector at claude.ai if you prefer not to use the terminal.</w:t>
+        <w:t xml:space="preserve">Open a pull request titled "Add Module 3 facilitator notes" with a short description of what I changed</w:t>
+      </w:r>
+    </w:p>
+    <w:p>
+      <w:pPr>
+        <w:spacing w:after="0" w:before="60"/>
+      </w:pPr>
+      <w:r>
+        <w:t xml:space="preserve"/>
+      </w:r>
+    </w:p>
+    <w:p>
+      <w:pPr>
+        <w:spacing w:after="80" w:before="80"/>
+      </w:pPr>
+      <w:r>
+        <w:rPr>
+          <w:rFonts w:ascii="Arial" w:cs="Arial" w:eastAsia="Arial" w:hAnsi="Arial"/>
+          <w:sz w:val="22"/>
+          <w:szCs w:val="22"/>
+        </w:rPr>
+        <w:t xml:space="preserve">Claude will use the GitHub connector to create the PR on your behalf.</w:t>
       </w:r>
     </w:p>
     <w:p>
@@ -2310,626 +2312,6 @@
           <w:sz w:val="26"/>
           <w:szCs w:val="26"/>
         </w:rPr>
-        <w:t xml:space="preserve">Step 2 — Pull the Latest Version</w:t>
-      </w:r>
-    </w:p>
-    <w:p>
-      <w:pPr>
-        <w:spacing w:after="80" w:before="80"/>
-      </w:pPr>
-      <w:r>
-        <w:rPr>
-          <w:rFonts w:ascii="Arial" w:cs="Arial" w:eastAsia="Arial" w:hAnsi="Arial"/>
-          <w:sz w:val="22"/>
-          <w:szCs w:val="22"/>
-        </w:rPr>
-        <w:t xml:space="preserve">Always start by asking Claude to get the latest changes:</w:t>
-      </w:r>
-    </w:p>
-    <w:p>
-      <w:pPr>
-        <w:shd w:fill="F0F0F0" w:val="clear"/>
-        <w:spacing w:after="60" w:before="60"/>
-        <w:ind w:left="720"/>
-      </w:pPr>
-      <w:r>
-        <w:rPr>
-          <w:rFonts w:ascii="Courier New" w:cs="Courier New" w:eastAsia="Courier New" w:hAnsi="Courier New"/>
-          <w:color w:val="333333"/>
-          <w:sz w:val="20"/>
-          <w:szCs w:val="20"/>
-        </w:rPr>
-        <w:t xml:space="preserve">Pull the latest version of the project from GitHub</w:t>
-      </w:r>
-    </w:p>
-    <w:p>
-      <w:pPr>
-        <w:spacing w:after="80" w:before="80"/>
-      </w:pPr>
-      <w:r>
-        <w:rPr>
-          <w:rFonts w:ascii="Arial" w:cs="Arial" w:eastAsia="Arial" w:hAnsi="Arial"/>
-          <w:sz w:val="22"/>
-          <w:szCs w:val="22"/>
-        </w:rPr>
-        <w:t xml:space="preserve">Or run directly:</w:t>
-      </w:r>
-    </w:p>
-    <w:p>
-      <w:pPr>
-        <w:shd w:fill="F0F0F0" w:val="clear"/>
-        <w:spacing w:after="60" w:before="60"/>
-        <w:ind w:left="720"/>
-      </w:pPr>
-      <w:r>
-        <w:rPr>
-          <w:rFonts w:ascii="Courier New" w:cs="Courier New" w:eastAsia="Courier New" w:hAnsi="Courier New"/>
-          <w:color w:val="333333"/>
-          <w:sz w:val="20"/>
-          <w:szCs w:val="20"/>
-        </w:rPr>
-        <w:t xml:space="preserve">git pull origin master</w:t>
-      </w:r>
-    </w:p>
-    <w:p>
-      <w:pPr>
-        <w:spacing w:after="0" w:before="80"/>
-      </w:pPr>
-      <w:r>
-        <w:t xml:space="preserve"/>
-      </w:r>
-    </w:p>
-    <w:p>
-      <w:pPr>
-        <w:shd w:fill="EBF3FB" w:val="clear"/>
-        <w:spacing w:after="100" w:before="100"/>
-        <w:ind w:left="720"/>
-      </w:pPr>
-      <w:r>
-        <w:rPr>
-          <w:rFonts w:ascii="Arial" w:cs="Arial" w:eastAsia="Arial" w:hAnsi="Arial"/>
-          <w:b/>
-          <w:bCs/>
-          <w:i/>
-          <w:iCs/>
-          <w:color w:val="1F4E79"/>
-          <w:sz w:val="22"/>
-          <w:szCs w:val="22"/>
-        </w:rPr>
-        <w:t xml:space="preserve">Note: </w:t>
-      </w:r>
-      <w:r>
-        <w:rPr>
-          <w:rFonts w:ascii="Arial" w:cs="Arial" w:eastAsia="Arial" w:hAnsi="Arial"/>
-          <w:i/>
-          <w:iCs/>
-          <w:color w:val="444444"/>
-          <w:sz w:val="22"/>
-          <w:szCs w:val="22"/>
-        </w:rPr>
-        <w:t xml:space="preserve">Never skip this step. It ensures you have the most up-to-date version before making changes.</w:t>
-      </w:r>
-    </w:p>
-    <w:p>
-      <w:pPr>
-        <w:spacing w:after="0" w:before="120"/>
-      </w:pPr>
-      <w:r>
-        <w:t xml:space="preserve"/>
-      </w:r>
-    </w:p>
-    <w:p>
-      <w:pPr>
-        <w:pStyle w:val="Heading2"/>
-        <w:spacing w:after="140" w:before="280"/>
-      </w:pPr>
-      <w:r>
-        <w:rPr>
-          <w:rFonts w:ascii="Arial" w:cs="Arial" w:eastAsia="Arial" w:hAnsi="Arial"/>
-          <w:b/>
-          <w:bCs/>
-          <w:color w:val="1F4E79"/>
-          <w:sz w:val="26"/>
-          <w:szCs w:val="26"/>
-        </w:rPr>
-        <w:t xml:space="preserve">Step 3 — Create Your Working Branch</w:t>
-      </w:r>
-    </w:p>
-    <w:p>
-      <w:pPr>
-        <w:spacing w:after="80" w:before="80"/>
-      </w:pPr>
-      <w:r>
-        <w:rPr>
-          <w:rFonts w:ascii="Arial" w:cs="Arial" w:eastAsia="Arial" w:hAnsi="Arial"/>
-          <w:sz w:val="22"/>
-          <w:szCs w:val="22"/>
-        </w:rPr>
-        <w:t xml:space="preserve">Ask Claude to create a branch for your work:</w:t>
-      </w:r>
-    </w:p>
-    <w:p>
-      <w:pPr>
-        <w:shd w:fill="F0F0F0" w:val="clear"/>
-        <w:spacing w:after="60" w:before="60"/>
-        <w:ind w:left="720"/>
-      </w:pPr>
-      <w:r>
-        <w:rPr>
-          <w:rFonts w:ascii="Courier New" w:cs="Courier New" w:eastAsia="Courier New" w:hAnsi="Courier New"/>
-          <w:color w:val="333333"/>
-          <w:sz w:val="20"/>
-          <w:szCs w:val="20"/>
-        </w:rPr>
-        <w:t xml:space="preserve">Create a new branch called feature/your-name-topic</w:t>
-      </w:r>
-    </w:p>
-    <w:p>
-      <w:pPr>
-        <w:spacing w:after="80" w:before="80"/>
-      </w:pPr>
-      <w:r>
-        <w:rPr>
-          <w:rFonts w:ascii="Arial" w:cs="Arial" w:eastAsia="Arial" w:hAnsi="Arial"/>
-          <w:sz w:val="22"/>
-          <w:szCs w:val="22"/>
-        </w:rPr>
-        <w:t xml:space="preserve">Example:</w:t>
-      </w:r>
-    </w:p>
-    <w:p>
-      <w:pPr>
-        <w:shd w:fill="F0F0F0" w:val="clear"/>
-        <w:spacing w:after="60" w:before="60"/>
-        <w:ind w:left="720"/>
-      </w:pPr>
-      <w:r>
-        <w:rPr>
-          <w:rFonts w:ascii="Courier New" w:cs="Courier New" w:eastAsia="Courier New" w:hAnsi="Courier New"/>
-          <w:color w:val="333333"/>
-          <w:sz w:val="20"/>
-          <w:szCs w:val="20"/>
-        </w:rPr>
-        <w:t xml:space="preserve">Create a new branch called feature/alice-module2-update</w:t>
-      </w:r>
-    </w:p>
-    <w:p>
-      <w:pPr>
-        <w:spacing w:after="0" w:before="80"/>
-      </w:pPr>
-      <w:r>
-        <w:t xml:space="preserve"/>
-      </w:r>
-    </w:p>
-    <w:p>
-      <w:pPr>
-        <w:spacing w:after="80" w:before="80"/>
-      </w:pPr>
-      <w:r>
-        <w:rPr>
-          <w:rFonts w:ascii="Arial" w:cs="Arial" w:eastAsia="Arial" w:hAnsi="Arial"/>
-          <w:sz w:val="22"/>
-          <w:szCs w:val="22"/>
-        </w:rPr>
-        <w:t xml:space="preserve">Or run directly:</w:t>
-      </w:r>
-    </w:p>
-    <w:p>
-      <w:pPr>
-        <w:shd w:fill="F0F0F0" w:val="clear"/>
-        <w:spacing w:after="60" w:before="60"/>
-        <w:ind w:left="720"/>
-      </w:pPr>
-      <w:r>
-        <w:rPr>
-          <w:rFonts w:ascii="Courier New" w:cs="Courier New" w:eastAsia="Courier New" w:hAnsi="Courier New"/>
-          <w:color w:val="333333"/>
-          <w:sz w:val="20"/>
-          <w:szCs w:val="20"/>
-        </w:rPr>
-        <w:t xml:space="preserve">git checkout -b feature/your-name-topic</w:t>
-      </w:r>
-    </w:p>
-    <w:p>
-      <w:pPr>
-        <w:spacing w:after="0" w:before="120"/>
-      </w:pPr>
-      <w:r>
-        <w:t xml:space="preserve"/>
-      </w:r>
-    </w:p>
-    <w:p>
-      <w:pPr>
-        <w:pStyle w:val="Heading2"/>
-        <w:spacing w:after="140" w:before="280"/>
-      </w:pPr>
-      <w:r>
-        <w:rPr>
-          <w:rFonts w:ascii="Arial" w:cs="Arial" w:eastAsia="Arial" w:hAnsi="Arial"/>
-          <w:b/>
-          <w:bCs/>
-          <w:color w:val="1F4E79"/>
-          <w:sz w:val="26"/>
-          <w:szCs w:val="26"/>
-        </w:rPr>
-        <w:t xml:space="preserve">Step 4 — Make Your Changes Using Claude</w:t>
-      </w:r>
-    </w:p>
-    <w:p>
-      <w:pPr>
-        <w:spacing w:after="80" w:before="80"/>
-      </w:pPr>
-      <w:r>
-        <w:rPr>
-          <w:rFonts w:ascii="Arial" w:cs="Arial" w:eastAsia="Arial" w:hAnsi="Arial"/>
-          <w:sz w:val="22"/>
-          <w:szCs w:val="22"/>
-        </w:rPr>
-        <w:t xml:space="preserve">Ask Claude for help in plain English. For example:</w:t>
-      </w:r>
-    </w:p>
-    <w:p>
-      <w:pPr>
-        <w:spacing w:after="0" w:before="60"/>
-      </w:pPr>
-      <w:r>
-        <w:t xml:space="preserve"/>
-      </w:r>
-    </w:p>
-    <w:p>
-      <w:pPr>
-        <w:pStyle w:val="ListParagraph"/>
-        <w:numPr>
-          <w:ilvl w:val="0"/>
-          <w:numId w:val="2"/>
-        </w:numPr>
-        <w:spacing w:after="60" w:before="60"/>
-      </w:pPr>
-      <w:r>
-        <w:rPr>
-          <w:rFonts w:ascii="Arial" w:cs="Arial" w:eastAsia="Arial" w:hAnsi="Arial"/>
-          <w:sz w:val="22"/>
-          <w:szCs w:val="22"/>
-        </w:rPr>
-        <w:t xml:space="preserve">"Update the introduction text in songa-docs.html to mention the new module"</w:t>
-      </w:r>
-    </w:p>
-    <w:p>
-      <w:pPr>
-        <w:pStyle w:val="ListParagraph"/>
-        <w:numPr>
-          <w:ilvl w:val="0"/>
-          <w:numId w:val="2"/>
-        </w:numPr>
-        <w:spacing w:after="60" w:before="60"/>
-      </w:pPr>
-      <w:r>
-        <w:rPr>
-          <w:rFonts w:ascii="Arial" w:cs="Arial" w:eastAsia="Arial" w:hAnsi="Arial"/>
-          <w:sz w:val="22"/>
-          <w:szCs w:val="22"/>
-        </w:rPr>
-        <w:t xml:space="preserve">"Fix the broken image reference on page 5"</w:t>
-      </w:r>
-    </w:p>
-    <w:p>
-      <w:pPr>
-        <w:pStyle w:val="ListParagraph"/>
-        <w:numPr>
-          <w:ilvl w:val="0"/>
-          <w:numId w:val="2"/>
-        </w:numPr>
-        <w:spacing w:after="60" w:before="60"/>
-      </w:pPr>
-      <w:r>
-        <w:rPr>
-          <w:rFonts w:ascii="Arial" w:cs="Arial" w:eastAsia="Arial" w:hAnsi="Arial"/>
-          <w:sz w:val="22"/>
-          <w:szCs w:val="22"/>
-        </w:rPr>
-        <w:t xml:space="preserve">"Add a new section about field data collection after the overview"</w:t>
-      </w:r>
-    </w:p>
-    <w:p>
-      <w:pPr>
-        <w:spacing w:after="0" w:before="60"/>
-      </w:pPr>
-      <w:r>
-        <w:t xml:space="preserve"/>
-      </w:r>
-    </w:p>
-    <w:p>
-      <w:pPr>
-        <w:spacing w:after="80" w:before="80"/>
-      </w:pPr>
-      <w:r>
-        <w:rPr>
-          <w:rFonts w:ascii="Arial" w:cs="Arial" w:eastAsia="Arial" w:hAnsi="Arial"/>
-          <w:sz w:val="22"/>
-          <w:szCs w:val="22"/>
-        </w:rPr>
-        <w:t xml:space="preserve">Claude will read the files, suggest changes, and apply them for you. Review the changes before moving to the next step.</w:t>
-      </w:r>
-    </w:p>
-    <w:p>
-      <w:pPr>
-        <w:spacing w:after="0" w:before="120"/>
-      </w:pPr>
-      <w:r>
-        <w:t xml:space="preserve"/>
-      </w:r>
-    </w:p>
-    <w:p>
-      <w:pPr>
-        <w:pStyle w:val="Heading2"/>
-        <w:spacing w:after="140" w:before="280"/>
-      </w:pPr>
-      <w:r>
-        <w:rPr>
-          <w:rFonts w:ascii="Arial" w:cs="Arial" w:eastAsia="Arial" w:hAnsi="Arial"/>
-          <w:b/>
-          <w:bCs/>
-          <w:color w:val="1F4E79"/>
-          <w:sz w:val="26"/>
-          <w:szCs w:val="26"/>
-        </w:rPr>
-        <w:t xml:space="preserve">Step 5 — Commit Your Changes</w:t>
-      </w:r>
-    </w:p>
-    <w:p>
-      <w:pPr>
-        <w:spacing w:after="80" w:before="80"/>
-      </w:pPr>
-      <w:r>
-        <w:rPr>
-          <w:rFonts w:ascii="Arial" w:cs="Arial" w:eastAsia="Arial" w:hAnsi="Arial"/>
-          <w:sz w:val="22"/>
-          <w:szCs w:val="22"/>
-        </w:rPr>
-        <w:t xml:space="preserve">Ask Claude to save your work:</w:t>
-      </w:r>
-    </w:p>
-    <w:p>
-      <w:pPr>
-        <w:shd w:fill="F0F0F0" w:val="clear"/>
-        <w:spacing w:after="60" w:before="60"/>
-        <w:ind w:left="720"/>
-      </w:pPr>
-      <w:r>
-        <w:rPr>
-          <w:rFonts w:ascii="Courier New" w:cs="Courier New" w:eastAsia="Courier New" w:hAnsi="Courier New"/>
-          <w:color w:val="333333"/>
-          <w:sz w:val="20"/>
-          <w:szCs w:val="20"/>
-        </w:rPr>
-        <w:t xml:space="preserve">Commit my changes with the message: Add facilitator notes to Module 3</w:t>
-      </w:r>
-    </w:p>
-    <w:p>
-      <w:pPr>
-        <w:spacing w:after="80" w:before="80"/>
-      </w:pPr>
-      <w:r>
-        <w:rPr>
-          <w:rFonts w:ascii="Arial" w:cs="Arial" w:eastAsia="Arial" w:hAnsi="Arial"/>
-          <w:sz w:val="22"/>
-          <w:szCs w:val="22"/>
-        </w:rPr>
-        <w:t xml:space="preserve">Or run directly:</w:t>
-      </w:r>
-    </w:p>
-    <w:p>
-      <w:pPr>
-        <w:shd w:fill="F0F0F0" w:val="clear"/>
-        <w:spacing w:after="60" w:before="60"/>
-        <w:ind w:left="720"/>
-      </w:pPr>
-      <w:r>
-        <w:rPr>
-          <w:rFonts w:ascii="Courier New" w:cs="Courier New" w:eastAsia="Courier New" w:hAnsi="Courier New"/>
-          <w:color w:val="333333"/>
-          <w:sz w:val="20"/>
-          <w:szCs w:val="20"/>
-        </w:rPr>
-        <w:t xml:space="preserve">git add .</w:t>
-      </w:r>
-    </w:p>
-    <w:p>
-      <w:pPr>
-        <w:shd w:fill="F0F0F0" w:val="clear"/>
-        <w:spacing w:after="60" w:before="60"/>
-        <w:ind w:left="720"/>
-      </w:pPr>
-      <w:r>
-        <w:rPr>
-          <w:rFonts w:ascii="Courier New" w:cs="Courier New" w:eastAsia="Courier New" w:hAnsi="Courier New"/>
-          <w:color w:val="333333"/>
-          <w:sz w:val="20"/>
-          <w:szCs w:val="20"/>
-        </w:rPr>
-        <w:t xml:space="preserve">git commit -m "Brief description of your change"</w:t>
-      </w:r>
-    </w:p>
-    <w:p>
-      <w:pPr>
-        <w:spacing w:after="0" w:before="120"/>
-      </w:pPr>
-      <w:r>
-        <w:t xml:space="preserve"/>
-      </w:r>
-    </w:p>
-    <w:p>
-      <w:pPr>
-        <w:pStyle w:val="Heading2"/>
-        <w:spacing w:after="140" w:before="280"/>
-      </w:pPr>
-      <w:r>
-        <w:rPr>
-          <w:rFonts w:ascii="Arial" w:cs="Arial" w:eastAsia="Arial" w:hAnsi="Arial"/>
-          <w:b/>
-          <w:bCs/>
-          <w:color w:val="1F4E79"/>
-          <w:sz w:val="26"/>
-          <w:szCs w:val="26"/>
-        </w:rPr>
-        <w:t xml:space="preserve">Step 6 — Push Your Branch to GitHub</w:t>
-      </w:r>
-    </w:p>
-    <w:p>
-      <w:pPr>
-        <w:spacing w:after="80" w:before="80"/>
-      </w:pPr>
-      <w:r>
-        <w:rPr>
-          <w:rFonts w:ascii="Arial" w:cs="Arial" w:eastAsia="Arial" w:hAnsi="Arial"/>
-          <w:sz w:val="22"/>
-          <w:szCs w:val="22"/>
-        </w:rPr>
-        <w:t xml:space="preserve">Ask Claude to upload your branch:</w:t>
-      </w:r>
-    </w:p>
-    <w:p>
-      <w:pPr>
-        <w:shd w:fill="F0F0F0" w:val="clear"/>
-        <w:spacing w:after="60" w:before="60"/>
-        <w:ind w:left="720"/>
-      </w:pPr>
-      <w:r>
-        <w:rPr>
-          <w:rFonts w:ascii="Courier New" w:cs="Courier New" w:eastAsia="Courier New" w:hAnsi="Courier New"/>
-          <w:color w:val="333333"/>
-          <w:sz w:val="20"/>
-          <w:szCs w:val="20"/>
-        </w:rPr>
-        <w:t xml:space="preserve">Push my branch to GitHub</w:t>
-      </w:r>
-    </w:p>
-    <w:p>
-      <w:pPr>
-        <w:spacing w:after="80" w:before="80"/>
-      </w:pPr>
-      <w:r>
-        <w:rPr>
-          <w:rFonts w:ascii="Arial" w:cs="Arial" w:eastAsia="Arial" w:hAnsi="Arial"/>
-          <w:sz w:val="22"/>
-          <w:szCs w:val="22"/>
-        </w:rPr>
-        <w:t xml:space="preserve">Or run directly:</w:t>
-      </w:r>
-    </w:p>
-    <w:p>
-      <w:pPr>
-        <w:shd w:fill="F0F0F0" w:val="clear"/>
-        <w:spacing w:after="60" w:before="60"/>
-        <w:ind w:left="720"/>
-      </w:pPr>
-      <w:r>
-        <w:rPr>
-          <w:rFonts w:ascii="Courier New" w:cs="Courier New" w:eastAsia="Courier New" w:hAnsi="Courier New"/>
-          <w:color w:val="333333"/>
-          <w:sz w:val="20"/>
-          <w:szCs w:val="20"/>
-        </w:rPr>
-        <w:t xml:space="preserve">git push origin feature/your-name-topic</w:t>
-      </w:r>
-    </w:p>
-    <w:p>
-      <w:pPr>
-        <w:spacing w:after="0" w:before="120"/>
-      </w:pPr>
-      <w:r>
-        <w:t xml:space="preserve"/>
-      </w:r>
-    </w:p>
-    <w:p>
-      <w:pPr>
-        <w:pStyle w:val="Heading2"/>
-        <w:spacing w:after="140" w:before="280"/>
-      </w:pPr>
-      <w:r>
-        <w:rPr>
-          <w:rFonts w:ascii="Arial" w:cs="Arial" w:eastAsia="Arial" w:hAnsi="Arial"/>
-          <w:b/>
-          <w:bCs/>
-          <w:color w:val="1F4E79"/>
-          <w:sz w:val="26"/>
-          <w:szCs w:val="26"/>
-        </w:rPr>
-        <w:t xml:space="preserve">Step 7 — Open a Pull Request</w:t>
-      </w:r>
-    </w:p>
-    <w:p>
-      <w:pPr>
-        <w:spacing w:after="80" w:before="80"/>
-      </w:pPr>
-      <w:r>
-        <w:rPr>
-          <w:rFonts w:ascii="Arial" w:cs="Arial" w:eastAsia="Arial" w:hAnsi="Arial"/>
-          <w:sz w:val="22"/>
-          <w:szCs w:val="22"/>
-        </w:rPr>
-        <w:t xml:space="preserve">Ask Claude to create a Pull Request for review:</w:t>
-      </w:r>
-    </w:p>
-    <w:p>
-      <w:pPr>
-        <w:shd w:fill="F0F0F0" w:val="clear"/>
-        <w:spacing w:after="60" w:before="60"/>
-        <w:ind w:left="720"/>
-      </w:pPr>
-      <w:r>
-        <w:rPr>
-          <w:rFonts w:ascii="Courier New" w:cs="Courier New" w:eastAsia="Courier New" w:hAnsi="Courier New"/>
-          <w:color w:val="333333"/>
-          <w:sz w:val="20"/>
-          <w:szCs w:val="20"/>
-        </w:rPr>
-        <w:t xml:space="preserve">Open a pull request titled "Add Module 3 facilitator notes" with a short description of what I changed</w:t>
-      </w:r>
-    </w:p>
-    <w:p>
-      <w:pPr>
-        <w:spacing w:after="0" w:before="60"/>
-      </w:pPr>
-      <w:r>
-        <w:t xml:space="preserve"/>
-      </w:r>
-    </w:p>
-    <w:p>
-      <w:pPr>
-        <w:spacing w:after="80" w:before="80"/>
-      </w:pPr>
-      <w:r>
-        <w:rPr>
-          <w:rFonts w:ascii="Arial" w:cs="Arial" w:eastAsia="Arial" w:hAnsi="Arial"/>
-          <w:sz w:val="22"/>
-          <w:szCs w:val="22"/>
-        </w:rPr>
-        <w:t xml:space="preserve">Claude will use the GitHub connector to create the PR on your behalf.</w:t>
-      </w:r>
-    </w:p>
-    <w:p>
-      <w:pPr>
-        <w:spacing w:after="0" w:before="120"/>
-      </w:pPr>
-      <w:r>
-        <w:t xml:space="preserve"/>
-      </w:r>
-    </w:p>
-    <w:p>
-      <w:pPr>
-        <w:pStyle w:val="Heading2"/>
-        <w:spacing w:after="140" w:before="280"/>
-      </w:pPr>
-      <w:r>
-        <w:rPr>
-          <w:rFonts w:ascii="Arial" w:cs="Arial" w:eastAsia="Arial" w:hAnsi="Arial"/>
-          <w:b/>
-          <w:bCs/>
-          <w:color w:val="1F4E79"/>
-          <w:sz w:val="26"/>
-          <w:szCs w:val="26"/>
-        </w:rPr>
         <w:t xml:space="preserve">Step 8 — Wait for Review</w:t>
       </w:r>
     </w:p>
@@ -3048,7 +2430,7 @@
           <w:sz w:val="32"/>
           <w:szCs w:val="32"/>
         </w:rPr>
-        <w:t xml:space="preserve">Section 7 — Quick Command Reference</w:t>
+        <w:t xml:space="preserve">Section 6 — Quick Command Reference</w:t>
       </w:r>
     </w:p>
     <w:p>
@@ -3602,7 +2984,7 @@
           <w:sz w:val="32"/>
           <w:szCs w:val="32"/>
         </w:rPr>
-        <w:t xml:space="preserve">Section 8 — Troubleshooting</w:t>
+        <w:t xml:space="preserve">Section 7 — Troubleshooting</w:t>
       </w:r>
     </w:p>
     <w:p>
@@ -3803,7 +3185,7 @@
           <w:sz w:val="26"/>
           <w:szCs w:val="26"/>
         </w:rPr>
-        <w:t xml:space="preserve">"command not found: claude"</w:t>
+        <w:t xml:space="preserve">Claude App Won't Open or Crashes</w:t>
       </w:r>
     </w:p>
     <w:p>
@@ -3821,7 +3203,160 @@
           <w:sz w:val="22"/>
           <w:szCs w:val="22"/>
         </w:rPr>
-        <w:t xml:space="preserve">Claude Code is not installed. Go back to Section 4 and run:</w:t>
+        <w:t xml:space="preserve">Try restarting your computer and reopening the Claude native app</w:t>
+      </w:r>
+    </w:p>
+    <w:p>
+      <w:pPr>
+        <w:pStyle w:val="ListParagraph"/>
+        <w:numPr>
+          <w:ilvl w:val="0"/>
+          <w:numId w:val="2"/>
+        </w:numPr>
+        <w:spacing w:after="60" w:before="60"/>
+      </w:pPr>
+      <w:r>
+        <w:rPr>
+          <w:rFonts w:ascii="Arial" w:cs="Arial" w:eastAsia="Arial" w:hAnsi="Arial"/>
+          <w:sz w:val="22"/>
+          <w:szCs w:val="22"/>
+        </w:rPr>
+        <w:t xml:space="preserve">Make sure your operating system is up to date</w:t>
+      </w:r>
+    </w:p>
+    <w:p>
+      <w:pPr>
+        <w:pStyle w:val="ListParagraph"/>
+        <w:numPr>
+          <w:ilvl w:val="0"/>
+          <w:numId w:val="2"/>
+        </w:numPr>
+        <w:spacing w:after="60" w:before="60"/>
+      </w:pPr>
+      <w:r>
+        <w:rPr>
+          <w:rFonts w:ascii="Arial" w:cs="Arial" w:eastAsia="Arial" w:hAnsi="Arial"/>
+          <w:sz w:val="22"/>
+          <w:szCs w:val="22"/>
+        </w:rPr>
+        <w:t xml:space="preserve">If the issue persists, contact the admin at john.punzalan@eisnetwork.co</w:t>
+      </w:r>
+    </w:p>
+    <w:p>
+      <w:pPr>
+        <w:spacing w:after="0" w:before="120"/>
+      </w:pPr>
+      <w:r>
+        <w:t xml:space="preserve"/>
+      </w:r>
+    </w:p>
+    <w:p>
+      <w:pPr>
+        <w:pStyle w:val="Heading2"/>
+        <w:spacing w:after="140" w:before="280"/>
+      </w:pPr>
+      <w:r>
+        <w:rPr>
+          <w:rFonts w:ascii="Arial" w:cs="Arial" w:eastAsia="Arial" w:hAnsi="Arial"/>
+          <w:b/>
+          <w:bCs/>
+          <w:color w:val="1F4E79"/>
+          <w:sz w:val="26"/>
+          <w:szCs w:val="26"/>
+        </w:rPr>
+        <w:t xml:space="preserve">"Permission denied" or "Repository not found"</w:t>
+      </w:r>
+    </w:p>
+    <w:p>
+      <w:pPr>
+        <w:pStyle w:val="ListParagraph"/>
+        <w:numPr>
+          <w:ilvl w:val="0"/>
+          <w:numId w:val="2"/>
+        </w:numPr>
+        <w:spacing w:after="60" w:before="60"/>
+      </w:pPr>
+      <w:r>
+        <w:rPr>
+          <w:rFonts w:ascii="Arial" w:cs="Arial" w:eastAsia="Arial" w:hAnsi="Arial"/>
+          <w:sz w:val="22"/>
+          <w:szCs w:val="22"/>
+        </w:rPr>
+        <w:t xml:space="preserve">Check your email for a GitHub invitation from the admin</w:t>
+      </w:r>
+    </w:p>
+    <w:p>
+      <w:pPr>
+        <w:pStyle w:val="ListParagraph"/>
+        <w:numPr>
+          <w:ilvl w:val="0"/>
+          <w:numId w:val="2"/>
+        </w:numPr>
+        <w:spacing w:after="60" w:before="60"/>
+      </w:pPr>
+      <w:r>
+        <w:rPr>
+          <w:rFonts w:ascii="Arial" w:cs="Arial" w:eastAsia="Arial" w:hAnsi="Arial"/>
+          <w:sz w:val="22"/>
+          <w:szCs w:val="22"/>
+        </w:rPr>
+        <w:t xml:space="preserve">Make sure you accepted the invitation (Section 1.2)</w:t>
+      </w:r>
+    </w:p>
+    <w:p>
+      <w:pPr>
+        <w:pStyle w:val="ListParagraph"/>
+        <w:numPr>
+          <w:ilvl w:val="0"/>
+          <w:numId w:val="2"/>
+        </w:numPr>
+        <w:spacing w:after="60" w:before="60"/>
+      </w:pPr>
+      <w:r>
+        <w:rPr>
+          <w:rFonts w:ascii="Arial" w:cs="Arial" w:eastAsia="Arial" w:hAnsi="Arial"/>
+          <w:sz w:val="22"/>
+          <w:szCs w:val="22"/>
+        </w:rPr>
+        <w:t xml:space="preserve">Contact the admin at john.punzalan@eisnetwork.co</w:t>
+      </w:r>
+    </w:p>
+    <w:p>
+      <w:pPr>
+        <w:spacing w:after="0" w:before="120"/>
+      </w:pPr>
+      <w:r>
+        <w:t xml:space="preserve"/>
+      </w:r>
+    </w:p>
+    <w:p>
+      <w:pPr>
+        <w:pStyle w:val="Heading2"/>
+        <w:spacing w:after="140" w:before="280"/>
+      </w:pPr>
+      <w:r>
+        <w:rPr>
+          <w:rFonts w:ascii="Arial" w:cs="Arial" w:eastAsia="Arial" w:hAnsi="Arial"/>
+          <w:b/>
+          <w:bCs/>
+          <w:color w:val="1F4E79"/>
+          <w:sz w:val="26"/>
+          <w:szCs w:val="26"/>
+        </w:rPr>
+        <w:t xml:space="preserve">Merge Conflict</w:t>
+      </w:r>
+    </w:p>
+    <w:p>
+      <w:pPr>
+        <w:spacing w:after="80" w:before="80"/>
+      </w:pPr>
+      <w:r>
+        <w:rPr>
+          <w:rFonts w:ascii="Arial" w:cs="Arial" w:eastAsia="Arial" w:hAnsi="Arial"/>
+          <w:sz w:val="22"/>
+          <w:szCs w:val="22"/>
+        </w:rPr>
+        <w:t xml:space="preserve">If two people edited the same part of a file, ask Claude to help:</w:t>
       </w:r>
     </w:p>
     <w:p>
@@ -3837,7 +3372,20 @@
           <w:sz w:val="20"/>
           <w:szCs w:val="20"/>
         </w:rPr>
-        <w:t xml:space="preserve">npm install -g @anthropic-ai/claude-code</w:t>
+        <w:t xml:space="preserve">I have a merge conflict in [filename]. Help me fix it.</w:t>
+      </w:r>
+    </w:p>
+    <w:p>
+      <w:pPr>
+        <w:spacing w:after="80" w:before="80"/>
+      </w:pPr>
+      <w:r>
+        <w:rPr>
+          <w:rFonts w:ascii="Arial" w:cs="Arial" w:eastAsia="Arial" w:hAnsi="Arial"/>
+          <w:sz w:val="22"/>
+          <w:szCs w:val="22"/>
+        </w:rPr>
+        <w:t xml:space="preserve">Claude will walk you through resolving it step by step.</w:t>
       </w:r>
     </w:p>
     <w:p>
@@ -3862,7 +3410,7 @@
           <w:sz w:val="26"/>
           <w:szCs w:val="26"/>
         </w:rPr>
-        <w:t xml:space="preserve">"Permission denied" or "Repository not found"</w:t>
+        <w:t xml:space="preserve">"node: command not found"</w:t>
       </w:r>
     </w:p>
     <w:p>
@@ -3880,7 +3428,7 @@
           <w:sz w:val="22"/>
           <w:szCs w:val="22"/>
         </w:rPr>
-        <w:t xml:space="preserve">Check your email for a GitHub invitation from the admin</w:t>
+        <w:t xml:space="preserve">macOS: run brew install node in Terminal</w:t>
       </w:r>
     </w:p>
     <w:p>
@@ -3898,30 +3446,34 @@
           <w:sz w:val="22"/>
           <w:szCs w:val="22"/>
         </w:rPr>
-        <w:t xml:space="preserve">Make sure you accepted the invitation (Section 1.2)</w:t>
-      </w:r>
-    </w:p>
-    <w:p>
-      <w:pPr>
-        <w:pStyle w:val="ListParagraph"/>
-        <w:numPr>
-          <w:ilvl w:val="0"/>
-          <w:numId w:val="2"/>
-        </w:numPr>
-        <w:spacing w:after="60" w:before="60"/>
-      </w:pPr>
-      <w:r>
-        <w:rPr>
-          <w:rFonts w:ascii="Arial" w:cs="Arial" w:eastAsia="Arial" w:hAnsi="Arial"/>
-          <w:sz w:val="22"/>
-          <w:szCs w:val="22"/>
-        </w:rPr>
-        <w:t xml:space="preserve">Contact the admin at john.punzalan@eisnetwork.co</w:t>
-      </w:r>
-    </w:p>
-    <w:p>
-      <w:pPr>
-        <w:spacing w:after="0" w:before="120"/>
+        <w:t xml:space="preserve">Windows: download from https://nodejs.org (LTS version)</w:t>
+      </w:r>
+    </w:p>
+    <w:p>
+      <w:r>
+        <w:br w:type="page"/>
+      </w:r>
+    </w:p>
+    <w:p>
+      <w:pPr>
+        <w:pStyle w:val="Heading1"/>
+        <w:spacing w:after="200" w:before="400"/>
+      </w:pPr>
+      <w:r>
+        <w:rPr>
+          <w:rFonts w:ascii="Arial" w:cs="Arial" w:eastAsia="Arial" w:hAnsi="Arial"/>
+          <w:b/>
+          <w:bCs/>
+          <w:color w:val="FFFFFF"/>
+          <w:sz w:val="32"/>
+          <w:szCs w:val="32"/>
+        </w:rPr>
+        <w:t xml:space="preserve">Section 8 — Getting Help</w:t>
+      </w:r>
+    </w:p>
+    <w:p>
+      <w:pPr>
+        <w:spacing w:after="0" w:before="80"/>
       </w:pPr>
       <w:r>
         <w:t xml:space="preserve"/>
@@ -3941,7 +3493,7 @@
           <w:sz w:val="26"/>
           <w:szCs w:val="26"/>
         </w:rPr>
-        <w:t xml:space="preserve">Merge Conflict</w:t>
+        <w:t xml:space="preserve">Ask Claude Directly</w:t>
       </w:r>
     </w:p>
     <w:p>
@@ -3954,7 +3506,7 @@
           <w:sz w:val="22"/>
           <w:szCs w:val="22"/>
         </w:rPr>
-        <w:t xml:space="preserve">If two people edited the same part of a file, ask Claude to help:</w:t>
+        <w:t xml:space="preserve">The fastest way to get help is to ask Claude. In the web version at claude.ai, or inside Claude Code:</w:t>
       </w:r>
     </w:p>
     <w:p>
@@ -3970,7 +3522,7 @@
           <w:sz w:val="20"/>
           <w:szCs w:val="20"/>
         </w:rPr>
-        <w:t xml:space="preserve">I have a merge conflict in [filename]. Help me fix it.</w:t>
+        <w:t xml:space="preserve">claude</w:t>
       </w:r>
     </w:p>
     <w:p>
@@ -3983,12 +3535,12 @@
           <w:sz w:val="22"/>
           <w:szCs w:val="22"/>
         </w:rPr>
-        <w:t xml:space="preserve">Claude will walk you through resolving it step by step.</w:t>
-      </w:r>
-    </w:p>
-    <w:p>
-      <w:pPr>
-        <w:spacing w:after="0" w:before="120"/>
+        <w:t xml:space="preserve">Then type your question in plain English. Claude can help with any task related to the project.</w:t>
+      </w:r>
+    </w:p>
+    <w:p>
+      <w:pPr>
+        <w:spacing w:after="0" w:before="160"/>
       </w:pPr>
       <w:r>
         <w:t xml:space="preserve"/>
@@ -4008,90 +3560,7 @@
           <w:sz w:val="26"/>
           <w:szCs w:val="26"/>
         </w:rPr>
-        <w:t xml:space="preserve">"node: command not found"</w:t>
-      </w:r>
-    </w:p>
-    <w:p>
-      <w:pPr>
-        <w:pStyle w:val="ListParagraph"/>
-        <w:numPr>
-          <w:ilvl w:val="0"/>
-          <w:numId w:val="2"/>
-        </w:numPr>
-        <w:spacing w:after="60" w:before="60"/>
-      </w:pPr>
-      <w:r>
-        <w:rPr>
-          <w:rFonts w:ascii="Arial" w:cs="Arial" w:eastAsia="Arial" w:hAnsi="Arial"/>
-          <w:sz w:val="22"/>
-          <w:szCs w:val="22"/>
-        </w:rPr>
-        <w:t xml:space="preserve">macOS: run brew install node in Terminal</w:t>
-      </w:r>
-    </w:p>
-    <w:p>
-      <w:pPr>
-        <w:pStyle w:val="ListParagraph"/>
-        <w:numPr>
-          <w:ilvl w:val="0"/>
-          <w:numId w:val="2"/>
-        </w:numPr>
-        <w:spacing w:after="60" w:before="60"/>
-      </w:pPr>
-      <w:r>
-        <w:rPr>
-          <w:rFonts w:ascii="Arial" w:cs="Arial" w:eastAsia="Arial" w:hAnsi="Arial"/>
-          <w:sz w:val="22"/>
-          <w:szCs w:val="22"/>
-        </w:rPr>
-        <w:t xml:space="preserve">Windows: download from https://nodejs.org (LTS version)</w:t>
-      </w:r>
-    </w:p>
-    <w:p>
-      <w:r>
-        <w:br w:type="page"/>
-      </w:r>
-    </w:p>
-    <w:p>
-      <w:pPr>
-        <w:pStyle w:val="Heading1"/>
-        <w:spacing w:after="200" w:before="400"/>
-      </w:pPr>
-      <w:r>
-        <w:rPr>
-          <w:rFonts w:ascii="Arial" w:cs="Arial" w:eastAsia="Arial" w:hAnsi="Arial"/>
-          <w:b/>
-          <w:bCs/>
-          <w:color w:val="FFFFFF"/>
-          <w:sz w:val="32"/>
-          <w:szCs w:val="32"/>
-        </w:rPr>
-        <w:t xml:space="preserve">Section 9 — Getting Help</w:t>
-      </w:r>
-    </w:p>
-    <w:p>
-      <w:pPr>
-        <w:spacing w:after="0" w:before="80"/>
-      </w:pPr>
-      <w:r>
-        <w:t xml:space="preserve"/>
-      </w:r>
-    </w:p>
-    <w:p>
-      <w:pPr>
-        <w:pStyle w:val="Heading2"/>
-        <w:spacing w:after="140" w:before="280"/>
-      </w:pPr>
-      <w:r>
-        <w:rPr>
-          <w:rFonts w:ascii="Arial" w:cs="Arial" w:eastAsia="Arial" w:hAnsi="Arial"/>
-          <w:b/>
-          <w:bCs/>
-          <w:color w:val="1F4E79"/>
-          <w:sz w:val="26"/>
-          <w:szCs w:val="26"/>
-        </w:rPr>
-        <w:t xml:space="preserve">Ask Claude Directly</w:t>
+        <w:t xml:space="preserve">Report an Issue on GitHub</w:t>
       </w:r>
     </w:p>
     <w:p>
@@ -4104,23 +3573,15 @@
           <w:sz w:val="22"/>
           <w:szCs w:val="22"/>
         </w:rPr>
-        <w:t xml:space="preserve">The fastest way to get help is to ask Claude. In the web version at claude.ai, or inside Claude Code:</w:t>
-      </w:r>
-    </w:p>
-    <w:p>
-      <w:pPr>
-        <w:shd w:fill="F0F0F0" w:val="clear"/>
-        <w:spacing w:after="60" w:before="60"/>
-        <w:ind w:left="720"/>
-      </w:pPr>
-      <w:r>
-        <w:rPr>
-          <w:rFonts w:ascii="Courier New" w:cs="Courier New" w:eastAsia="Courier New" w:hAnsi="Courier New"/>
-          <w:color w:val="333333"/>
-          <w:sz w:val="20"/>
-          <w:szCs w:val="20"/>
-        </w:rPr>
-        <w:t xml:space="preserve">claude</w:t>
+        <w:t xml:space="preserve">If you find a bug, broken link, or content error, open an issue on the repository:</w:t>
+      </w:r>
+    </w:p>
+    <w:p>
+      <w:pPr>
+        <w:spacing w:after="0" w:before="60"/>
+      </w:pPr>
+      <w:r>
+        <w:t xml:space="preserve"/>
       </w:r>
     </w:p>
     <w:p>
@@ -4130,65 +3591,6 @@
       <w:r>
         <w:rPr>
           <w:rFonts w:ascii="Arial" w:cs="Arial" w:eastAsia="Arial" w:hAnsi="Arial"/>
-          <w:sz w:val="22"/>
-          <w:szCs w:val="22"/>
-        </w:rPr>
-        <w:t xml:space="preserve">Then type your question in plain English. Claude can help with any task related to the project.</w:t>
-      </w:r>
-    </w:p>
-    <w:p>
-      <w:pPr>
-        <w:spacing w:after="0" w:before="160"/>
-      </w:pPr>
-      <w:r>
-        <w:t xml:space="preserve"/>
-      </w:r>
-    </w:p>
-    <w:p>
-      <w:pPr>
-        <w:pStyle w:val="Heading2"/>
-        <w:spacing w:after="140" w:before="280"/>
-      </w:pPr>
-      <w:r>
-        <w:rPr>
-          <w:rFonts w:ascii="Arial" w:cs="Arial" w:eastAsia="Arial" w:hAnsi="Arial"/>
-          <w:b/>
-          <w:bCs/>
-          <w:color w:val="1F4E79"/>
-          <w:sz w:val="26"/>
-          <w:szCs w:val="26"/>
-        </w:rPr>
-        <w:t xml:space="preserve">Report an Issue on GitHub</w:t>
-      </w:r>
-    </w:p>
-    <w:p>
-      <w:pPr>
-        <w:spacing w:after="80" w:before="80"/>
-      </w:pPr>
-      <w:r>
-        <w:rPr>
-          <w:rFonts w:ascii="Arial" w:cs="Arial" w:eastAsia="Arial" w:hAnsi="Arial"/>
-          <w:sz w:val="22"/>
-          <w:szCs w:val="22"/>
-        </w:rPr>
-        <w:t xml:space="preserve">If you find a bug, broken link, or content error, open an issue on the repository:</w:t>
-      </w:r>
-    </w:p>
-    <w:p>
-      <w:pPr>
-        <w:spacing w:after="0" w:before="60"/>
-      </w:pPr>
-      <w:r>
-        <w:t xml:space="preserve"/>
-      </w:r>
-    </w:p>
-    <w:p>
-      <w:pPr>
-        <w:spacing w:after="80" w:before="80"/>
-      </w:pPr>
-      <w:r>
-        <w:rPr>
-          <w:rFonts w:ascii="Arial" w:cs="Arial" w:eastAsia="Arial" w:hAnsi="Arial"/>
           <w:b/>
           <w:bCs/>
           <w:sz w:val="22"/>
@@ -4196,7 +3598,7 @@
         </w:rPr>
         <w:t xml:space="preserve">Repository Issues: </w:t>
       </w:r>
-      <w:hyperlink w:history="1" r:id="rIdn_xn8heie1xok1qpidbgz">
+      <w:hyperlink w:history="1" r:id="rIdc8srjr2q2xfbesf5hr7gc">
         <w:r>
           <w:rPr>
             <w:rStyle w:val="Hyperlink"/>
@@ -4865,24 +4267,6 @@
     </w:lvlOverride>
   </w:num>
   <w:num w:numId="8">
-    <w:abstractNumId w:val="8"/>
-    <w:lvlOverride w:ilvl="0">
-      <w:startOverride w:val="1"/>
-    </w:lvlOverride>
-  </w:num>
-  <w:num w:numId="9">
-    <w:abstractNumId w:val="9"/>
-    <w:lvlOverride w:ilvl="0">
-      <w:startOverride w:val="1"/>
-    </w:lvlOverride>
-  </w:num>
-  <w:num w:numId="10">
-    <w:abstractNumId w:val="10"/>
-    <w:lvlOverride w:ilvl="0">
-      <w:startOverride w:val="1"/>
-    </w:lvlOverride>
-  </w:num>
-  <w:num w:numId="11">
     <w:abstractNumId w:val="11"/>
     <w:lvlOverride w:ilvl="0">
       <w:startOverride w:val="1"/>

</xml_diff>